<commit_message>
Complete development conference readiness package
</commit_message>
<xml_diff>
--- a/conference_package/generated/Conference_Manuscript_Development_Draft.docx
+++ b/conference_package/generated/Conference_Manuscript_Development_Draft.docx
@@ -90,6 +90,8 @@
     <w:p>
       <w:pPr>
         <w:pStyle w:val="Heading1"/>
+        <w:keepNext w:val="0"/>
+        <w:jc w:val="left"/>
       </w:pPr>
       <w:r>
         <w:rPr>
@@ -100,6 +102,9 @@
       </w:r>
     </w:p>
     <w:p>
+      <w:pPr>
+        <w:jc w:val="left"/>
+      </w:pPr>
       <w:r>
         <w:rPr>
           <w:rFonts w:ascii="Calibri" w:hAnsi="Calibri"/>
@@ -117,6 +122,9 @@
       </w:r>
     </w:p>
     <w:p>
+      <w:pPr>
+        <w:jc w:val="left"/>
+      </w:pPr>
       <w:r>
         <w:rPr>
           <w:rFonts w:ascii="Calibri" w:hAnsi="Calibri"/>
@@ -134,6 +142,9 @@
       </w:r>
     </w:p>
     <w:p>
+      <w:pPr>
+        <w:jc w:val="left"/>
+      </w:pPr>
       <w:r>
         <w:rPr>
           <w:rFonts w:ascii="Calibri" w:hAnsi="Calibri"/>
@@ -151,6 +162,9 @@
       </w:r>
     </w:p>
     <w:p>
+      <w:pPr>
+        <w:jc w:val="left"/>
+      </w:pPr>
       <w:r>
         <w:rPr>
           <w:rFonts w:ascii="Calibri" w:hAnsi="Calibri"/>
@@ -164,10 +178,13 @@
           <w:rFonts w:ascii="Calibri" w:hAnsi="Calibri"/>
           <w:color w:val="000000"/>
         </w:rPr>
-        <w:t xml:space="preserve"> In the completed full-budget PIDD development study (768 participants; 5 repeats x 5 outer folds), calibrated fixed-threshold AUROC ranged from 0.835 to 0.841 and Brier score from 0.154 to 0.157 across the five model families. CatBoost had the lowest mean Brier score (0.154), but model differences were small. For the full panel, the availability router achieved participant-level AUROC 0.843 and Brier score 0.152; the robust fixed-model baseline achieved AUROC 0.843 and Brier score 0.152. No reduced-panel comparison survived metric-wise Holm correction in the matched contrast family. At 70% coverage, probability-certainty selection reduced full-panel router Brier score from 0.152 to 0.110 but retained only 55.6% of positive events, demonstrating a clinically important coverage trade-off. With 75% simulated feature dropout, supported-panel coverage fell to approximately 4.8%-6.6%, while Brier score rose to approximately 0.208-0.211 for Random Forest and XGBoost. Full-budget Sylhet and BRFSS development estimates will replace the explicitly marked provisional sections before protocol freeze.</w:t>
+        <w:t xml:space="preserve"> In the completed full-budget PIDD development study (768 participants; 5 repeats x 5 outer folds), calibrated fixed-threshold AUROC ranged from 0.835 to 0.841 and Brier score from 0.154 to 0.157 across the five model families. CatBoost had the lowest mean Brier score (0.154), but model differences were small. For the full panel, the availability router achieved participant-level AUROC 0.843 and Brier score 0.152; the robust fixed-model baseline achieved AUROC 0.843 and Brier score 0.152. No reduced-panel comparison survived metric-wise Holm correction in the matched contrast family. At 70% coverage, probability-certainty selection reduced full-panel router Brier score from 0.152 to 0.110 but retained only 55.6% of positive events, demonstrating a clinically important coverage trade-off. With 75% simulated feature dropout, supported-panel coverage fell to approximately 4.8%-6.6%, while Brier score rose to approximately 0.208-0.211 for Random Forest and XGBoost. In the grouped Sylhet development study (520 participants; 5 x 5 outer folds), CatBoost achieved AUROC 0.968, average precision 0.982, and Brier score 0.066, but a calibration slope of 12.65 indicated instability. The full-panel router achieved AUROC 0.965 and Brier 0.068 versus 0.960 and 0.077 for the robust fixed baseline, without a corrected significance claim. Across 32 Sylhet panel-specific-training contrasts, no comparison survived Holm correction (minimum adjusted p=0.064). BRFSS scientific estimates remain pending because the next full-sample holdout is the protected, one-time final evaluation and cannot be accessed before protocol freeze and authorization.</w:t>
       </w:r>
     </w:p>
     <w:p>
+      <w:pPr>
+        <w:jc w:val="left"/>
+      </w:pPr>
       <w:r>
         <w:rPr>
           <w:rFonts w:ascii="Calibri" w:hAnsi="Calibri"/>
@@ -185,6 +202,9 @@
       </w:r>
     </w:p>
     <w:p>
+      <w:pPr>
+        <w:jc w:val="left"/>
+      </w:pPr>
       <w:r>
         <w:rPr>
           <w:rFonts w:ascii="Calibri" w:hAnsi="Calibri"/>
@@ -204,6 +224,8 @@
     <w:p>
       <w:pPr>
         <w:pStyle w:val="Heading1"/>
+        <w:keepNext w:val="0"/>
+        <w:jc w:val="left"/>
       </w:pPr>
       <w:r>
         <w:rPr>
@@ -214,6 +236,9 @@
       </w:r>
     </w:p>
     <w:p>
+      <w:pPr>
+        <w:jc w:val="left"/>
+      </w:pPr>
       <w:r>
         <w:rPr>
           <w:rFonts w:ascii="Calibri" w:hAnsi="Calibri"/>
@@ -223,6 +248,9 @@
       </w:r>
     </w:p>
     <w:p>
+      <w:pPr>
+        <w:jc w:val="left"/>
+      </w:pPr>
       <w:r>
         <w:rPr>
           <w:rFonts w:ascii="Calibri" w:hAnsi="Calibri"/>
@@ -232,6 +260,9 @@
       </w:r>
     </w:p>
     <w:p>
+      <w:pPr>
+        <w:jc w:val="left"/>
+      </w:pPr>
       <w:r>
         <w:rPr>
           <w:rFonts w:ascii="Calibri" w:hAnsi="Calibri"/>
@@ -243,6 +274,8 @@
     <w:p>
       <w:pPr>
         <w:pStyle w:val="Heading1"/>
+        <w:keepNext w:val="0"/>
+        <w:jc w:val="left"/>
       </w:pPr>
       <w:r>
         <w:rPr>
@@ -255,6 +288,8 @@
     <w:p>
       <w:pPr>
         <w:pStyle w:val="Heading2"/>
+        <w:keepNext w:val="0"/>
+        <w:jc w:val="left"/>
       </w:pPr>
       <w:r>
         <w:rPr>
@@ -265,6 +300,9 @@
       </w:r>
     </w:p>
     <w:p>
+      <w:pPr>
+        <w:jc w:val="left"/>
+      </w:pPr>
       <w:r>
         <w:rPr>
           <w:rFonts w:ascii="Calibri" w:hAnsi="Calibri"/>
@@ -274,6 +312,9 @@
       </w:r>
     </w:p>
     <w:p>
+      <w:pPr>
+        <w:jc w:val="left"/>
+      </w:pPr>
       <w:r>
         <w:rPr>
           <w:rFonts w:ascii="Calibri" w:hAnsi="Calibri"/>
@@ -285,6 +326,8 @@
     <w:p>
       <w:pPr>
         <w:pStyle w:val="Heading2"/>
+        <w:keepNext w:val="0"/>
+        <w:jc w:val="left"/>
       </w:pPr>
       <w:r>
         <w:rPr>
@@ -295,6 +338,9 @@
       </w:r>
     </w:p>
     <w:p>
+      <w:pPr>
+        <w:jc w:val="left"/>
+      </w:pPr>
       <w:r>
         <w:rPr>
           <w:rFonts w:ascii="Calibri" w:hAnsi="Calibri"/>
@@ -304,6 +350,9 @@
       </w:r>
     </w:p>
     <w:p>
+      <w:pPr>
+        <w:jc w:val="left"/>
+      </w:pPr>
       <w:r>
         <w:rPr>
           <w:rFonts w:ascii="Calibri" w:hAnsi="Calibri"/>
@@ -315,6 +364,8 @@
     <w:p>
       <w:pPr>
         <w:pStyle w:val="Heading2"/>
+        <w:keepNext w:val="0"/>
+        <w:jc w:val="left"/>
       </w:pPr>
       <w:r>
         <w:rPr>
@@ -325,6 +376,9 @@
       </w:r>
     </w:p>
     <w:p>
+      <w:pPr>
+        <w:jc w:val="left"/>
+      </w:pPr>
       <w:r>
         <w:rPr>
           <w:rFonts w:ascii="Calibri" w:hAnsi="Calibri"/>
@@ -334,6 +388,9 @@
       </w:r>
     </w:p>
     <w:p>
+      <w:pPr>
+        <w:jc w:val="left"/>
+      </w:pPr>
       <w:r>
         <w:rPr>
           <w:rFonts w:ascii="Calibri" w:hAnsi="Calibri"/>
@@ -345,6 +402,8 @@
     <w:p>
       <w:pPr>
         <w:pStyle w:val="Heading2"/>
+        <w:keepNext w:val="0"/>
+        <w:jc w:val="left"/>
       </w:pPr>
       <w:r>
         <w:rPr>
@@ -355,6 +414,9 @@
       </w:r>
     </w:p>
     <w:p>
+      <w:pPr>
+        <w:jc w:val="left"/>
+      </w:pPr>
       <w:r>
         <w:rPr>
           <w:rFonts w:ascii="Calibri" w:hAnsi="Calibri"/>
@@ -364,6 +426,9 @@
       </w:r>
     </w:p>
     <w:p>
+      <w:pPr>
+        <w:jc w:val="left"/>
+      </w:pPr>
       <w:r>
         <w:rPr>
           <w:rFonts w:ascii="Calibri" w:hAnsi="Calibri"/>
@@ -375,6 +440,8 @@
     <w:p>
       <w:pPr>
         <w:pStyle w:val="Heading2"/>
+        <w:keepNext w:val="0"/>
+        <w:jc w:val="left"/>
       </w:pPr>
       <w:r>
         <w:rPr>
@@ -385,6 +452,9 @@
       </w:r>
     </w:p>
     <w:p>
+      <w:pPr>
+        <w:jc w:val="left"/>
+      </w:pPr>
       <w:r>
         <w:rPr>
           <w:rFonts w:ascii="Calibri" w:hAnsi="Calibri"/>
@@ -394,6 +464,9 @@
       </w:r>
     </w:p>
     <w:p>
+      <w:pPr>
+        <w:jc w:val="left"/>
+      </w:pPr>
       <w:r>
         <w:rPr>
           <w:rFonts w:ascii="Calibri" w:hAnsi="Calibri"/>
@@ -403,6 +476,9 @@
       </w:r>
     </w:p>
     <w:p>
+      <w:pPr>
+        <w:jc w:val="left"/>
+      </w:pPr>
       <w:r>
         <w:rPr>
           <w:rFonts w:ascii="Calibri" w:hAnsi="Calibri"/>
@@ -428,6 +504,8 @@
     <w:p>
       <w:pPr>
         <w:pStyle w:val="Heading2"/>
+        <w:keepNext w:val="0"/>
+        <w:jc w:val="left"/>
       </w:pPr>
       <w:r>
         <w:rPr>
@@ -438,6 +516,9 @@
       </w:r>
     </w:p>
     <w:p>
+      <w:pPr>
+        <w:jc w:val="left"/>
+      </w:pPr>
       <w:r>
         <w:rPr>
           <w:rFonts w:ascii="Calibri" w:hAnsi="Calibri"/>
@@ -447,6 +528,9 @@
       </w:r>
     </w:p>
     <w:p>
+      <w:pPr>
+        <w:jc w:val="left"/>
+      </w:pPr>
       <w:r>
         <w:rPr>
           <w:rFonts w:ascii="Calibri" w:hAnsi="Calibri"/>
@@ -458,6 +542,8 @@
     <w:p>
       <w:pPr>
         <w:pStyle w:val="Heading1"/>
+        <w:keepNext w:val="0"/>
+        <w:jc w:val="left"/>
       </w:pPr>
       <w:r>
         <w:rPr>
@@ -470,6 +556,8 @@
     <w:p>
       <w:pPr>
         <w:pStyle w:val="Heading2"/>
+        <w:keepNext w:val="0"/>
+        <w:jc w:val="left"/>
       </w:pPr>
       <w:r>
         <w:rPr>
@@ -480,6 +568,9 @@
       </w:r>
     </w:p>
     <w:p>
+      <w:pPr>
+        <w:jc w:val="left"/>
+      </w:pPr>
       <w:r>
         <w:rPr>
           <w:rFonts w:ascii="Calibri" w:hAnsi="Calibri"/>
@@ -489,6 +580,9 @@
       </w:r>
     </w:p>
     <w:p>
+      <w:pPr>
+        <w:jc w:val="left"/>
+      </w:pPr>
       <w:r>
         <w:rPr>
           <w:rFonts w:ascii="Calibri" w:hAnsi="Calibri"/>
@@ -519,6 +613,7 @@
       <w:tr>
         <w:trPr>
           <w:tblHeader w:val="true"/>
+          <w:cantSplit w:val="true"/>
         </w:trPr>
         <w:tc>
           <w:tcPr>
@@ -725,6 +820,9 @@
         </w:tc>
       </w:tr>
       <w:tr>
+        <w:trPr>
+          <w:cantSplit w:val="true"/>
+        </w:trPr>
         <w:tc>
           <w:tcPr>
             <w:tcW w:type="dxa" w:w="1800"/>
@@ -923,6 +1021,9 @@
         </w:tc>
       </w:tr>
       <w:tr>
+        <w:trPr>
+          <w:cantSplit w:val="true"/>
+        </w:trPr>
         <w:tc>
           <w:tcPr>
             <w:tcW w:type="dxa" w:w="1800"/>
@@ -1121,6 +1222,9 @@
         </w:tc>
       </w:tr>
       <w:tr>
+        <w:trPr>
+          <w:cantSplit w:val="true"/>
+        </w:trPr>
         <w:tc>
           <w:tcPr>
             <w:tcW w:type="dxa" w:w="1800"/>
@@ -1319,6 +1423,9 @@
         </w:tc>
       </w:tr>
       <w:tr>
+        <w:trPr>
+          <w:cantSplit w:val="true"/>
+        </w:trPr>
         <w:tc>
           <w:tcPr>
             <w:tcW w:type="dxa" w:w="1800"/>
@@ -1517,6 +1624,9 @@
         </w:tc>
       </w:tr>
       <w:tr>
+        <w:trPr>
+          <w:cantSplit w:val="true"/>
+        </w:trPr>
         <w:tc>
           <w:tcPr>
             <w:tcW w:type="dxa" w:w="1800"/>
@@ -1718,9 +1828,13 @@
     <w:p>
       <w:pPr>
         <w:spacing w:after="40"/>
+        <w:jc w:val="left"/>
       </w:pPr>
     </w:p>
     <w:p>
+      <w:pPr>
+        <w:jc w:val="left"/>
+      </w:pPr>
       <w:r>
         <w:rPr>
           <w:rFonts w:ascii="Calibri" w:hAnsi="Calibri"/>
@@ -1770,6 +1884,9 @@
       </w:r>
     </w:p>
     <w:p>
+      <w:pPr>
+        <w:jc w:val="left"/>
+      </w:pPr>
       <w:r>
         <w:rPr>
           <w:rFonts w:ascii="Calibri" w:hAnsi="Calibri"/>
@@ -1789,6 +1906,8 @@
     <w:p>
       <w:pPr>
         <w:pStyle w:val="Heading2"/>
+        <w:keepNext w:val="0"/>
+        <w:jc w:val="left"/>
       </w:pPr>
       <w:r>
         <w:rPr>
@@ -1799,6 +1918,9 @@
       </w:r>
     </w:p>
     <w:p>
+      <w:pPr>
+        <w:jc w:val="left"/>
+      </w:pPr>
       <w:r>
         <w:rPr>
           <w:rFonts w:ascii="Calibri" w:hAnsi="Calibri"/>
@@ -1808,6 +1930,9 @@
       </w:r>
     </w:p>
     <w:p>
+      <w:pPr>
+        <w:jc w:val="left"/>
+      </w:pPr>
       <w:r>
         <w:rPr>
           <w:rFonts w:ascii="Calibri" w:hAnsi="Calibri"/>
@@ -1818,7 +1943,21 @@
     </w:p>
     <w:p>
       <w:pPr>
+        <w:jc w:val="left"/>
+      </w:pPr>
+      <w:r>
+        <w:rPr>
+          <w:rFonts w:ascii="Calibri" w:hAnsi="Calibri"/>
+          <w:color w:val="000000"/>
+        </w:rPr>
+        <w:t>Separately training Random Forest and XGBoost for each reduced panel rather than masking unavailable inputs in a full-panel model produced several nominal improvements, including a 0.009 AUROC gain for XGBoost on glucose-plus-age and a 0.034 average-precision gain for Random Forest on the non-laboratory panel. However, none of the 40 paired comparisons survived Holm correction; the minimum adjusted p-value was 0.120. Panel-specific fitting is therefore not supported as a superiority claim.</w:t>
+      </w:r>
+    </w:p>
+    <w:p>
+      <w:pPr>
         <w:pStyle w:val="Heading2"/>
+        <w:keepNext w:val="0"/>
+        <w:jc w:val="left"/>
       </w:pPr>
       <w:r>
         <w:rPr>
@@ -1829,6 +1968,9 @@
       </w:r>
     </w:p>
     <w:p>
+      <w:pPr>
+        <w:jc w:val="left"/>
+      </w:pPr>
       <w:r>
         <w:rPr>
           <w:rFonts w:ascii="Calibri" w:hAnsi="Calibri"/>
@@ -1838,6 +1980,9 @@
       </w:r>
     </w:p>
     <w:p>
+      <w:pPr>
+        <w:jc w:val="left"/>
+      </w:pPr>
       <w:r>
         <w:rPr>
           <w:rFonts w:ascii="Calibri" w:hAnsi="Calibri"/>
@@ -1887,6 +2032,9 @@
       </w:r>
     </w:p>
     <w:p>
+      <w:pPr>
+        <w:jc w:val="left"/>
+      </w:pPr>
       <w:r>
         <w:rPr>
           <w:rFonts w:ascii="Calibri" w:hAnsi="Calibri"/>
@@ -1906,6 +2054,8 @@
     <w:p>
       <w:pPr>
         <w:pStyle w:val="Heading2"/>
+        <w:keepNext w:val="0"/>
+        <w:jc w:val="left"/>
       </w:pPr>
       <w:r>
         <w:rPr>
@@ -1916,6 +2066,9 @@
       </w:r>
     </w:p>
     <w:p>
+      <w:pPr>
+        <w:jc w:val="left"/>
+      </w:pPr>
       <w:r>
         <w:rPr>
           <w:rFonts w:ascii="Calibri" w:hAnsi="Calibri"/>
@@ -1965,6 +2118,9 @@
       </w:r>
     </w:p>
     <w:p>
+      <w:pPr>
+        <w:jc w:val="left"/>
+      </w:pPr>
       <w:r>
         <w:rPr>
           <w:rFonts w:ascii="Calibri" w:hAnsi="Calibri"/>
@@ -1982,6 +2138,9 @@
       </w:r>
     </w:p>
     <w:p>
+      <w:pPr>
+        <w:jc w:val="left"/>
+      </w:pPr>
       <w:r>
         <w:rPr>
           <w:rFonts w:ascii="Calibri" w:hAnsi="Calibri"/>
@@ -1992,28 +2151,1433 @@
     </w:p>
     <w:p>
       <w:pPr>
-        <w:pStyle w:val="Heading2"/>
+        <w:jc w:val="left"/>
       </w:pPr>
       <w:r>
         <w:rPr>
           <w:rFonts w:ascii="Calibri" w:hAnsi="Calibri"/>
           <w:color w:val="000000"/>
         </w:rPr>
-        <w:t>3.5 Remaining environment-specific development estimates</w:t>
+        <w:t>In the full 25-fold retraining ablation, enabling missingness indicators did not produce a Holm-corrected improvement for Logistic Regression or Random Forest on AUROC, average precision, Brier score, or log loss; all adjusted p-values were at least 0.200. Indicator handling therefore remains an implementation choice, not a supported performance contribution.</w:t>
       </w:r>
     </w:p>
     <w:p>
+      <w:pPr>
+        <w:pStyle w:val="Heading2"/>
+        <w:keepNext w:val="0"/>
+        <w:jc w:val="left"/>
+      </w:pPr>
       <w:r>
         <w:rPr>
           <w:rFonts w:ascii="Calibri" w:hAnsi="Calibri"/>
           <w:color w:val="000000"/>
         </w:rPr>
-        <w:t>Full-budget grouped Sylhet and compute-reviewed BRFSS development results will be inserted here before protocol freeze. Existing pilot and smoke studies are retained only as engineering evidence and are not promoted into the main result table. Hospital130 remains outside the diabetes-screening result family because its endpoint is 30-day readmission.</w:t>
+        <w:t>3.5 Grouped Sylhet development results</w:t>
+      </w:r>
+    </w:p>
+    <w:p>
+      <w:pPr>
+        <w:jc w:val="left"/>
+      </w:pPr>
+      <w:r>
+        <w:rPr>
+          <w:rFonts w:ascii="Calibri" w:hAnsi="Calibri"/>
+          <w:color w:val="000000"/>
+        </w:rPr>
+        <w:t>The full-budget Sylhet study contained 25 outer evaluations for each model and cluster-bootstrap uncertainty over identical symptom profiles. CatBoost had the lowest fold-mean Brier score (0.066) and highest AUROC (0.968), followed by Random Forest (Brier 0.072; AUROC 0.966). However, calibrated slopes were unstable, including 12.65 for CatBoost and 2.20 for Random Forest, so the high discrimination does not justify an unqualified claim that individual probabilities are well calibrated.</w:t>
+      </w:r>
+    </w:p>
+    <w:p>
+      <w:pPr>
+        <w:jc w:val="left"/>
+      </w:pPr>
+      <w:r>
+        <w:rPr>
+          <w:rFonts w:ascii="Calibri" w:hAnsi="Calibri"/>
+          <w:b/>
+          <w:color w:val="000000"/>
+        </w:rPr>
+        <w:t>Table 2. Sylhet calibrated grouped-development performance, mean across 25 outer evaluations</w:t>
+      </w:r>
+    </w:p>
+    <w:tbl>
+      <w:tblPr>
+        <w:tblStyle w:val="TableGrid"/>
+        <w:tblW w:type="dxa" w:w="9360"/>
+        <w:jc w:val="left"/>
+        <w:tblLayout w:type="fixed"/>
+        <w:tblLook w:firstColumn="1" w:firstRow="1" w:lastColumn="0" w:lastRow="0" w:noHBand="0" w:noVBand="1" w:val="04A0"/>
+        <w:tblInd w:w="120" w:type="dxa"/>
+      </w:tblPr>
+      <w:tblGrid>
+        <w:gridCol w:w="1800"/>
+        <w:gridCol w:w="1260"/>
+        <w:gridCol w:w="1260"/>
+        <w:gridCol w:w="1260"/>
+        <w:gridCol w:w="1260"/>
+        <w:gridCol w:w="1260"/>
+        <w:gridCol w:w="1260"/>
+      </w:tblGrid>
+      <w:tr>
+        <w:trPr>
+          <w:tblHeader w:val="true"/>
+          <w:cantSplit w:val="true"/>
+        </w:trPr>
+        <w:tc>
+          <w:tcPr>
+            <w:tcW w:type="dxa" w:w="1800"/>
+            <w:tcMar>
+              <w:top w:w="80" w:type="dxa"/>
+              <w:start w:w="120" w:type="dxa"/>
+              <w:bottom w:w="80" w:type="dxa"/>
+              <w:end w:w="120" w:type="dxa"/>
+            </w:tcMar>
+            <w:vAlign w:val="center"/>
+            <w:shd w:fill="1F4D78"/>
+          </w:tcPr>
+          <w:p>
+            <w:pPr>
+              <w:pStyle w:val="TableText"/>
+              <w:jc w:val="center"/>
+            </w:pPr>
+            <w:r/>
+            <w:r>
+              <w:rPr>
+                <w:rFonts w:ascii="Calibri" w:hAnsi="Calibri"/>
+                <w:b/>
+                <w:color w:val="FFFFFF"/>
+                <w:sz w:val="17"/>
+              </w:rPr>
+              <w:t>Model</w:t>
+            </w:r>
+          </w:p>
+        </w:tc>
+        <w:tc>
+          <w:tcPr>
+            <w:tcW w:type="dxa" w:w="1260"/>
+            <w:tcMar>
+              <w:top w:w="80" w:type="dxa"/>
+              <w:start w:w="120" w:type="dxa"/>
+              <w:bottom w:w="80" w:type="dxa"/>
+              <w:end w:w="120" w:type="dxa"/>
+            </w:tcMar>
+            <w:vAlign w:val="center"/>
+            <w:shd w:fill="1F4D78"/>
+          </w:tcPr>
+          <w:p>
+            <w:pPr>
+              <w:pStyle w:val="TableText"/>
+              <w:jc w:val="center"/>
+            </w:pPr>
+            <w:r/>
+            <w:r>
+              <w:rPr>
+                <w:rFonts w:ascii="Calibri" w:hAnsi="Calibri"/>
+                <w:b/>
+                <w:color w:val="FFFFFF"/>
+                <w:sz w:val="17"/>
+              </w:rPr>
+              <w:t>AUROC</w:t>
+            </w:r>
+          </w:p>
+        </w:tc>
+        <w:tc>
+          <w:tcPr>
+            <w:tcW w:type="dxa" w:w="1260"/>
+            <w:tcMar>
+              <w:top w:w="80" w:type="dxa"/>
+              <w:start w:w="120" w:type="dxa"/>
+              <w:bottom w:w="80" w:type="dxa"/>
+              <w:end w:w="120" w:type="dxa"/>
+            </w:tcMar>
+            <w:vAlign w:val="center"/>
+            <w:shd w:fill="1F4D78"/>
+          </w:tcPr>
+          <w:p>
+            <w:pPr>
+              <w:pStyle w:val="TableText"/>
+              <w:jc w:val="center"/>
+            </w:pPr>
+            <w:r/>
+            <w:r>
+              <w:rPr>
+                <w:rFonts w:ascii="Calibri" w:hAnsi="Calibri"/>
+                <w:b/>
+                <w:color w:val="FFFFFF"/>
+                <w:sz w:val="17"/>
+              </w:rPr>
+              <w:t>Average precision</w:t>
+            </w:r>
+          </w:p>
+        </w:tc>
+        <w:tc>
+          <w:tcPr>
+            <w:tcW w:type="dxa" w:w="1260"/>
+            <w:tcMar>
+              <w:top w:w="80" w:type="dxa"/>
+              <w:start w:w="120" w:type="dxa"/>
+              <w:bottom w:w="80" w:type="dxa"/>
+              <w:end w:w="120" w:type="dxa"/>
+            </w:tcMar>
+            <w:vAlign w:val="center"/>
+            <w:shd w:fill="1F4D78"/>
+          </w:tcPr>
+          <w:p>
+            <w:pPr>
+              <w:pStyle w:val="TableText"/>
+              <w:jc w:val="center"/>
+            </w:pPr>
+            <w:r/>
+            <w:r>
+              <w:rPr>
+                <w:rFonts w:ascii="Calibri" w:hAnsi="Calibri"/>
+                <w:b/>
+                <w:color w:val="FFFFFF"/>
+                <w:sz w:val="17"/>
+              </w:rPr>
+              <w:t>Brier</w:t>
+            </w:r>
+          </w:p>
+        </w:tc>
+        <w:tc>
+          <w:tcPr>
+            <w:tcW w:type="dxa" w:w="1260"/>
+            <w:tcMar>
+              <w:top w:w="80" w:type="dxa"/>
+              <w:start w:w="120" w:type="dxa"/>
+              <w:bottom w:w="80" w:type="dxa"/>
+              <w:end w:w="120" w:type="dxa"/>
+            </w:tcMar>
+            <w:vAlign w:val="center"/>
+            <w:shd w:fill="1F4D78"/>
+          </w:tcPr>
+          <w:p>
+            <w:pPr>
+              <w:pStyle w:val="TableText"/>
+              <w:jc w:val="center"/>
+            </w:pPr>
+            <w:r/>
+            <w:r>
+              <w:rPr>
+                <w:rFonts w:ascii="Calibri" w:hAnsi="Calibri"/>
+                <w:b/>
+                <w:color w:val="FFFFFF"/>
+                <w:sz w:val="17"/>
+              </w:rPr>
+              <w:t>Log loss</w:t>
+            </w:r>
+          </w:p>
+        </w:tc>
+        <w:tc>
+          <w:tcPr>
+            <w:tcW w:type="dxa" w:w="1260"/>
+            <w:tcMar>
+              <w:top w:w="80" w:type="dxa"/>
+              <w:start w:w="120" w:type="dxa"/>
+              <w:bottom w:w="80" w:type="dxa"/>
+              <w:end w:w="120" w:type="dxa"/>
+            </w:tcMar>
+            <w:vAlign w:val="center"/>
+            <w:shd w:fill="1F4D78"/>
+          </w:tcPr>
+          <w:p>
+            <w:pPr>
+              <w:pStyle w:val="TableText"/>
+              <w:jc w:val="center"/>
+            </w:pPr>
+            <w:r/>
+            <w:r>
+              <w:rPr>
+                <w:rFonts w:ascii="Calibri" w:hAnsi="Calibri"/>
+                <w:b/>
+                <w:color w:val="FFFFFF"/>
+                <w:sz w:val="17"/>
+              </w:rPr>
+              <w:t>Calibration slope</w:t>
+            </w:r>
+          </w:p>
+        </w:tc>
+        <w:tc>
+          <w:tcPr>
+            <w:tcW w:type="dxa" w:w="1260"/>
+            <w:tcMar>
+              <w:top w:w="80" w:type="dxa"/>
+              <w:start w:w="120" w:type="dxa"/>
+              <w:bottom w:w="80" w:type="dxa"/>
+              <w:end w:w="120" w:type="dxa"/>
+            </w:tcMar>
+            <w:vAlign w:val="center"/>
+            <w:shd w:fill="1F4D78"/>
+          </w:tcPr>
+          <w:p>
+            <w:pPr>
+              <w:pStyle w:val="TableText"/>
+              <w:jc w:val="center"/>
+            </w:pPr>
+            <w:r/>
+            <w:r>
+              <w:rPr>
+                <w:rFonts w:ascii="Calibri" w:hAnsi="Calibri"/>
+                <w:b/>
+                <w:color w:val="FFFFFF"/>
+                <w:sz w:val="17"/>
+              </w:rPr>
+              <w:t>ECE</w:t>
+            </w:r>
+          </w:p>
+        </w:tc>
+      </w:tr>
+      <w:tr>
+        <w:trPr>
+          <w:cantSplit w:val="true"/>
+        </w:trPr>
+        <w:tc>
+          <w:tcPr>
+            <w:tcW w:type="dxa" w:w="1800"/>
+            <w:tcMar>
+              <w:top w:w="80" w:type="dxa"/>
+              <w:start w:w="120" w:type="dxa"/>
+              <w:bottom w:w="80" w:type="dxa"/>
+              <w:end w:w="120" w:type="dxa"/>
+            </w:tcMar>
+            <w:vAlign w:val="center"/>
+          </w:tcPr>
+          <w:p>
+            <w:pPr>
+              <w:pStyle w:val="TableText"/>
+              <w:jc w:val="left"/>
+            </w:pPr>
+            <w:r/>
+            <w:r>
+              <w:rPr>
+                <w:rFonts w:ascii="Calibri" w:hAnsi="Calibri"/>
+                <w:b w:val="0"/>
+                <w:color w:val="000000"/>
+                <w:sz w:val="17"/>
+              </w:rPr>
+              <w:t>CatBoost</w:t>
+            </w:r>
+          </w:p>
+        </w:tc>
+        <w:tc>
+          <w:tcPr>
+            <w:tcW w:type="dxa" w:w="1260"/>
+            <w:tcMar>
+              <w:top w:w="80" w:type="dxa"/>
+              <w:start w:w="120" w:type="dxa"/>
+              <w:bottom w:w="80" w:type="dxa"/>
+              <w:end w:w="120" w:type="dxa"/>
+            </w:tcMar>
+            <w:vAlign w:val="center"/>
+          </w:tcPr>
+          <w:p>
+            <w:pPr>
+              <w:pStyle w:val="TableText"/>
+              <w:jc w:val="center"/>
+            </w:pPr>
+            <w:r/>
+            <w:r>
+              <w:rPr>
+                <w:rFonts w:ascii="Calibri" w:hAnsi="Calibri"/>
+                <w:b w:val="0"/>
+                <w:color w:val="000000"/>
+                <w:sz w:val="17"/>
+              </w:rPr>
+              <w:t>0.968</w:t>
+            </w:r>
+          </w:p>
+        </w:tc>
+        <w:tc>
+          <w:tcPr>
+            <w:tcW w:type="dxa" w:w="1260"/>
+            <w:tcMar>
+              <w:top w:w="80" w:type="dxa"/>
+              <w:start w:w="120" w:type="dxa"/>
+              <w:bottom w:w="80" w:type="dxa"/>
+              <w:end w:w="120" w:type="dxa"/>
+            </w:tcMar>
+            <w:vAlign w:val="center"/>
+          </w:tcPr>
+          <w:p>
+            <w:pPr>
+              <w:pStyle w:val="TableText"/>
+              <w:jc w:val="center"/>
+            </w:pPr>
+            <w:r/>
+            <w:r>
+              <w:rPr>
+                <w:rFonts w:ascii="Calibri" w:hAnsi="Calibri"/>
+                <w:b w:val="0"/>
+                <w:color w:val="000000"/>
+                <w:sz w:val="17"/>
+              </w:rPr>
+              <w:t>0.982</w:t>
+            </w:r>
+          </w:p>
+        </w:tc>
+        <w:tc>
+          <w:tcPr>
+            <w:tcW w:type="dxa" w:w="1260"/>
+            <w:tcMar>
+              <w:top w:w="80" w:type="dxa"/>
+              <w:start w:w="120" w:type="dxa"/>
+              <w:bottom w:w="80" w:type="dxa"/>
+              <w:end w:w="120" w:type="dxa"/>
+            </w:tcMar>
+            <w:vAlign w:val="center"/>
+          </w:tcPr>
+          <w:p>
+            <w:pPr>
+              <w:pStyle w:val="TableText"/>
+              <w:jc w:val="center"/>
+            </w:pPr>
+            <w:r/>
+            <w:r>
+              <w:rPr>
+                <w:rFonts w:ascii="Calibri" w:hAnsi="Calibri"/>
+                <w:b w:val="0"/>
+                <w:color w:val="000000"/>
+                <w:sz w:val="17"/>
+              </w:rPr>
+              <w:t>0.066</w:t>
+            </w:r>
+          </w:p>
+        </w:tc>
+        <w:tc>
+          <w:tcPr>
+            <w:tcW w:type="dxa" w:w="1260"/>
+            <w:tcMar>
+              <w:top w:w="80" w:type="dxa"/>
+              <w:start w:w="120" w:type="dxa"/>
+              <w:bottom w:w="80" w:type="dxa"/>
+              <w:end w:w="120" w:type="dxa"/>
+            </w:tcMar>
+            <w:vAlign w:val="center"/>
+          </w:tcPr>
+          <w:p>
+            <w:pPr>
+              <w:pStyle w:val="TableText"/>
+              <w:jc w:val="center"/>
+            </w:pPr>
+            <w:r/>
+            <w:r>
+              <w:rPr>
+                <w:rFonts w:ascii="Calibri" w:hAnsi="Calibri"/>
+                <w:b w:val="0"/>
+                <w:color w:val="000000"/>
+                <w:sz w:val="17"/>
+              </w:rPr>
+              <w:t>0.235</w:t>
+            </w:r>
+          </w:p>
+        </w:tc>
+        <w:tc>
+          <w:tcPr>
+            <w:tcW w:type="dxa" w:w="1260"/>
+            <w:tcMar>
+              <w:top w:w="80" w:type="dxa"/>
+              <w:start w:w="120" w:type="dxa"/>
+              <w:bottom w:w="80" w:type="dxa"/>
+              <w:end w:w="120" w:type="dxa"/>
+            </w:tcMar>
+            <w:vAlign w:val="center"/>
+          </w:tcPr>
+          <w:p>
+            <w:pPr>
+              <w:pStyle w:val="TableText"/>
+              <w:jc w:val="center"/>
+            </w:pPr>
+            <w:r/>
+            <w:r>
+              <w:rPr>
+                <w:rFonts w:ascii="Calibri" w:hAnsi="Calibri"/>
+                <w:b w:val="0"/>
+                <w:color w:val="000000"/>
+                <w:sz w:val="17"/>
+              </w:rPr>
+              <w:t>12.652</w:t>
+            </w:r>
+          </w:p>
+        </w:tc>
+        <w:tc>
+          <w:tcPr>
+            <w:tcW w:type="dxa" w:w="1260"/>
+            <w:tcMar>
+              <w:top w:w="80" w:type="dxa"/>
+              <w:start w:w="120" w:type="dxa"/>
+              <w:bottom w:w="80" w:type="dxa"/>
+              <w:end w:w="120" w:type="dxa"/>
+            </w:tcMar>
+            <w:vAlign w:val="center"/>
+          </w:tcPr>
+          <w:p>
+            <w:pPr>
+              <w:pStyle w:val="TableText"/>
+              <w:jc w:val="center"/>
+            </w:pPr>
+            <w:r/>
+            <w:r>
+              <w:rPr>
+                <w:rFonts w:ascii="Calibri" w:hAnsi="Calibri"/>
+                <w:b w:val="0"/>
+                <w:color w:val="000000"/>
+                <w:sz w:val="17"/>
+              </w:rPr>
+              <w:t>0.074</w:t>
+            </w:r>
+          </w:p>
+        </w:tc>
+      </w:tr>
+      <w:tr>
+        <w:trPr>
+          <w:cantSplit w:val="true"/>
+        </w:trPr>
+        <w:tc>
+          <w:tcPr>
+            <w:tcW w:type="dxa" w:w="1800"/>
+            <w:tcMar>
+              <w:top w:w="80" w:type="dxa"/>
+              <w:start w:w="120" w:type="dxa"/>
+              <w:bottom w:w="80" w:type="dxa"/>
+              <w:end w:w="120" w:type="dxa"/>
+            </w:tcMar>
+            <w:vAlign w:val="center"/>
+          </w:tcPr>
+          <w:p>
+            <w:pPr>
+              <w:pStyle w:val="TableText"/>
+              <w:jc w:val="left"/>
+            </w:pPr>
+            <w:r/>
+            <w:r>
+              <w:rPr>
+                <w:rFonts w:ascii="Calibri" w:hAnsi="Calibri"/>
+                <w:b w:val="0"/>
+                <w:color w:val="000000"/>
+                <w:sz w:val="17"/>
+              </w:rPr>
+              <w:t>Random Forest</w:t>
+            </w:r>
+          </w:p>
+        </w:tc>
+        <w:tc>
+          <w:tcPr>
+            <w:tcW w:type="dxa" w:w="1260"/>
+            <w:tcMar>
+              <w:top w:w="80" w:type="dxa"/>
+              <w:start w:w="120" w:type="dxa"/>
+              <w:bottom w:w="80" w:type="dxa"/>
+              <w:end w:w="120" w:type="dxa"/>
+            </w:tcMar>
+            <w:vAlign w:val="center"/>
+          </w:tcPr>
+          <w:p>
+            <w:pPr>
+              <w:pStyle w:val="TableText"/>
+              <w:jc w:val="center"/>
+            </w:pPr>
+            <w:r/>
+            <w:r>
+              <w:rPr>
+                <w:rFonts w:ascii="Calibri" w:hAnsi="Calibri"/>
+                <w:b w:val="0"/>
+                <w:color w:val="000000"/>
+                <w:sz w:val="17"/>
+              </w:rPr>
+              <w:t>0.966</w:t>
+            </w:r>
+          </w:p>
+        </w:tc>
+        <w:tc>
+          <w:tcPr>
+            <w:tcW w:type="dxa" w:w="1260"/>
+            <w:tcMar>
+              <w:top w:w="80" w:type="dxa"/>
+              <w:start w:w="120" w:type="dxa"/>
+              <w:bottom w:w="80" w:type="dxa"/>
+              <w:end w:w="120" w:type="dxa"/>
+            </w:tcMar>
+            <w:vAlign w:val="center"/>
+          </w:tcPr>
+          <w:p>
+            <w:pPr>
+              <w:pStyle w:val="TableText"/>
+              <w:jc w:val="center"/>
+            </w:pPr>
+            <w:r/>
+            <w:r>
+              <w:rPr>
+                <w:rFonts w:ascii="Calibri" w:hAnsi="Calibri"/>
+                <w:b w:val="0"/>
+                <w:color w:val="000000"/>
+                <w:sz w:val="17"/>
+              </w:rPr>
+              <w:t>0.981</w:t>
+            </w:r>
+          </w:p>
+        </w:tc>
+        <w:tc>
+          <w:tcPr>
+            <w:tcW w:type="dxa" w:w="1260"/>
+            <w:tcMar>
+              <w:top w:w="80" w:type="dxa"/>
+              <w:start w:w="120" w:type="dxa"/>
+              <w:bottom w:w="80" w:type="dxa"/>
+              <w:end w:w="120" w:type="dxa"/>
+            </w:tcMar>
+            <w:vAlign w:val="center"/>
+          </w:tcPr>
+          <w:p>
+            <w:pPr>
+              <w:pStyle w:val="TableText"/>
+              <w:jc w:val="center"/>
+            </w:pPr>
+            <w:r/>
+            <w:r>
+              <w:rPr>
+                <w:rFonts w:ascii="Calibri" w:hAnsi="Calibri"/>
+                <w:b w:val="0"/>
+                <w:color w:val="000000"/>
+                <w:sz w:val="17"/>
+              </w:rPr>
+              <w:t>0.072</w:t>
+            </w:r>
+          </w:p>
+        </w:tc>
+        <w:tc>
+          <w:tcPr>
+            <w:tcW w:type="dxa" w:w="1260"/>
+            <w:tcMar>
+              <w:top w:w="80" w:type="dxa"/>
+              <w:start w:w="120" w:type="dxa"/>
+              <w:bottom w:w="80" w:type="dxa"/>
+              <w:end w:w="120" w:type="dxa"/>
+            </w:tcMar>
+            <w:vAlign w:val="center"/>
+          </w:tcPr>
+          <w:p>
+            <w:pPr>
+              <w:pStyle w:val="TableText"/>
+              <w:jc w:val="center"/>
+            </w:pPr>
+            <w:r/>
+            <w:r>
+              <w:rPr>
+                <w:rFonts w:ascii="Calibri" w:hAnsi="Calibri"/>
+                <w:b w:val="0"/>
+                <w:color w:val="000000"/>
+                <w:sz w:val="17"/>
+              </w:rPr>
+              <w:t>0.246</w:t>
+            </w:r>
+          </w:p>
+        </w:tc>
+        <w:tc>
+          <w:tcPr>
+            <w:tcW w:type="dxa" w:w="1260"/>
+            <w:tcMar>
+              <w:top w:w="80" w:type="dxa"/>
+              <w:start w:w="120" w:type="dxa"/>
+              <w:bottom w:w="80" w:type="dxa"/>
+              <w:end w:w="120" w:type="dxa"/>
+            </w:tcMar>
+            <w:vAlign w:val="center"/>
+          </w:tcPr>
+          <w:p>
+            <w:pPr>
+              <w:pStyle w:val="TableText"/>
+              <w:jc w:val="center"/>
+            </w:pPr>
+            <w:r/>
+            <w:r>
+              <w:rPr>
+                <w:rFonts w:ascii="Calibri" w:hAnsi="Calibri"/>
+                <w:b w:val="0"/>
+                <w:color w:val="000000"/>
+                <w:sz w:val="17"/>
+              </w:rPr>
+              <w:t>2.200</w:t>
+            </w:r>
+          </w:p>
+        </w:tc>
+        <w:tc>
+          <w:tcPr>
+            <w:tcW w:type="dxa" w:w="1260"/>
+            <w:tcMar>
+              <w:top w:w="80" w:type="dxa"/>
+              <w:start w:w="120" w:type="dxa"/>
+              <w:bottom w:w="80" w:type="dxa"/>
+              <w:end w:w="120" w:type="dxa"/>
+            </w:tcMar>
+            <w:vAlign w:val="center"/>
+          </w:tcPr>
+          <w:p>
+            <w:pPr>
+              <w:pStyle w:val="TableText"/>
+              <w:jc w:val="center"/>
+            </w:pPr>
+            <w:r/>
+            <w:r>
+              <w:rPr>
+                <w:rFonts w:ascii="Calibri" w:hAnsi="Calibri"/>
+                <w:b w:val="0"/>
+                <w:color w:val="000000"/>
+                <w:sz w:val="17"/>
+              </w:rPr>
+              <w:t>0.087</w:t>
+            </w:r>
+          </w:p>
+        </w:tc>
+      </w:tr>
+      <w:tr>
+        <w:trPr>
+          <w:cantSplit w:val="true"/>
+        </w:trPr>
+        <w:tc>
+          <w:tcPr>
+            <w:tcW w:type="dxa" w:w="1800"/>
+            <w:tcMar>
+              <w:top w:w="80" w:type="dxa"/>
+              <w:start w:w="120" w:type="dxa"/>
+              <w:bottom w:w="80" w:type="dxa"/>
+              <w:end w:w="120" w:type="dxa"/>
+            </w:tcMar>
+            <w:vAlign w:val="center"/>
+          </w:tcPr>
+          <w:p>
+            <w:pPr>
+              <w:pStyle w:val="TableText"/>
+              <w:jc w:val="left"/>
+            </w:pPr>
+            <w:r/>
+            <w:r>
+              <w:rPr>
+                <w:rFonts w:ascii="Calibri" w:hAnsi="Calibri"/>
+                <w:b w:val="0"/>
+                <w:color w:val="000000"/>
+                <w:sz w:val="17"/>
+              </w:rPr>
+              <w:t>LightGBM</w:t>
+            </w:r>
+          </w:p>
+        </w:tc>
+        <w:tc>
+          <w:tcPr>
+            <w:tcW w:type="dxa" w:w="1260"/>
+            <w:tcMar>
+              <w:top w:w="80" w:type="dxa"/>
+              <w:start w:w="120" w:type="dxa"/>
+              <w:bottom w:w="80" w:type="dxa"/>
+              <w:end w:w="120" w:type="dxa"/>
+            </w:tcMar>
+            <w:vAlign w:val="center"/>
+          </w:tcPr>
+          <w:p>
+            <w:pPr>
+              <w:pStyle w:val="TableText"/>
+              <w:jc w:val="center"/>
+            </w:pPr>
+            <w:r/>
+            <w:r>
+              <w:rPr>
+                <w:rFonts w:ascii="Calibri" w:hAnsi="Calibri"/>
+                <w:b w:val="0"/>
+                <w:color w:val="000000"/>
+                <w:sz w:val="17"/>
+              </w:rPr>
+              <w:t>0.953</w:t>
+            </w:r>
+          </w:p>
+        </w:tc>
+        <w:tc>
+          <w:tcPr>
+            <w:tcW w:type="dxa" w:w="1260"/>
+            <w:tcMar>
+              <w:top w:w="80" w:type="dxa"/>
+              <w:start w:w="120" w:type="dxa"/>
+              <w:bottom w:w="80" w:type="dxa"/>
+              <w:end w:w="120" w:type="dxa"/>
+            </w:tcMar>
+            <w:vAlign w:val="center"/>
+          </w:tcPr>
+          <w:p>
+            <w:pPr>
+              <w:pStyle w:val="TableText"/>
+              <w:jc w:val="center"/>
+            </w:pPr>
+            <w:r/>
+            <w:r>
+              <w:rPr>
+                <w:rFonts w:ascii="Calibri" w:hAnsi="Calibri"/>
+                <w:b w:val="0"/>
+                <w:color w:val="000000"/>
+                <w:sz w:val="17"/>
+              </w:rPr>
+              <w:t>0.973</w:t>
+            </w:r>
+          </w:p>
+        </w:tc>
+        <w:tc>
+          <w:tcPr>
+            <w:tcW w:type="dxa" w:w="1260"/>
+            <w:tcMar>
+              <w:top w:w="80" w:type="dxa"/>
+              <w:start w:w="120" w:type="dxa"/>
+              <w:bottom w:w="80" w:type="dxa"/>
+              <w:end w:w="120" w:type="dxa"/>
+            </w:tcMar>
+            <w:vAlign w:val="center"/>
+          </w:tcPr>
+          <w:p>
+            <w:pPr>
+              <w:pStyle w:val="TableText"/>
+              <w:jc w:val="center"/>
+            </w:pPr>
+            <w:r/>
+            <w:r>
+              <w:rPr>
+                <w:rFonts w:ascii="Calibri" w:hAnsi="Calibri"/>
+                <w:b w:val="0"/>
+                <w:color w:val="000000"/>
+                <w:sz w:val="17"/>
+              </w:rPr>
+              <w:t>0.080</w:t>
+            </w:r>
+          </w:p>
+        </w:tc>
+        <w:tc>
+          <w:tcPr>
+            <w:tcW w:type="dxa" w:w="1260"/>
+            <w:tcMar>
+              <w:top w:w="80" w:type="dxa"/>
+              <w:start w:w="120" w:type="dxa"/>
+              <w:bottom w:w="80" w:type="dxa"/>
+              <w:end w:w="120" w:type="dxa"/>
+            </w:tcMar>
+            <w:vAlign w:val="center"/>
+          </w:tcPr>
+          <w:p>
+            <w:pPr>
+              <w:pStyle w:val="TableText"/>
+              <w:jc w:val="center"/>
+            </w:pPr>
+            <w:r/>
+            <w:r>
+              <w:rPr>
+                <w:rFonts w:ascii="Calibri" w:hAnsi="Calibri"/>
+                <w:b w:val="0"/>
+                <w:color w:val="000000"/>
+                <w:sz w:val="17"/>
+              </w:rPr>
+              <w:t>0.290</w:t>
+            </w:r>
+          </w:p>
+        </w:tc>
+        <w:tc>
+          <w:tcPr>
+            <w:tcW w:type="dxa" w:w="1260"/>
+            <w:tcMar>
+              <w:top w:w="80" w:type="dxa"/>
+              <w:start w:w="120" w:type="dxa"/>
+              <w:bottom w:w="80" w:type="dxa"/>
+              <w:end w:w="120" w:type="dxa"/>
+            </w:tcMar>
+            <w:vAlign w:val="center"/>
+          </w:tcPr>
+          <w:p>
+            <w:pPr>
+              <w:pStyle w:val="TableText"/>
+              <w:jc w:val="center"/>
+            </w:pPr>
+            <w:r/>
+            <w:r>
+              <w:rPr>
+                <w:rFonts w:ascii="Calibri" w:hAnsi="Calibri"/>
+                <w:b w:val="0"/>
+                <w:color w:val="000000"/>
+                <w:sz w:val="17"/>
+              </w:rPr>
+              <w:t>1.354</w:t>
+            </w:r>
+          </w:p>
+        </w:tc>
+        <w:tc>
+          <w:tcPr>
+            <w:tcW w:type="dxa" w:w="1260"/>
+            <w:tcMar>
+              <w:top w:w="80" w:type="dxa"/>
+              <w:start w:w="120" w:type="dxa"/>
+              <w:bottom w:w="80" w:type="dxa"/>
+              <w:end w:w="120" w:type="dxa"/>
+            </w:tcMar>
+            <w:vAlign w:val="center"/>
+          </w:tcPr>
+          <w:p>
+            <w:pPr>
+              <w:pStyle w:val="TableText"/>
+              <w:jc w:val="center"/>
+            </w:pPr>
+            <w:r/>
+            <w:r>
+              <w:rPr>
+                <w:rFonts w:ascii="Calibri" w:hAnsi="Calibri"/>
+                <w:b w:val="0"/>
+                <w:color w:val="000000"/>
+                <w:sz w:val="17"/>
+              </w:rPr>
+              <w:t>0.085</w:t>
+            </w:r>
+          </w:p>
+        </w:tc>
+      </w:tr>
+      <w:tr>
+        <w:trPr>
+          <w:cantSplit w:val="true"/>
+        </w:trPr>
+        <w:tc>
+          <w:tcPr>
+            <w:tcW w:type="dxa" w:w="1800"/>
+            <w:tcMar>
+              <w:top w:w="80" w:type="dxa"/>
+              <w:start w:w="120" w:type="dxa"/>
+              <w:bottom w:w="80" w:type="dxa"/>
+              <w:end w:w="120" w:type="dxa"/>
+            </w:tcMar>
+            <w:vAlign w:val="center"/>
+          </w:tcPr>
+          <w:p>
+            <w:pPr>
+              <w:pStyle w:val="TableText"/>
+              <w:jc w:val="left"/>
+            </w:pPr>
+            <w:r/>
+            <w:r>
+              <w:rPr>
+                <w:rFonts w:ascii="Calibri" w:hAnsi="Calibri"/>
+                <w:b w:val="0"/>
+                <w:color w:val="000000"/>
+                <w:sz w:val="17"/>
+              </w:rPr>
+              <w:t>XGBoost</w:t>
+            </w:r>
+          </w:p>
+        </w:tc>
+        <w:tc>
+          <w:tcPr>
+            <w:tcW w:type="dxa" w:w="1260"/>
+            <w:tcMar>
+              <w:top w:w="80" w:type="dxa"/>
+              <w:start w:w="120" w:type="dxa"/>
+              <w:bottom w:w="80" w:type="dxa"/>
+              <w:end w:w="120" w:type="dxa"/>
+            </w:tcMar>
+            <w:vAlign w:val="center"/>
+          </w:tcPr>
+          <w:p>
+            <w:pPr>
+              <w:pStyle w:val="TableText"/>
+              <w:jc w:val="center"/>
+            </w:pPr>
+            <w:r/>
+            <w:r>
+              <w:rPr>
+                <w:rFonts w:ascii="Calibri" w:hAnsi="Calibri"/>
+                <w:b w:val="0"/>
+                <w:color w:val="000000"/>
+                <w:sz w:val="17"/>
+              </w:rPr>
+              <w:t>0.957</w:t>
+            </w:r>
+          </w:p>
+        </w:tc>
+        <w:tc>
+          <w:tcPr>
+            <w:tcW w:type="dxa" w:w="1260"/>
+            <w:tcMar>
+              <w:top w:w="80" w:type="dxa"/>
+              <w:start w:w="120" w:type="dxa"/>
+              <w:bottom w:w="80" w:type="dxa"/>
+              <w:end w:w="120" w:type="dxa"/>
+            </w:tcMar>
+            <w:vAlign w:val="center"/>
+          </w:tcPr>
+          <w:p>
+            <w:pPr>
+              <w:pStyle w:val="TableText"/>
+              <w:jc w:val="center"/>
+            </w:pPr>
+            <w:r/>
+            <w:r>
+              <w:rPr>
+                <w:rFonts w:ascii="Calibri" w:hAnsi="Calibri"/>
+                <w:b w:val="0"/>
+                <w:color w:val="000000"/>
+                <w:sz w:val="17"/>
+              </w:rPr>
+              <w:t>0.976</w:t>
+            </w:r>
+          </w:p>
+        </w:tc>
+        <w:tc>
+          <w:tcPr>
+            <w:tcW w:type="dxa" w:w="1260"/>
+            <w:tcMar>
+              <w:top w:w="80" w:type="dxa"/>
+              <w:start w:w="120" w:type="dxa"/>
+              <w:bottom w:w="80" w:type="dxa"/>
+              <w:end w:w="120" w:type="dxa"/>
+            </w:tcMar>
+            <w:vAlign w:val="center"/>
+          </w:tcPr>
+          <w:p>
+            <w:pPr>
+              <w:pStyle w:val="TableText"/>
+              <w:jc w:val="center"/>
+            </w:pPr>
+            <w:r/>
+            <w:r>
+              <w:rPr>
+                <w:rFonts w:ascii="Calibri" w:hAnsi="Calibri"/>
+                <w:b w:val="0"/>
+                <w:color w:val="000000"/>
+                <w:sz w:val="17"/>
+              </w:rPr>
+              <w:t>0.080</w:t>
+            </w:r>
+          </w:p>
+        </w:tc>
+        <w:tc>
+          <w:tcPr>
+            <w:tcW w:type="dxa" w:w="1260"/>
+            <w:tcMar>
+              <w:top w:w="80" w:type="dxa"/>
+              <w:start w:w="120" w:type="dxa"/>
+              <w:bottom w:w="80" w:type="dxa"/>
+              <w:end w:w="120" w:type="dxa"/>
+            </w:tcMar>
+            <w:vAlign w:val="center"/>
+          </w:tcPr>
+          <w:p>
+            <w:pPr>
+              <w:pStyle w:val="TableText"/>
+              <w:jc w:val="center"/>
+            </w:pPr>
+            <w:r/>
+            <w:r>
+              <w:rPr>
+                <w:rFonts w:ascii="Calibri" w:hAnsi="Calibri"/>
+                <w:b w:val="0"/>
+                <w:color w:val="000000"/>
+                <w:sz w:val="17"/>
+              </w:rPr>
+              <w:t>0.266</w:t>
+            </w:r>
+          </w:p>
+        </w:tc>
+        <w:tc>
+          <w:tcPr>
+            <w:tcW w:type="dxa" w:w="1260"/>
+            <w:tcMar>
+              <w:top w:w="80" w:type="dxa"/>
+              <w:start w:w="120" w:type="dxa"/>
+              <w:bottom w:w="80" w:type="dxa"/>
+              <w:end w:w="120" w:type="dxa"/>
+            </w:tcMar>
+            <w:vAlign w:val="center"/>
+          </w:tcPr>
+          <w:p>
+            <w:pPr>
+              <w:pStyle w:val="TableText"/>
+              <w:jc w:val="center"/>
+            </w:pPr>
+            <w:r/>
+            <w:r>
+              <w:rPr>
+                <w:rFonts w:ascii="Calibri" w:hAnsi="Calibri"/>
+                <w:b w:val="0"/>
+                <w:color w:val="000000"/>
+                <w:sz w:val="17"/>
+              </w:rPr>
+              <w:t>2.244</w:t>
+            </w:r>
+          </w:p>
+        </w:tc>
+        <w:tc>
+          <w:tcPr>
+            <w:tcW w:type="dxa" w:w="1260"/>
+            <w:tcMar>
+              <w:top w:w="80" w:type="dxa"/>
+              <w:start w:w="120" w:type="dxa"/>
+              <w:bottom w:w="80" w:type="dxa"/>
+              <w:end w:w="120" w:type="dxa"/>
+            </w:tcMar>
+            <w:vAlign w:val="center"/>
+          </w:tcPr>
+          <w:p>
+            <w:pPr>
+              <w:pStyle w:val="TableText"/>
+              <w:jc w:val="center"/>
+            </w:pPr>
+            <w:r/>
+            <w:r>
+              <w:rPr>
+                <w:rFonts w:ascii="Calibri" w:hAnsi="Calibri"/>
+                <w:b w:val="0"/>
+                <w:color w:val="000000"/>
+                <w:sz w:val="17"/>
+              </w:rPr>
+              <w:t>0.085</w:t>
+            </w:r>
+          </w:p>
+        </w:tc>
+      </w:tr>
+      <w:tr>
+        <w:trPr>
+          <w:cantSplit w:val="true"/>
+        </w:trPr>
+        <w:tc>
+          <w:tcPr>
+            <w:tcW w:type="dxa" w:w="1800"/>
+            <w:tcMar>
+              <w:top w:w="80" w:type="dxa"/>
+              <w:start w:w="120" w:type="dxa"/>
+              <w:bottom w:w="80" w:type="dxa"/>
+              <w:end w:w="120" w:type="dxa"/>
+            </w:tcMar>
+            <w:vAlign w:val="center"/>
+          </w:tcPr>
+          <w:p>
+            <w:pPr>
+              <w:pStyle w:val="TableText"/>
+              <w:jc w:val="left"/>
+            </w:pPr>
+            <w:r/>
+            <w:r>
+              <w:rPr>
+                <w:rFonts w:ascii="Calibri" w:hAnsi="Calibri"/>
+                <w:b w:val="0"/>
+                <w:color w:val="000000"/>
+                <w:sz w:val="17"/>
+              </w:rPr>
+              <w:t>Logistic Regression</w:t>
+            </w:r>
+          </w:p>
+        </w:tc>
+        <w:tc>
+          <w:tcPr>
+            <w:tcW w:type="dxa" w:w="1260"/>
+            <w:tcMar>
+              <w:top w:w="80" w:type="dxa"/>
+              <w:start w:w="120" w:type="dxa"/>
+              <w:bottom w:w="80" w:type="dxa"/>
+              <w:end w:w="120" w:type="dxa"/>
+            </w:tcMar>
+            <w:vAlign w:val="center"/>
+          </w:tcPr>
+          <w:p>
+            <w:pPr>
+              <w:pStyle w:val="TableText"/>
+              <w:jc w:val="center"/>
+            </w:pPr>
+            <w:r/>
+            <w:r>
+              <w:rPr>
+                <w:rFonts w:ascii="Calibri" w:hAnsi="Calibri"/>
+                <w:b w:val="0"/>
+                <w:color w:val="000000"/>
+                <w:sz w:val="17"/>
+              </w:rPr>
+              <w:t>0.957</w:t>
+            </w:r>
+          </w:p>
+        </w:tc>
+        <w:tc>
+          <w:tcPr>
+            <w:tcW w:type="dxa" w:w="1260"/>
+            <w:tcMar>
+              <w:top w:w="80" w:type="dxa"/>
+              <w:start w:w="120" w:type="dxa"/>
+              <w:bottom w:w="80" w:type="dxa"/>
+              <w:end w:w="120" w:type="dxa"/>
+            </w:tcMar>
+            <w:vAlign w:val="center"/>
+          </w:tcPr>
+          <w:p>
+            <w:pPr>
+              <w:pStyle w:val="TableText"/>
+              <w:jc w:val="center"/>
+            </w:pPr>
+            <w:r/>
+            <w:r>
+              <w:rPr>
+                <w:rFonts w:ascii="Calibri" w:hAnsi="Calibri"/>
+                <w:b w:val="0"/>
+                <w:color w:val="000000"/>
+                <w:sz w:val="17"/>
+              </w:rPr>
+              <w:t>0.976</w:t>
+            </w:r>
+          </w:p>
+        </w:tc>
+        <w:tc>
+          <w:tcPr>
+            <w:tcW w:type="dxa" w:w="1260"/>
+            <w:tcMar>
+              <w:top w:w="80" w:type="dxa"/>
+              <w:start w:w="120" w:type="dxa"/>
+              <w:bottom w:w="80" w:type="dxa"/>
+              <w:end w:w="120" w:type="dxa"/>
+            </w:tcMar>
+            <w:vAlign w:val="center"/>
+          </w:tcPr>
+          <w:p>
+            <w:pPr>
+              <w:pStyle w:val="TableText"/>
+              <w:jc w:val="center"/>
+            </w:pPr>
+            <w:r/>
+            <w:r>
+              <w:rPr>
+                <w:rFonts w:ascii="Calibri" w:hAnsi="Calibri"/>
+                <w:b w:val="0"/>
+                <w:color w:val="000000"/>
+                <w:sz w:val="17"/>
+              </w:rPr>
+              <w:t>0.086</w:t>
+            </w:r>
+          </w:p>
+        </w:tc>
+        <w:tc>
+          <w:tcPr>
+            <w:tcW w:type="dxa" w:w="1260"/>
+            <w:tcMar>
+              <w:top w:w="80" w:type="dxa"/>
+              <w:start w:w="120" w:type="dxa"/>
+              <w:bottom w:w="80" w:type="dxa"/>
+              <w:end w:w="120" w:type="dxa"/>
+            </w:tcMar>
+            <w:vAlign w:val="center"/>
+          </w:tcPr>
+          <w:p>
+            <w:pPr>
+              <w:pStyle w:val="TableText"/>
+              <w:jc w:val="center"/>
+            </w:pPr>
+            <w:r/>
+            <w:r>
+              <w:rPr>
+                <w:rFonts w:ascii="Calibri" w:hAnsi="Calibri"/>
+                <w:b w:val="0"/>
+                <w:color w:val="000000"/>
+                <w:sz w:val="17"/>
+              </w:rPr>
+              <w:t>0.285</w:t>
+            </w:r>
+          </w:p>
+        </w:tc>
+        <w:tc>
+          <w:tcPr>
+            <w:tcW w:type="dxa" w:w="1260"/>
+            <w:tcMar>
+              <w:top w:w="80" w:type="dxa"/>
+              <w:start w:w="120" w:type="dxa"/>
+              <w:bottom w:w="80" w:type="dxa"/>
+              <w:end w:w="120" w:type="dxa"/>
+            </w:tcMar>
+            <w:vAlign w:val="center"/>
+          </w:tcPr>
+          <w:p>
+            <w:pPr>
+              <w:pStyle w:val="TableText"/>
+              <w:jc w:val="center"/>
+            </w:pPr>
+            <w:r/>
+            <w:r>
+              <w:rPr>
+                <w:rFonts w:ascii="Calibri" w:hAnsi="Calibri"/>
+                <w:b w:val="0"/>
+                <w:color w:val="000000"/>
+                <w:sz w:val="17"/>
+              </w:rPr>
+              <w:t>1.431</w:t>
+            </w:r>
+          </w:p>
+        </w:tc>
+        <w:tc>
+          <w:tcPr>
+            <w:tcW w:type="dxa" w:w="1260"/>
+            <w:tcMar>
+              <w:top w:w="80" w:type="dxa"/>
+              <w:start w:w="120" w:type="dxa"/>
+              <w:bottom w:w="80" w:type="dxa"/>
+              <w:end w:w="120" w:type="dxa"/>
+            </w:tcMar>
+            <w:vAlign w:val="center"/>
+          </w:tcPr>
+          <w:p>
+            <w:pPr>
+              <w:pStyle w:val="TableText"/>
+              <w:jc w:val="center"/>
+            </w:pPr>
+            <w:r/>
+            <w:r>
+              <w:rPr>
+                <w:rFonts w:ascii="Calibri" w:hAnsi="Calibri"/>
+                <w:b w:val="0"/>
+                <w:color w:val="000000"/>
+                <w:sz w:val="17"/>
+              </w:rPr>
+              <w:t>0.091</w:t>
+            </w:r>
+          </w:p>
+        </w:tc>
+      </w:tr>
+    </w:tbl>
+    <w:p>
+      <w:pPr>
+        <w:spacing w:after="40"/>
+        <w:jc w:val="left"/>
+      </w:pPr>
+    </w:p>
+    <w:p>
+      <w:pPr>
+        <w:keepNext/>
+        <w:jc w:val="center"/>
+      </w:pPr>
+      <w:r>
+        <w:drawing>
+          <wp:inline xmlns:a="http://schemas.openxmlformats.org/drawingml/2006/main" xmlns:pic="http://schemas.openxmlformats.org/drawingml/2006/picture">
+            <wp:extent cx="5669280" cy="2464791"/>
+            <wp:docPr id="4" name="Picture 4" descr="Sylhet participant-level model discrimination and probability loss across feature-availability panels under grouped development validation." title="Sylhet Performance And Panels"/>
+            <wp:cNvGraphicFramePr>
+              <a:graphicFrameLocks noChangeAspect="1"/>
+            </wp:cNvGraphicFramePr>
+            <a:graphic>
+              <a:graphicData uri="http://schemas.openxmlformats.org/drawingml/2006/picture">
+                <pic:pic>
+                  <pic:nvPicPr>
+                    <pic:cNvPr id="0" name="sylhet_performance_and_panels.png"/>
+                    <pic:cNvPicPr/>
+                  </pic:nvPicPr>
+                  <pic:blipFill>
+                    <a:blip r:embed="rId14"/>
+                    <a:stretch>
+                      <a:fillRect/>
+                    </a:stretch>
+                  </pic:blipFill>
+                  <pic:spPr>
+                    <a:xfrm>
+                      <a:off x="0" y="0"/>
+                      <a:ext cx="5669280" cy="2464791"/>
+                    </a:xfrm>
+                    <a:prstGeom prst="rect"/>
+                  </pic:spPr>
+                </pic:pic>
+              </a:graphicData>
+            </a:graphic>
+          </wp:inline>
+        </w:drawing>
+      </w:r>
+    </w:p>
+    <w:p>
+      <w:pPr>
+        <w:jc w:val="left"/>
+      </w:pPr>
+      <w:r>
+        <w:rPr>
+          <w:rFonts w:ascii="Calibri" w:hAnsi="Calibri"/>
+          <w:b/>
+          <w:color w:val="000000"/>
+        </w:rPr>
+        <w:t>Figure 4.</w:t>
+      </w:r>
+      <w:r>
+        <w:rPr>
+          <w:rFonts w:ascii="Calibri" w:hAnsi="Calibri"/>
+          <w:color w:val="000000"/>
+        </w:rPr>
+        <w:t xml:space="preserve"> Sylhet participant-level model discrimination and panel-specific probability loss under grouped development validation. Intervals use identical- profile cluster resampling.</w:t>
+      </w:r>
+    </w:p>
+    <w:p>
+      <w:pPr>
+        <w:jc w:val="left"/>
+      </w:pPr>
+      <w:r>
+        <w:rPr>
+          <w:rFonts w:ascii="Calibri" w:hAnsi="Calibri"/>
+          <w:color w:val="000000"/>
+        </w:rPr>
+        <w:t>At participant level, the full-panel router achieved AUROC 0.965 and Brier 0.068, whereas the robust fixed model achieved AUROC 0.960 and Brier 0.077. The paired router-versus-fixed interval crossed no improvement after cluster resampling, and no routing ablation survived Holm correction. Reduced panels showed descriptive loss: the 10-feature core questionnaire router had AUROC 0.945 and Brier 0.095, while the two-feature polyuria-polydipsia router had AUROC 0.905 and Brier 0.113. None of 64 matched full-versus-reduced contrasts survived Holm correction; the minimum adjusted p-value was 0.064.</w:t>
+      </w:r>
+    </w:p>
+    <w:p>
+      <w:pPr>
+        <w:jc w:val="left"/>
+      </w:pPr>
+      <w:r>
+        <w:rPr>
+          <w:rFonts w:ascii="Calibri" w:hAnsi="Calibri"/>
+          <w:color w:val="000000"/>
+        </w:rPr>
+        <w:t>Separately tuned panel-specific Random Forest and XGBoost pipelines were also compared with masked full-panel inference across all four reduced panels and all 25 grouped outer splits. The analysis produced 41,600 held-out prediction rows and 32 participant-paired, profile-cluster-resampled metric contrasts. No contrast survived metric-wise Holm correction (minimum adjusted p=0.064). The largest descriptive Brier improvement was 0.006 for XGBoost on the 10-feature core questionnaire panel, with its interval crossing zero. Panel-specific training therefore remains an inconclusive engineering option rather than a supported superiority result.</w:t>
+      </w:r>
+    </w:p>
+    <w:p>
+      <w:pPr>
+        <w:jc w:val="left"/>
+      </w:pPr>
+      <w:r>
+        <w:rPr>
+          <w:rFonts w:ascii="Calibri" w:hAnsi="Calibri"/>
+          <w:color w:val="000000"/>
+        </w:rPr>
+        <w:t>The full missing-indicator retraining comparison likewise found no Holm-corrected benefit. Random Forest predictions were numerically equivalent with indicators on and off, while Logistic Regression differences were small and all adjusted p-values were 1.000. This is expected because the Sylhet questionnaire does not contain applicable numeric missingness for the indicator transformer.</w:t>
+      </w:r>
+    </w:p>
+    <w:p>
+      <w:pPr>
+        <w:jc w:val="left"/>
+      </w:pPr>
+      <w:r>
+        <w:rPr>
+          <w:rFonts w:ascii="Calibri" w:hAnsi="Calibri"/>
+          <w:color w:val="000000"/>
+        </w:rPr>
+        <w:t>At 70% selective coverage, the full-panel router Brier score improved from 0.062 to 0.025 while retaining 76.9% of positive events. Subgroup support remained a major caveat: the accepted female cell contained no negative events and was suppressed, as were the youngest and oldest age groups. Under 75% simulated dropout, supported-panel coverage fell to 4.0%-6.2% and Brier score rose to 0.278-0.289 across Random Forest and XGBoost.</w:t>
+      </w:r>
+    </w:p>
+    <w:p>
+      <w:pPr>
+        <w:pStyle w:val="Heading2"/>
+        <w:keepNext w:val="0"/>
+        <w:jc w:val="left"/>
+      </w:pPr>
+      <w:r>
+        <w:rPr>
+          <w:rFonts w:ascii="Calibri" w:hAnsi="Calibri"/>
+          <w:color w:val="000000"/>
+        </w:rPr>
+        <w:t>3.6 Pending locked BRFSS estimate</w:t>
+      </w:r>
+    </w:p>
+    <w:p>
+      <w:pPr>
+        <w:jc w:val="left"/>
+      </w:pPr>
+      <w:r>
+        <w:rPr>
+          <w:rFonts w:ascii="Calibri" w:hAnsi="Calibri"/>
+          <w:color w:val="000000"/>
+        </w:rPr>
+        <w:t>Existing BRFSS smoke studies remain engineering evidence and are not promoted into the main result table. The next full-sample BRFSS holdout is deliberately reserved for a new concealed manifest and one authorized final execution after protocol freeze. Hospital130 remains outside the diabetes-screening result family because its endpoint is 30-day readmission.</w:t>
       </w:r>
     </w:p>
     <w:p>
       <w:pPr>
         <w:pStyle w:val="Heading1"/>
+        <w:keepNext w:val="0"/>
+        <w:jc w:val="left"/>
       </w:pPr>
       <w:r>
         <w:rPr>
@@ -2024,6 +3588,9 @@
       </w:r>
     </w:p>
     <w:p>
+      <w:pPr>
+        <w:jc w:val="left"/>
+      </w:pPr>
       <w:r>
         <w:rPr>
           <w:rFonts w:ascii="Calibri" w:hAnsi="Calibri"/>
@@ -2033,6 +3600,9 @@
       </w:r>
     </w:p>
     <w:p>
+      <w:pPr>
+        <w:jc w:val="left"/>
+      </w:pPr>
       <w:r>
         <w:rPr>
           <w:rFonts w:ascii="Calibri" w:hAnsi="Calibri"/>
@@ -2042,6 +3612,9 @@
       </w:r>
     </w:p>
     <w:p>
+      <w:pPr>
+        <w:jc w:val="left"/>
+      </w:pPr>
       <w:r>
         <w:rPr>
           <w:rFonts w:ascii="Calibri" w:hAnsi="Calibri"/>
@@ -2051,6 +3624,9 @@
       </w:r>
     </w:p>
     <w:p>
+      <w:pPr>
+        <w:jc w:val="left"/>
+      </w:pPr>
       <w:r>
         <w:rPr>
           <w:rFonts w:ascii="Calibri" w:hAnsi="Calibri"/>
@@ -2062,6 +3638,8 @@
     <w:p>
       <w:pPr>
         <w:pStyle w:val="Heading1"/>
+        <w:keepNext w:val="0"/>
+        <w:jc w:val="left"/>
       </w:pPr>
       <w:r>
         <w:rPr>
@@ -2072,6 +3650,9 @@
       </w:r>
     </w:p>
     <w:p>
+      <w:pPr>
+        <w:jc w:val="left"/>
+      </w:pPr>
       <w:r>
         <w:rPr>
           <w:rFonts w:ascii="Calibri" w:hAnsi="Calibri"/>
@@ -2083,6 +3664,8 @@
     <w:p>
       <w:pPr>
         <w:pStyle w:val="Heading1"/>
+        <w:keepNext w:val="0"/>
+        <w:jc w:val="left"/>
       </w:pPr>
       <w:r>
         <w:rPr>
@@ -2093,6 +3676,9 @@
       </w:r>
     </w:p>
     <w:p>
+      <w:pPr>
+        <w:jc w:val="left"/>
+      </w:pPr>
       <w:r>
         <w:rPr>
           <w:rFonts w:ascii="Calibri" w:hAnsi="Calibri"/>
@@ -2172,6 +3758,8 @@
     <w:p>
       <w:pPr>
         <w:pStyle w:val="Heading1"/>
+        <w:keepNext w:val="0"/>
+        <w:jc w:val="left"/>
       </w:pPr>
       <w:r>
         <w:rPr>
@@ -2183,7 +3771,9 @@
     </w:p>
     <w:p>
       <w:pPr>
-        <w:spacing w:after="160" w:line="280" w:lineRule="auto"/>
+        <w:spacing w:after="80" w:line="264" w:lineRule="auto"/>
+        <w:ind w:left="720" w:hanging="360"/>
+        <w:jc w:val="left"/>
         <w:numPr>
           <w:ilvl w:val="0"/>
           <w:numId w:val="11"/>
@@ -2199,7 +3789,9 @@
     </w:p>
     <w:p>
       <w:pPr>
-        <w:spacing w:after="160" w:line="280" w:lineRule="auto"/>
+        <w:spacing w:after="80" w:line="264" w:lineRule="auto"/>
+        <w:ind w:left="720" w:hanging="360"/>
+        <w:jc w:val="left"/>
         <w:numPr>
           <w:ilvl w:val="0"/>
           <w:numId w:val="11"/>
@@ -2215,7 +3807,9 @@
     </w:p>
     <w:p>
       <w:pPr>
-        <w:spacing w:after="160" w:line="280" w:lineRule="auto"/>
+        <w:spacing w:after="80" w:line="264" w:lineRule="auto"/>
+        <w:ind w:left="720" w:hanging="360"/>
+        <w:jc w:val="left"/>
         <w:numPr>
           <w:ilvl w:val="0"/>
           <w:numId w:val="11"/>
@@ -2231,7 +3825,9 @@
     </w:p>
     <w:p>
       <w:pPr>
-        <w:spacing w:after="160" w:line="280" w:lineRule="auto"/>
+        <w:spacing w:after="80" w:line="264" w:lineRule="auto"/>
+        <w:ind w:left="720" w:hanging="360"/>
+        <w:jc w:val="left"/>
         <w:numPr>
           <w:ilvl w:val="0"/>
           <w:numId w:val="11"/>
@@ -2247,7 +3843,9 @@
     </w:p>
     <w:p>
       <w:pPr>
-        <w:spacing w:after="160" w:line="280" w:lineRule="auto"/>
+        <w:spacing w:after="80" w:line="264" w:lineRule="auto"/>
+        <w:ind w:left="720" w:hanging="360"/>
+        <w:jc w:val="left"/>
         <w:numPr>
           <w:ilvl w:val="0"/>
           <w:numId w:val="11"/>
@@ -2263,7 +3861,9 @@
     </w:p>
     <w:p>
       <w:pPr>
-        <w:spacing w:after="160" w:line="280" w:lineRule="auto"/>
+        <w:spacing w:after="80" w:line="264" w:lineRule="auto"/>
+        <w:ind w:left="720" w:hanging="360"/>
+        <w:jc w:val="left"/>
         <w:numPr>
           <w:ilvl w:val="0"/>
           <w:numId w:val="11"/>
@@ -2279,7 +3879,9 @@
     </w:p>
     <w:p>
       <w:pPr>
-        <w:spacing w:after="160" w:line="280" w:lineRule="auto"/>
+        <w:spacing w:after="80" w:line="264" w:lineRule="auto"/>
+        <w:ind w:left="720" w:hanging="360"/>
+        <w:jc w:val="left"/>
         <w:numPr>
           <w:ilvl w:val="0"/>
           <w:numId w:val="11"/>
@@ -2295,7 +3897,9 @@
     </w:p>
     <w:p>
       <w:pPr>
-        <w:spacing w:after="160" w:line="280" w:lineRule="auto"/>
+        <w:spacing w:after="80" w:line="264" w:lineRule="auto"/>
+        <w:ind w:left="720" w:hanging="360"/>
+        <w:jc w:val="left"/>
         <w:numPr>
           <w:ilvl w:val="0"/>
           <w:numId w:val="11"/>
@@ -2311,7 +3915,9 @@
     </w:p>
     <w:p>
       <w:pPr>
-        <w:spacing w:after="160" w:line="280" w:lineRule="auto"/>
+        <w:spacing w:after="80" w:line="264" w:lineRule="auto"/>
+        <w:ind w:left="720" w:hanging="360"/>
+        <w:jc w:val="left"/>
         <w:numPr>
           <w:ilvl w:val="0"/>
           <w:numId w:val="11"/>
@@ -2327,7 +3933,9 @@
     </w:p>
     <w:p>
       <w:pPr>
-        <w:spacing w:after="160" w:line="280" w:lineRule="auto"/>
+        <w:spacing w:after="80" w:line="264" w:lineRule="auto"/>
+        <w:ind w:left="720" w:hanging="360"/>
+        <w:jc w:val="left"/>
         <w:numPr>
           <w:ilvl w:val="0"/>
           <w:numId w:val="11"/>
@@ -2342,6 +3950,9 @@
       </w:r>
     </w:p>
     <w:p>
+      <w:pPr>
+        <w:jc w:val="left"/>
+      </w:pPr>
       <w:r>
         <w:rPr>
           <w:rFonts w:ascii="Calibri" w:hAnsi="Calibri"/>
@@ -2875,9 +4486,10 @@
     <w:qFormat/>
     <w:rsid w:val="00FC693F"/>
     <w:pPr>
-      <w:keepNext/>
+      <w:keepNext w:val="0"/>
       <w:keepLines/>
       <w:spacing w:before="320" w:after="160"/>
+      <w:jc w:val="left"/>
       <w:outlineLvl w:val="0"/>
     </w:pPr>
     <w:rPr>
@@ -2899,9 +4511,10 @@
     <w:qFormat/>
     <w:rsid w:val="00FC693F"/>
     <w:pPr>
-      <w:keepNext/>
+      <w:keepNext w:val="0"/>
       <w:keepLines/>
       <w:spacing w:before="240" w:after="120"/>
+      <w:jc w:val="left"/>
       <w:outlineLvl w:val="1"/>
     </w:pPr>
     <w:rPr>
@@ -2923,9 +4536,10 @@
     <w:qFormat/>
     <w:rsid w:val="00FC693F"/>
     <w:pPr>
-      <w:keepNext/>
+      <w:keepNext w:val="0"/>
       <w:keepLines/>
       <w:spacing w:before="160" w:after="80"/>
+      <w:jc w:val="left"/>
       <w:outlineLvl w:val="2"/>
     </w:pPr>
     <w:rPr>

</xml_diff>

<commit_message>
Add reproducibility and final-run safeguards
</commit_message>
<xml_diff>
--- a/conference_package/generated/Conference_Manuscript_Development_Draft.docx
+++ b/conference_package/generated/Conference_Manuscript_Development_Draft.docx
@@ -79,12 +79,25 @@
           <w:color w:val="667085"/>
           <w:sz w:val="20"/>
         </w:rPr>
-        <w:t>Evidence cutoff: 24 August 2026</w:t>
+        <w:t>Evidence cutoff: 29 August 2026</w:t>
       </w:r>
     </w:p>
     <w:p>
       <w:r>
         <w:br w:type="page"/>
+      </w:r>
+    </w:p>
+    <w:p>
+      <w:pPr>
+        <w:spacing w:after="20"/>
+      </w:pPr>
+      <w:r>
+        <w:rPr>
+          <w:rFonts w:ascii="Calibri" w:hAnsi="Calibri"/>
+          <w:color w:val="FFFFFF"/>
+          <w:sz w:val="4"/>
+        </w:rPr>
+        <w:t xml:space="preserve"> </w:t>
       </w:r>
     </w:p>
     <w:p>
@@ -178,7 +191,7 @@
           <w:rFonts w:ascii="Calibri" w:hAnsi="Calibri"/>
           <w:color w:val="000000"/>
         </w:rPr>
-        <w:t xml:space="preserve"> In the completed full-budget PIDD development study (768 participants; 5 repeats x 5 outer folds), calibrated fixed-threshold AUROC ranged from 0.835 to 0.841 and Brier score from 0.154 to 0.157 across the five model families. CatBoost had the lowest mean Brier score (0.154), but model differences were small. For the full panel, the availability router achieved participant-level AUROC 0.843 and Brier score 0.152; the robust fixed-model baseline achieved AUROC 0.843 and Brier score 0.152. No reduced-panel comparison survived metric-wise Holm correction in the matched contrast family. At 70% coverage, probability-certainty selection reduced full-panel router Brier score from 0.152 to 0.110 but retained only 55.6% of positive events, demonstrating a clinically important coverage trade-off. With 75% simulated feature dropout, supported-panel coverage fell to approximately 4.8%-6.6%, while Brier score rose to approximately 0.208-0.211 for Random Forest and XGBoost. In the grouped Sylhet development study (520 participants; 5 x 5 outer folds), CatBoost achieved AUROC 0.968, average precision 0.982, and Brier score 0.066, but a calibration slope of 12.65 indicated instability. The full-panel router achieved AUROC 0.965 and Brier 0.068 versus 0.960 and 0.077 for the robust fixed baseline, without a corrected significance claim. Across 32 Sylhet panel-specific-training contrasts, no comparison survived Holm correction (minimum adjusted p=0.064). BRFSS scientific estimates remain pending because the next full-sample holdout is the protected, one-time final evaluation and cannot be accessed before protocol freeze and authorization.</w:t>
+        <w:t xml:space="preserve"> In the completed full-budget PIDD development study (768 participants; 5 repeats x 5 outer folds), calibrated fixed-threshold AUROC ranged from 0.835 to 0.841 and Brier score from 0.154 to 0.157 across the five model families. CatBoost had the lowest mean Brier score (0.154), but model differences were small. For the full panel, the availability router achieved participant-level AUROC 0.843 and Brier score 0.152; the robust fixed-model baseline achieved AUROC 0.843 and Brier score 0.152. No reduced-panel comparison survived metric-wise Holm correction in the matched contrast family. At 70% coverage, probability-certainty selection reduced full-panel router Brier score from 0.152 to 0.110 but retained only 55.6% of positive events, demonstrating a clinically important coverage trade-off. With 75% simulated feature dropout, supported-panel coverage fell to approximately 4.8%-6.6%, while Brier score rose to approximately 0.208-0.211 for Random Forest and XGBoost. In the grouped Sylhet development study (520 participants; 5 x 5 outer folds), CatBoost achieved AUROC 0.968, average precision 0.982, and Brier score 0.066, but a calibration slope of 12.65 indicated instability. The full-panel router achieved AUROC 0.965 and Brier 0.068 versus 0.960 and 0.077 for the robust fixed baseline, without a corrected significance claim. Across 32 Sylhet panel-specific-training contrasts, no comparison survived Holm correction (minimum adjusted p=0.064). The full BRFSS development study used 343,488 development and 85,872 development-test respondents. XGBoost, CatBoost, and LightGBM had nearly identical calibrated AUROC (0.843) and Brier score (0.0915); none of their pairwise differences was Holm-significant. The development-selected LightGBM champion was retained even though XGBoost had the numerically lowest test Brier score. Survey weighting changed prevalence from 13.3% to 10.9% and increased XGBoost AUROC from 0.843 to 0.871, showing that sample-conditional and population-weighted estimands are not interchangeable.</w:t>
       </w:r>
     </w:p>
     <w:p>
@@ -3558,7 +3571,7 @@
           <w:rFonts w:ascii="Calibri" w:hAnsi="Calibri"/>
           <w:color w:val="000000"/>
         </w:rPr>
-        <w:t>3.6 Pending locked BRFSS estimate</w:t>
+        <w:t>3.6 Full BRFSS development results</w:t>
       </w:r>
     </w:p>
     <w:p>
@@ -3570,7 +3583,1441 @@
           <w:rFonts w:ascii="Calibri" w:hAnsi="Calibri"/>
           <w:color w:val="000000"/>
         </w:rPr>
-        <w:t>Existing BRFSS smoke studies remain engineering evidence and are not promoted into the main result table. The next full-sample BRFSS holdout is deliberately reserved for a new concealed manifest and one authorized final execution after protocol freeze. Hospital130 remains outside the diabetes-screening result family because its endpoint is 30-day readmission.</w:t>
+        <w:t xml:space="preserve">The full BRFSS development study </w:t>
+      </w:r>
+      <w:r>
+        <w:rPr>
+          <w:rFonts w:ascii="Aptos Mono" w:hAnsi="Aptos Mono"/>
+          <w:color w:val="1F4D78"/>
+        </w:rPr>
+        <w:t>brfss_development_holdout_56407ef53bba</w:t>
+      </w:r>
+      <w:r>
+        <w:rPr>
+          <w:rFonts w:ascii="Calibri" w:hAnsi="Calibri"/>
+          <w:color w:val="000000"/>
+        </w:rPr>
+        <w:t xml:space="preserve"> used all 429,360 retained respondents: 343,488 for five-fold development tuning and cross-fitted selection and 85,872 in the pre-existing seed-42 development test role (11,451 positives; prevalence 13.3%). This partition had already been inspected and is permanently ineligible as a concealed final test. All model, calibration, threshold, and champion choices were locked from development data before test prediction.</w:t>
+      </w:r>
+    </w:p>
+    <w:p>
+      <w:pPr>
+        <w:jc w:val="left"/>
+      </w:pPr>
+      <w:r>
+        <w:rPr>
+          <w:rFonts w:ascii="Calibri" w:hAnsi="Calibri"/>
+          <w:b/>
+          <w:color w:val="000000"/>
+        </w:rPr>
+        <w:t>Table 3. BRFSS calibrated full-development performance on the development test partition</w:t>
+      </w:r>
+    </w:p>
+    <w:tbl>
+      <w:tblPr>
+        <w:tblStyle w:val="TableGrid"/>
+        <w:tblW w:type="dxa" w:w="9360"/>
+        <w:jc w:val="left"/>
+        <w:tblLayout w:type="fixed"/>
+        <w:tblLook w:firstColumn="1" w:firstRow="1" w:lastColumn="0" w:lastRow="0" w:noHBand="0" w:noVBand="1" w:val="04A0"/>
+        <w:tblInd w:w="120" w:type="dxa"/>
+      </w:tblPr>
+      <w:tblGrid>
+        <w:gridCol w:w="1800"/>
+        <w:gridCol w:w="1260"/>
+        <w:gridCol w:w="1260"/>
+        <w:gridCol w:w="1260"/>
+        <w:gridCol w:w="1260"/>
+        <w:gridCol w:w="1260"/>
+        <w:gridCol w:w="1260"/>
+      </w:tblGrid>
+      <w:tr>
+        <w:trPr>
+          <w:tblHeader w:val="true"/>
+          <w:cantSplit w:val="true"/>
+        </w:trPr>
+        <w:tc>
+          <w:tcPr>
+            <w:tcW w:type="dxa" w:w="1800"/>
+            <w:tcMar>
+              <w:top w:w="80" w:type="dxa"/>
+              <w:start w:w="120" w:type="dxa"/>
+              <w:bottom w:w="80" w:type="dxa"/>
+              <w:end w:w="120" w:type="dxa"/>
+            </w:tcMar>
+            <w:vAlign w:val="center"/>
+            <w:shd w:fill="1F4D78"/>
+          </w:tcPr>
+          <w:p>
+            <w:pPr>
+              <w:pStyle w:val="TableText"/>
+              <w:jc w:val="center"/>
+            </w:pPr>
+            <w:r/>
+            <w:r>
+              <w:rPr>
+                <w:rFonts w:ascii="Calibri" w:hAnsi="Calibri"/>
+                <w:b/>
+                <w:color w:val="FFFFFF"/>
+                <w:sz w:val="17"/>
+              </w:rPr>
+              <w:t>Model</w:t>
+            </w:r>
+          </w:p>
+        </w:tc>
+        <w:tc>
+          <w:tcPr>
+            <w:tcW w:type="dxa" w:w="1260"/>
+            <w:tcMar>
+              <w:top w:w="80" w:type="dxa"/>
+              <w:start w:w="120" w:type="dxa"/>
+              <w:bottom w:w="80" w:type="dxa"/>
+              <w:end w:w="120" w:type="dxa"/>
+            </w:tcMar>
+            <w:vAlign w:val="center"/>
+            <w:shd w:fill="1F4D78"/>
+          </w:tcPr>
+          <w:p>
+            <w:pPr>
+              <w:pStyle w:val="TableText"/>
+              <w:jc w:val="center"/>
+            </w:pPr>
+            <w:r/>
+            <w:r>
+              <w:rPr>
+                <w:rFonts w:ascii="Calibri" w:hAnsi="Calibri"/>
+                <w:b/>
+                <w:color w:val="FFFFFF"/>
+                <w:sz w:val="17"/>
+              </w:rPr>
+              <w:t>AUROC</w:t>
+            </w:r>
+          </w:p>
+        </w:tc>
+        <w:tc>
+          <w:tcPr>
+            <w:tcW w:type="dxa" w:w="1260"/>
+            <w:tcMar>
+              <w:top w:w="80" w:type="dxa"/>
+              <w:start w:w="120" w:type="dxa"/>
+              <w:bottom w:w="80" w:type="dxa"/>
+              <w:end w:w="120" w:type="dxa"/>
+            </w:tcMar>
+            <w:vAlign w:val="center"/>
+            <w:shd w:fill="1F4D78"/>
+          </w:tcPr>
+          <w:p>
+            <w:pPr>
+              <w:pStyle w:val="TableText"/>
+              <w:jc w:val="center"/>
+            </w:pPr>
+            <w:r/>
+            <w:r>
+              <w:rPr>
+                <w:rFonts w:ascii="Calibri" w:hAnsi="Calibri"/>
+                <w:b/>
+                <w:color w:val="FFFFFF"/>
+                <w:sz w:val="17"/>
+              </w:rPr>
+              <w:t>Average precision</w:t>
+            </w:r>
+          </w:p>
+        </w:tc>
+        <w:tc>
+          <w:tcPr>
+            <w:tcW w:type="dxa" w:w="1260"/>
+            <w:tcMar>
+              <w:top w:w="80" w:type="dxa"/>
+              <w:start w:w="120" w:type="dxa"/>
+              <w:bottom w:w="80" w:type="dxa"/>
+              <w:end w:w="120" w:type="dxa"/>
+            </w:tcMar>
+            <w:vAlign w:val="center"/>
+            <w:shd w:fill="1F4D78"/>
+          </w:tcPr>
+          <w:p>
+            <w:pPr>
+              <w:pStyle w:val="TableText"/>
+              <w:jc w:val="center"/>
+            </w:pPr>
+            <w:r/>
+            <w:r>
+              <w:rPr>
+                <w:rFonts w:ascii="Calibri" w:hAnsi="Calibri"/>
+                <w:b/>
+                <w:color w:val="FFFFFF"/>
+                <w:sz w:val="17"/>
+              </w:rPr>
+              <w:t>Brier</w:t>
+            </w:r>
+          </w:p>
+        </w:tc>
+        <w:tc>
+          <w:tcPr>
+            <w:tcW w:type="dxa" w:w="1260"/>
+            <w:tcMar>
+              <w:top w:w="80" w:type="dxa"/>
+              <w:start w:w="120" w:type="dxa"/>
+              <w:bottom w:w="80" w:type="dxa"/>
+              <w:end w:w="120" w:type="dxa"/>
+            </w:tcMar>
+            <w:vAlign w:val="center"/>
+            <w:shd w:fill="1F4D78"/>
+          </w:tcPr>
+          <w:p>
+            <w:pPr>
+              <w:pStyle w:val="TableText"/>
+              <w:jc w:val="center"/>
+            </w:pPr>
+            <w:r/>
+            <w:r>
+              <w:rPr>
+                <w:rFonts w:ascii="Calibri" w:hAnsi="Calibri"/>
+                <w:b/>
+                <w:color w:val="FFFFFF"/>
+                <w:sz w:val="17"/>
+              </w:rPr>
+              <w:t>Log loss</w:t>
+            </w:r>
+          </w:p>
+        </w:tc>
+        <w:tc>
+          <w:tcPr>
+            <w:tcW w:type="dxa" w:w="1260"/>
+            <w:tcMar>
+              <w:top w:w="80" w:type="dxa"/>
+              <w:start w:w="120" w:type="dxa"/>
+              <w:bottom w:w="80" w:type="dxa"/>
+              <w:end w:w="120" w:type="dxa"/>
+            </w:tcMar>
+            <w:vAlign w:val="center"/>
+            <w:shd w:fill="1F4D78"/>
+          </w:tcPr>
+          <w:p>
+            <w:pPr>
+              <w:pStyle w:val="TableText"/>
+              <w:jc w:val="center"/>
+            </w:pPr>
+            <w:r/>
+            <w:r>
+              <w:rPr>
+                <w:rFonts w:ascii="Calibri" w:hAnsi="Calibri"/>
+                <w:b/>
+                <w:color w:val="FFFFFF"/>
+                <w:sz w:val="17"/>
+              </w:rPr>
+              <w:t>Calibration slope</w:t>
+            </w:r>
+          </w:p>
+        </w:tc>
+        <w:tc>
+          <w:tcPr>
+            <w:tcW w:type="dxa" w:w="1260"/>
+            <w:tcMar>
+              <w:top w:w="80" w:type="dxa"/>
+              <w:start w:w="120" w:type="dxa"/>
+              <w:bottom w:w="80" w:type="dxa"/>
+              <w:end w:w="120" w:type="dxa"/>
+            </w:tcMar>
+            <w:vAlign w:val="center"/>
+            <w:shd w:fill="1F4D78"/>
+          </w:tcPr>
+          <w:p>
+            <w:pPr>
+              <w:pStyle w:val="TableText"/>
+              <w:jc w:val="center"/>
+            </w:pPr>
+            <w:r/>
+            <w:r>
+              <w:rPr>
+                <w:rFonts w:ascii="Calibri" w:hAnsi="Calibri"/>
+                <w:b/>
+                <w:color w:val="FFFFFF"/>
+                <w:sz w:val="17"/>
+              </w:rPr>
+              <w:t>ECE</w:t>
+            </w:r>
+          </w:p>
+        </w:tc>
+      </w:tr>
+      <w:tr>
+        <w:trPr>
+          <w:cantSplit w:val="true"/>
+        </w:trPr>
+        <w:tc>
+          <w:tcPr>
+            <w:tcW w:type="dxa" w:w="1800"/>
+            <w:tcMar>
+              <w:top w:w="80" w:type="dxa"/>
+              <w:start w:w="120" w:type="dxa"/>
+              <w:bottom w:w="80" w:type="dxa"/>
+              <w:end w:w="120" w:type="dxa"/>
+            </w:tcMar>
+            <w:vAlign w:val="center"/>
+          </w:tcPr>
+          <w:p>
+            <w:pPr>
+              <w:pStyle w:val="TableText"/>
+              <w:jc w:val="left"/>
+            </w:pPr>
+            <w:r/>
+            <w:r>
+              <w:rPr>
+                <w:rFonts w:ascii="Calibri" w:hAnsi="Calibri"/>
+                <w:b w:val="0"/>
+                <w:color w:val="000000"/>
+                <w:sz w:val="17"/>
+              </w:rPr>
+              <w:t>XGBoost</w:t>
+            </w:r>
+          </w:p>
+        </w:tc>
+        <w:tc>
+          <w:tcPr>
+            <w:tcW w:type="dxa" w:w="1260"/>
+            <w:tcMar>
+              <w:top w:w="80" w:type="dxa"/>
+              <w:start w:w="120" w:type="dxa"/>
+              <w:bottom w:w="80" w:type="dxa"/>
+              <w:end w:w="120" w:type="dxa"/>
+            </w:tcMar>
+            <w:vAlign w:val="center"/>
+          </w:tcPr>
+          <w:p>
+            <w:pPr>
+              <w:pStyle w:val="TableText"/>
+              <w:jc w:val="center"/>
+            </w:pPr>
+            <w:r/>
+            <w:r>
+              <w:rPr>
+                <w:rFonts w:ascii="Calibri" w:hAnsi="Calibri"/>
+                <w:b w:val="0"/>
+                <w:color w:val="000000"/>
+                <w:sz w:val="17"/>
+              </w:rPr>
+              <w:t>0.843</w:t>
+            </w:r>
+          </w:p>
+        </w:tc>
+        <w:tc>
+          <w:tcPr>
+            <w:tcW w:type="dxa" w:w="1260"/>
+            <w:tcMar>
+              <w:top w:w="80" w:type="dxa"/>
+              <w:start w:w="120" w:type="dxa"/>
+              <w:bottom w:w="80" w:type="dxa"/>
+              <w:end w:w="120" w:type="dxa"/>
+            </w:tcMar>
+            <w:vAlign w:val="center"/>
+          </w:tcPr>
+          <w:p>
+            <w:pPr>
+              <w:pStyle w:val="TableText"/>
+              <w:jc w:val="center"/>
+            </w:pPr>
+            <w:r/>
+            <w:r>
+              <w:rPr>
+                <w:rFonts w:ascii="Calibri" w:hAnsi="Calibri"/>
+                <w:b w:val="0"/>
+                <w:color w:val="000000"/>
+                <w:sz w:val="17"/>
+              </w:rPr>
+              <w:t>0.444</w:t>
+            </w:r>
+          </w:p>
+        </w:tc>
+        <w:tc>
+          <w:tcPr>
+            <w:tcW w:type="dxa" w:w="1260"/>
+            <w:tcMar>
+              <w:top w:w="80" w:type="dxa"/>
+              <w:start w:w="120" w:type="dxa"/>
+              <w:bottom w:w="80" w:type="dxa"/>
+              <w:end w:w="120" w:type="dxa"/>
+            </w:tcMar>
+            <w:vAlign w:val="center"/>
+          </w:tcPr>
+          <w:p>
+            <w:pPr>
+              <w:pStyle w:val="TableText"/>
+              <w:jc w:val="center"/>
+            </w:pPr>
+            <w:r/>
+            <w:r>
+              <w:rPr>
+                <w:rFonts w:ascii="Calibri" w:hAnsi="Calibri"/>
+                <w:b w:val="0"/>
+                <w:color w:val="000000"/>
+                <w:sz w:val="17"/>
+              </w:rPr>
+              <w:t>0.0915</w:t>
+            </w:r>
+          </w:p>
+        </w:tc>
+        <w:tc>
+          <w:tcPr>
+            <w:tcW w:type="dxa" w:w="1260"/>
+            <w:tcMar>
+              <w:top w:w="80" w:type="dxa"/>
+              <w:start w:w="120" w:type="dxa"/>
+              <w:bottom w:w="80" w:type="dxa"/>
+              <w:end w:w="120" w:type="dxa"/>
+            </w:tcMar>
+            <w:vAlign w:val="center"/>
+          </w:tcPr>
+          <w:p>
+            <w:pPr>
+              <w:pStyle w:val="TableText"/>
+              <w:jc w:val="center"/>
+            </w:pPr>
+            <w:r/>
+            <w:r>
+              <w:rPr>
+                <w:rFonts w:ascii="Calibri" w:hAnsi="Calibri"/>
+                <w:b w:val="0"/>
+                <w:color w:val="000000"/>
+                <w:sz w:val="17"/>
+              </w:rPr>
+              <w:t>0.2958</w:t>
+            </w:r>
+          </w:p>
+        </w:tc>
+        <w:tc>
+          <w:tcPr>
+            <w:tcW w:type="dxa" w:w="1260"/>
+            <w:tcMar>
+              <w:top w:w="80" w:type="dxa"/>
+              <w:start w:w="120" w:type="dxa"/>
+              <w:bottom w:w="80" w:type="dxa"/>
+              <w:end w:w="120" w:type="dxa"/>
+            </w:tcMar>
+            <w:vAlign w:val="center"/>
+          </w:tcPr>
+          <w:p>
+            <w:pPr>
+              <w:pStyle w:val="TableText"/>
+              <w:jc w:val="center"/>
+            </w:pPr>
+            <w:r/>
+            <w:r>
+              <w:rPr>
+                <w:rFonts w:ascii="Calibri" w:hAnsi="Calibri"/>
+                <w:b w:val="0"/>
+                <w:color w:val="000000"/>
+                <w:sz w:val="17"/>
+              </w:rPr>
+              <w:t>1.008</w:t>
+            </w:r>
+          </w:p>
+        </w:tc>
+        <w:tc>
+          <w:tcPr>
+            <w:tcW w:type="dxa" w:w="1260"/>
+            <w:tcMar>
+              <w:top w:w="80" w:type="dxa"/>
+              <w:start w:w="120" w:type="dxa"/>
+              <w:bottom w:w="80" w:type="dxa"/>
+              <w:end w:w="120" w:type="dxa"/>
+            </w:tcMar>
+            <w:vAlign w:val="center"/>
+          </w:tcPr>
+          <w:p>
+            <w:pPr>
+              <w:pStyle w:val="TableText"/>
+              <w:jc w:val="center"/>
+            </w:pPr>
+            <w:r/>
+            <w:r>
+              <w:rPr>
+                <w:rFonts w:ascii="Calibri" w:hAnsi="Calibri"/>
+                <w:b w:val="0"/>
+                <w:color w:val="000000"/>
+                <w:sz w:val="17"/>
+              </w:rPr>
+              <w:t>0.0023</w:t>
+            </w:r>
+          </w:p>
+        </w:tc>
+      </w:tr>
+      <w:tr>
+        <w:trPr>
+          <w:cantSplit w:val="true"/>
+        </w:trPr>
+        <w:tc>
+          <w:tcPr>
+            <w:tcW w:type="dxa" w:w="1800"/>
+            <w:tcMar>
+              <w:top w:w="80" w:type="dxa"/>
+              <w:start w:w="120" w:type="dxa"/>
+              <w:bottom w:w="80" w:type="dxa"/>
+              <w:end w:w="120" w:type="dxa"/>
+            </w:tcMar>
+            <w:vAlign w:val="center"/>
+          </w:tcPr>
+          <w:p>
+            <w:pPr>
+              <w:pStyle w:val="TableText"/>
+              <w:jc w:val="left"/>
+            </w:pPr>
+            <w:r/>
+            <w:r>
+              <w:rPr>
+                <w:rFonts w:ascii="Calibri" w:hAnsi="Calibri"/>
+                <w:b w:val="0"/>
+                <w:color w:val="000000"/>
+                <w:sz w:val="17"/>
+              </w:rPr>
+              <w:t>CatBoost</w:t>
+            </w:r>
+          </w:p>
+        </w:tc>
+        <w:tc>
+          <w:tcPr>
+            <w:tcW w:type="dxa" w:w="1260"/>
+            <w:tcMar>
+              <w:top w:w="80" w:type="dxa"/>
+              <w:start w:w="120" w:type="dxa"/>
+              <w:bottom w:w="80" w:type="dxa"/>
+              <w:end w:w="120" w:type="dxa"/>
+            </w:tcMar>
+            <w:vAlign w:val="center"/>
+          </w:tcPr>
+          <w:p>
+            <w:pPr>
+              <w:pStyle w:val="TableText"/>
+              <w:jc w:val="center"/>
+            </w:pPr>
+            <w:r/>
+            <w:r>
+              <w:rPr>
+                <w:rFonts w:ascii="Calibri" w:hAnsi="Calibri"/>
+                <w:b w:val="0"/>
+                <w:color w:val="000000"/>
+                <w:sz w:val="17"/>
+              </w:rPr>
+              <w:t>0.843</w:t>
+            </w:r>
+          </w:p>
+        </w:tc>
+        <w:tc>
+          <w:tcPr>
+            <w:tcW w:type="dxa" w:w="1260"/>
+            <w:tcMar>
+              <w:top w:w="80" w:type="dxa"/>
+              <w:start w:w="120" w:type="dxa"/>
+              <w:bottom w:w="80" w:type="dxa"/>
+              <w:end w:w="120" w:type="dxa"/>
+            </w:tcMar>
+            <w:vAlign w:val="center"/>
+          </w:tcPr>
+          <w:p>
+            <w:pPr>
+              <w:pStyle w:val="TableText"/>
+              <w:jc w:val="center"/>
+            </w:pPr>
+            <w:r/>
+            <w:r>
+              <w:rPr>
+                <w:rFonts w:ascii="Calibri" w:hAnsi="Calibri"/>
+                <w:b w:val="0"/>
+                <w:color w:val="000000"/>
+                <w:sz w:val="17"/>
+              </w:rPr>
+              <w:t>0.442</w:t>
+            </w:r>
+          </w:p>
+        </w:tc>
+        <w:tc>
+          <w:tcPr>
+            <w:tcW w:type="dxa" w:w="1260"/>
+            <w:tcMar>
+              <w:top w:w="80" w:type="dxa"/>
+              <w:start w:w="120" w:type="dxa"/>
+              <w:bottom w:w="80" w:type="dxa"/>
+              <w:end w:w="120" w:type="dxa"/>
+            </w:tcMar>
+            <w:vAlign w:val="center"/>
+          </w:tcPr>
+          <w:p>
+            <w:pPr>
+              <w:pStyle w:val="TableText"/>
+              <w:jc w:val="center"/>
+            </w:pPr>
+            <w:r/>
+            <w:r>
+              <w:rPr>
+                <w:rFonts w:ascii="Calibri" w:hAnsi="Calibri"/>
+                <w:b w:val="0"/>
+                <w:color w:val="000000"/>
+                <w:sz w:val="17"/>
+              </w:rPr>
+              <w:t>0.0915</w:t>
+            </w:r>
+          </w:p>
+        </w:tc>
+        <w:tc>
+          <w:tcPr>
+            <w:tcW w:type="dxa" w:w="1260"/>
+            <w:tcMar>
+              <w:top w:w="80" w:type="dxa"/>
+              <w:start w:w="120" w:type="dxa"/>
+              <w:bottom w:w="80" w:type="dxa"/>
+              <w:end w:w="120" w:type="dxa"/>
+            </w:tcMar>
+            <w:vAlign w:val="center"/>
+          </w:tcPr>
+          <w:p>
+            <w:pPr>
+              <w:pStyle w:val="TableText"/>
+              <w:jc w:val="center"/>
+            </w:pPr>
+            <w:r/>
+            <w:r>
+              <w:rPr>
+                <w:rFonts w:ascii="Calibri" w:hAnsi="Calibri"/>
+                <w:b w:val="0"/>
+                <w:color w:val="000000"/>
+                <w:sz w:val="17"/>
+              </w:rPr>
+              <w:t>0.2958</w:t>
+            </w:r>
+          </w:p>
+        </w:tc>
+        <w:tc>
+          <w:tcPr>
+            <w:tcW w:type="dxa" w:w="1260"/>
+            <w:tcMar>
+              <w:top w:w="80" w:type="dxa"/>
+              <w:start w:w="120" w:type="dxa"/>
+              <w:bottom w:w="80" w:type="dxa"/>
+              <w:end w:w="120" w:type="dxa"/>
+            </w:tcMar>
+            <w:vAlign w:val="center"/>
+          </w:tcPr>
+          <w:p>
+            <w:pPr>
+              <w:pStyle w:val="TableText"/>
+              <w:jc w:val="center"/>
+            </w:pPr>
+            <w:r/>
+            <w:r>
+              <w:rPr>
+                <w:rFonts w:ascii="Calibri" w:hAnsi="Calibri"/>
+                <w:b w:val="0"/>
+                <w:color w:val="000000"/>
+                <w:sz w:val="17"/>
+              </w:rPr>
+              <w:t>1.008</w:t>
+            </w:r>
+          </w:p>
+        </w:tc>
+        <w:tc>
+          <w:tcPr>
+            <w:tcW w:type="dxa" w:w="1260"/>
+            <w:tcMar>
+              <w:top w:w="80" w:type="dxa"/>
+              <w:start w:w="120" w:type="dxa"/>
+              <w:bottom w:w="80" w:type="dxa"/>
+              <w:end w:w="120" w:type="dxa"/>
+            </w:tcMar>
+            <w:vAlign w:val="center"/>
+          </w:tcPr>
+          <w:p>
+            <w:pPr>
+              <w:pStyle w:val="TableText"/>
+              <w:jc w:val="center"/>
+            </w:pPr>
+            <w:r/>
+            <w:r>
+              <w:rPr>
+                <w:rFonts w:ascii="Calibri" w:hAnsi="Calibri"/>
+                <w:b w:val="0"/>
+                <w:color w:val="000000"/>
+                <w:sz w:val="17"/>
+              </w:rPr>
+              <w:t>0.0018</w:t>
+            </w:r>
+          </w:p>
+        </w:tc>
+      </w:tr>
+      <w:tr>
+        <w:trPr>
+          <w:cantSplit w:val="true"/>
+        </w:trPr>
+        <w:tc>
+          <w:tcPr>
+            <w:tcW w:type="dxa" w:w="1800"/>
+            <w:tcMar>
+              <w:top w:w="80" w:type="dxa"/>
+              <w:start w:w="120" w:type="dxa"/>
+              <w:bottom w:w="80" w:type="dxa"/>
+              <w:end w:w="120" w:type="dxa"/>
+            </w:tcMar>
+            <w:vAlign w:val="center"/>
+          </w:tcPr>
+          <w:p>
+            <w:pPr>
+              <w:pStyle w:val="TableText"/>
+              <w:jc w:val="left"/>
+            </w:pPr>
+            <w:r/>
+            <w:r>
+              <w:rPr>
+                <w:rFonts w:ascii="Calibri" w:hAnsi="Calibri"/>
+                <w:b w:val="0"/>
+                <w:color w:val="000000"/>
+                <w:sz w:val="17"/>
+              </w:rPr>
+              <w:t>LightGBM</w:t>
+            </w:r>
+          </w:p>
+        </w:tc>
+        <w:tc>
+          <w:tcPr>
+            <w:tcW w:type="dxa" w:w="1260"/>
+            <w:tcMar>
+              <w:top w:w="80" w:type="dxa"/>
+              <w:start w:w="120" w:type="dxa"/>
+              <w:bottom w:w="80" w:type="dxa"/>
+              <w:end w:w="120" w:type="dxa"/>
+            </w:tcMar>
+            <w:vAlign w:val="center"/>
+          </w:tcPr>
+          <w:p>
+            <w:pPr>
+              <w:pStyle w:val="TableText"/>
+              <w:jc w:val="center"/>
+            </w:pPr>
+            <w:r/>
+            <w:r>
+              <w:rPr>
+                <w:rFonts w:ascii="Calibri" w:hAnsi="Calibri"/>
+                <w:b w:val="0"/>
+                <w:color w:val="000000"/>
+                <w:sz w:val="17"/>
+              </w:rPr>
+              <w:t>0.843</w:t>
+            </w:r>
+          </w:p>
+        </w:tc>
+        <w:tc>
+          <w:tcPr>
+            <w:tcW w:type="dxa" w:w="1260"/>
+            <w:tcMar>
+              <w:top w:w="80" w:type="dxa"/>
+              <w:start w:w="120" w:type="dxa"/>
+              <w:bottom w:w="80" w:type="dxa"/>
+              <w:end w:w="120" w:type="dxa"/>
+            </w:tcMar>
+            <w:vAlign w:val="center"/>
+          </w:tcPr>
+          <w:p>
+            <w:pPr>
+              <w:pStyle w:val="TableText"/>
+              <w:jc w:val="center"/>
+            </w:pPr>
+            <w:r/>
+            <w:r>
+              <w:rPr>
+                <w:rFonts w:ascii="Calibri" w:hAnsi="Calibri"/>
+                <w:b w:val="0"/>
+                <w:color w:val="000000"/>
+                <w:sz w:val="17"/>
+              </w:rPr>
+              <w:t>0.443</w:t>
+            </w:r>
+          </w:p>
+        </w:tc>
+        <w:tc>
+          <w:tcPr>
+            <w:tcW w:type="dxa" w:w="1260"/>
+            <w:tcMar>
+              <w:top w:w="80" w:type="dxa"/>
+              <w:start w:w="120" w:type="dxa"/>
+              <w:bottom w:w="80" w:type="dxa"/>
+              <w:end w:w="120" w:type="dxa"/>
+            </w:tcMar>
+            <w:vAlign w:val="center"/>
+          </w:tcPr>
+          <w:p>
+            <w:pPr>
+              <w:pStyle w:val="TableText"/>
+              <w:jc w:val="center"/>
+            </w:pPr>
+            <w:r/>
+            <w:r>
+              <w:rPr>
+                <w:rFonts w:ascii="Calibri" w:hAnsi="Calibri"/>
+                <w:b w:val="0"/>
+                <w:color w:val="000000"/>
+                <w:sz w:val="17"/>
+              </w:rPr>
+              <w:t>0.0915</w:t>
+            </w:r>
+          </w:p>
+        </w:tc>
+        <w:tc>
+          <w:tcPr>
+            <w:tcW w:type="dxa" w:w="1260"/>
+            <w:tcMar>
+              <w:top w:w="80" w:type="dxa"/>
+              <w:start w:w="120" w:type="dxa"/>
+              <w:bottom w:w="80" w:type="dxa"/>
+              <w:end w:w="120" w:type="dxa"/>
+            </w:tcMar>
+            <w:vAlign w:val="center"/>
+          </w:tcPr>
+          <w:p>
+            <w:pPr>
+              <w:pStyle w:val="TableText"/>
+              <w:jc w:val="center"/>
+            </w:pPr>
+            <w:r/>
+            <w:r>
+              <w:rPr>
+                <w:rFonts w:ascii="Calibri" w:hAnsi="Calibri"/>
+                <w:b w:val="0"/>
+                <w:color w:val="000000"/>
+                <w:sz w:val="17"/>
+              </w:rPr>
+              <w:t>0.2960</w:t>
+            </w:r>
+          </w:p>
+        </w:tc>
+        <w:tc>
+          <w:tcPr>
+            <w:tcW w:type="dxa" w:w="1260"/>
+            <w:tcMar>
+              <w:top w:w="80" w:type="dxa"/>
+              <w:start w:w="120" w:type="dxa"/>
+              <w:bottom w:w="80" w:type="dxa"/>
+              <w:end w:w="120" w:type="dxa"/>
+            </w:tcMar>
+            <w:vAlign w:val="center"/>
+          </w:tcPr>
+          <w:p>
+            <w:pPr>
+              <w:pStyle w:val="TableText"/>
+              <w:jc w:val="center"/>
+            </w:pPr>
+            <w:r/>
+            <w:r>
+              <w:rPr>
+                <w:rFonts w:ascii="Calibri" w:hAnsi="Calibri"/>
+                <w:b w:val="0"/>
+                <w:color w:val="000000"/>
+                <w:sz w:val="17"/>
+              </w:rPr>
+              <w:t>1.016</w:t>
+            </w:r>
+          </w:p>
+        </w:tc>
+        <w:tc>
+          <w:tcPr>
+            <w:tcW w:type="dxa" w:w="1260"/>
+            <w:tcMar>
+              <w:top w:w="80" w:type="dxa"/>
+              <w:start w:w="120" w:type="dxa"/>
+              <w:bottom w:w="80" w:type="dxa"/>
+              <w:end w:w="120" w:type="dxa"/>
+            </w:tcMar>
+            <w:vAlign w:val="center"/>
+          </w:tcPr>
+          <w:p>
+            <w:pPr>
+              <w:pStyle w:val="TableText"/>
+              <w:jc w:val="center"/>
+            </w:pPr>
+            <w:r/>
+            <w:r>
+              <w:rPr>
+                <w:rFonts w:ascii="Calibri" w:hAnsi="Calibri"/>
+                <w:b w:val="0"/>
+                <w:color w:val="000000"/>
+                <w:sz w:val="17"/>
+              </w:rPr>
+              <w:t>0.0020</w:t>
+            </w:r>
+          </w:p>
+        </w:tc>
+      </w:tr>
+      <w:tr>
+        <w:trPr>
+          <w:cantSplit w:val="true"/>
+        </w:trPr>
+        <w:tc>
+          <w:tcPr>
+            <w:tcW w:type="dxa" w:w="1800"/>
+            <w:tcMar>
+              <w:top w:w="80" w:type="dxa"/>
+              <w:start w:w="120" w:type="dxa"/>
+              <w:bottom w:w="80" w:type="dxa"/>
+              <w:end w:w="120" w:type="dxa"/>
+            </w:tcMar>
+            <w:vAlign w:val="center"/>
+          </w:tcPr>
+          <w:p>
+            <w:pPr>
+              <w:pStyle w:val="TableText"/>
+              <w:jc w:val="left"/>
+            </w:pPr>
+            <w:r/>
+            <w:r>
+              <w:rPr>
+                <w:rFonts w:ascii="Calibri" w:hAnsi="Calibri"/>
+                <w:b w:val="0"/>
+                <w:color w:val="000000"/>
+                <w:sz w:val="17"/>
+              </w:rPr>
+              <w:t>Random Forest</w:t>
+            </w:r>
+          </w:p>
+        </w:tc>
+        <w:tc>
+          <w:tcPr>
+            <w:tcW w:type="dxa" w:w="1260"/>
+            <w:tcMar>
+              <w:top w:w="80" w:type="dxa"/>
+              <w:start w:w="120" w:type="dxa"/>
+              <w:bottom w:w="80" w:type="dxa"/>
+              <w:end w:w="120" w:type="dxa"/>
+            </w:tcMar>
+            <w:vAlign w:val="center"/>
+          </w:tcPr>
+          <w:p>
+            <w:pPr>
+              <w:pStyle w:val="TableText"/>
+              <w:jc w:val="center"/>
+            </w:pPr>
+            <w:r/>
+            <w:r>
+              <w:rPr>
+                <w:rFonts w:ascii="Calibri" w:hAnsi="Calibri"/>
+                <w:b w:val="0"/>
+                <w:color w:val="000000"/>
+                <w:sz w:val="17"/>
+              </w:rPr>
+              <w:t>0.840</w:t>
+            </w:r>
+          </w:p>
+        </w:tc>
+        <w:tc>
+          <w:tcPr>
+            <w:tcW w:type="dxa" w:w="1260"/>
+            <w:tcMar>
+              <w:top w:w="80" w:type="dxa"/>
+              <w:start w:w="120" w:type="dxa"/>
+              <w:bottom w:w="80" w:type="dxa"/>
+              <w:end w:w="120" w:type="dxa"/>
+            </w:tcMar>
+            <w:vAlign w:val="center"/>
+          </w:tcPr>
+          <w:p>
+            <w:pPr>
+              <w:pStyle w:val="TableText"/>
+              <w:jc w:val="center"/>
+            </w:pPr>
+            <w:r/>
+            <w:r>
+              <w:rPr>
+                <w:rFonts w:ascii="Calibri" w:hAnsi="Calibri"/>
+                <w:b w:val="0"/>
+                <w:color w:val="000000"/>
+                <w:sz w:val="17"/>
+              </w:rPr>
+              <w:t>0.437</w:t>
+            </w:r>
+          </w:p>
+        </w:tc>
+        <w:tc>
+          <w:tcPr>
+            <w:tcW w:type="dxa" w:w="1260"/>
+            <w:tcMar>
+              <w:top w:w="80" w:type="dxa"/>
+              <w:start w:w="120" w:type="dxa"/>
+              <w:bottom w:w="80" w:type="dxa"/>
+              <w:end w:w="120" w:type="dxa"/>
+            </w:tcMar>
+            <w:vAlign w:val="center"/>
+          </w:tcPr>
+          <w:p>
+            <w:pPr>
+              <w:pStyle w:val="TableText"/>
+              <w:jc w:val="center"/>
+            </w:pPr>
+            <w:r/>
+            <w:r>
+              <w:rPr>
+                <w:rFonts w:ascii="Calibri" w:hAnsi="Calibri"/>
+                <w:b w:val="0"/>
+                <w:color w:val="000000"/>
+                <w:sz w:val="17"/>
+              </w:rPr>
+              <w:t>0.0921</w:t>
+            </w:r>
+          </w:p>
+        </w:tc>
+        <w:tc>
+          <w:tcPr>
+            <w:tcW w:type="dxa" w:w="1260"/>
+            <w:tcMar>
+              <w:top w:w="80" w:type="dxa"/>
+              <w:start w:w="120" w:type="dxa"/>
+              <w:bottom w:w="80" w:type="dxa"/>
+              <w:end w:w="120" w:type="dxa"/>
+            </w:tcMar>
+            <w:vAlign w:val="center"/>
+          </w:tcPr>
+          <w:p>
+            <w:pPr>
+              <w:pStyle w:val="TableText"/>
+              <w:jc w:val="center"/>
+            </w:pPr>
+            <w:r/>
+            <w:r>
+              <w:rPr>
+                <w:rFonts w:ascii="Calibri" w:hAnsi="Calibri"/>
+                <w:b w:val="0"/>
+                <w:color w:val="000000"/>
+                <w:sz w:val="17"/>
+              </w:rPr>
+              <w:t>0.2981</w:t>
+            </w:r>
+          </w:p>
+        </w:tc>
+        <w:tc>
+          <w:tcPr>
+            <w:tcW w:type="dxa" w:w="1260"/>
+            <w:tcMar>
+              <w:top w:w="80" w:type="dxa"/>
+              <w:start w:w="120" w:type="dxa"/>
+              <w:bottom w:w="80" w:type="dxa"/>
+              <w:end w:w="120" w:type="dxa"/>
+            </w:tcMar>
+            <w:vAlign w:val="center"/>
+          </w:tcPr>
+          <w:p>
+            <w:pPr>
+              <w:pStyle w:val="TableText"/>
+              <w:jc w:val="center"/>
+            </w:pPr>
+            <w:r/>
+            <w:r>
+              <w:rPr>
+                <w:rFonts w:ascii="Calibri" w:hAnsi="Calibri"/>
+                <w:b w:val="0"/>
+                <w:color w:val="000000"/>
+                <w:sz w:val="17"/>
+              </w:rPr>
+              <w:t>0.997</w:t>
+            </w:r>
+          </w:p>
+        </w:tc>
+        <w:tc>
+          <w:tcPr>
+            <w:tcW w:type="dxa" w:w="1260"/>
+            <w:tcMar>
+              <w:top w:w="80" w:type="dxa"/>
+              <w:start w:w="120" w:type="dxa"/>
+              <w:bottom w:w="80" w:type="dxa"/>
+              <w:end w:w="120" w:type="dxa"/>
+            </w:tcMar>
+            <w:vAlign w:val="center"/>
+          </w:tcPr>
+          <w:p>
+            <w:pPr>
+              <w:pStyle w:val="TableText"/>
+              <w:jc w:val="center"/>
+            </w:pPr>
+            <w:r/>
+            <w:r>
+              <w:rPr>
+                <w:rFonts w:ascii="Calibri" w:hAnsi="Calibri"/>
+                <w:b w:val="0"/>
+                <w:color w:val="000000"/>
+                <w:sz w:val="17"/>
+              </w:rPr>
+              <w:t>0.0022</w:t>
+            </w:r>
+          </w:p>
+        </w:tc>
+      </w:tr>
+      <w:tr>
+        <w:trPr>
+          <w:cantSplit w:val="true"/>
+        </w:trPr>
+        <w:tc>
+          <w:tcPr>
+            <w:tcW w:type="dxa" w:w="1800"/>
+            <w:tcMar>
+              <w:top w:w="80" w:type="dxa"/>
+              <w:start w:w="120" w:type="dxa"/>
+              <w:bottom w:w="80" w:type="dxa"/>
+              <w:end w:w="120" w:type="dxa"/>
+            </w:tcMar>
+            <w:vAlign w:val="center"/>
+          </w:tcPr>
+          <w:p>
+            <w:pPr>
+              <w:pStyle w:val="TableText"/>
+              <w:jc w:val="left"/>
+            </w:pPr>
+            <w:r/>
+            <w:r>
+              <w:rPr>
+                <w:rFonts w:ascii="Calibri" w:hAnsi="Calibri"/>
+                <w:b w:val="0"/>
+                <w:color w:val="000000"/>
+                <w:sz w:val="17"/>
+              </w:rPr>
+              <w:t>Logistic Regression</w:t>
+            </w:r>
+          </w:p>
+        </w:tc>
+        <w:tc>
+          <w:tcPr>
+            <w:tcW w:type="dxa" w:w="1260"/>
+            <w:tcMar>
+              <w:top w:w="80" w:type="dxa"/>
+              <w:start w:w="120" w:type="dxa"/>
+              <w:bottom w:w="80" w:type="dxa"/>
+              <w:end w:w="120" w:type="dxa"/>
+            </w:tcMar>
+            <w:vAlign w:val="center"/>
+          </w:tcPr>
+          <w:p>
+            <w:pPr>
+              <w:pStyle w:val="TableText"/>
+              <w:jc w:val="center"/>
+            </w:pPr>
+            <w:r/>
+            <w:r>
+              <w:rPr>
+                <w:rFonts w:ascii="Calibri" w:hAnsi="Calibri"/>
+                <w:b w:val="0"/>
+                <w:color w:val="000000"/>
+                <w:sz w:val="17"/>
+              </w:rPr>
+              <w:t>0.833</w:t>
+            </w:r>
+          </w:p>
+        </w:tc>
+        <w:tc>
+          <w:tcPr>
+            <w:tcW w:type="dxa" w:w="1260"/>
+            <w:tcMar>
+              <w:top w:w="80" w:type="dxa"/>
+              <w:start w:w="120" w:type="dxa"/>
+              <w:bottom w:w="80" w:type="dxa"/>
+              <w:end w:w="120" w:type="dxa"/>
+            </w:tcMar>
+            <w:vAlign w:val="center"/>
+          </w:tcPr>
+          <w:p>
+            <w:pPr>
+              <w:pStyle w:val="TableText"/>
+              <w:jc w:val="center"/>
+            </w:pPr>
+            <w:r/>
+            <w:r>
+              <w:rPr>
+                <w:rFonts w:ascii="Calibri" w:hAnsi="Calibri"/>
+                <w:b w:val="0"/>
+                <w:color w:val="000000"/>
+                <w:sz w:val="17"/>
+              </w:rPr>
+              <w:t>0.404</w:t>
+            </w:r>
+          </w:p>
+        </w:tc>
+        <w:tc>
+          <w:tcPr>
+            <w:tcW w:type="dxa" w:w="1260"/>
+            <w:tcMar>
+              <w:top w:w="80" w:type="dxa"/>
+              <w:start w:w="120" w:type="dxa"/>
+              <w:bottom w:w="80" w:type="dxa"/>
+              <w:end w:w="120" w:type="dxa"/>
+            </w:tcMar>
+            <w:vAlign w:val="center"/>
+          </w:tcPr>
+          <w:p>
+            <w:pPr>
+              <w:pStyle w:val="TableText"/>
+              <w:jc w:val="center"/>
+            </w:pPr>
+            <w:r/>
+            <w:r>
+              <w:rPr>
+                <w:rFonts w:ascii="Calibri" w:hAnsi="Calibri"/>
+                <w:b w:val="0"/>
+                <w:color w:val="000000"/>
+                <w:sz w:val="17"/>
+              </w:rPr>
+              <w:t>0.0940</w:t>
+            </w:r>
+          </w:p>
+        </w:tc>
+        <w:tc>
+          <w:tcPr>
+            <w:tcW w:type="dxa" w:w="1260"/>
+            <w:tcMar>
+              <w:top w:w="80" w:type="dxa"/>
+              <w:start w:w="120" w:type="dxa"/>
+              <w:bottom w:w="80" w:type="dxa"/>
+              <w:end w:w="120" w:type="dxa"/>
+            </w:tcMar>
+            <w:vAlign w:val="center"/>
+          </w:tcPr>
+          <w:p>
+            <w:pPr>
+              <w:pStyle w:val="TableText"/>
+              <w:jc w:val="center"/>
+            </w:pPr>
+            <w:r/>
+            <w:r>
+              <w:rPr>
+                <w:rFonts w:ascii="Calibri" w:hAnsi="Calibri"/>
+                <w:b w:val="0"/>
+                <w:color w:val="000000"/>
+                <w:sz w:val="17"/>
+              </w:rPr>
+              <w:t>0.3031</w:t>
+            </w:r>
+          </w:p>
+        </w:tc>
+        <w:tc>
+          <w:tcPr>
+            <w:tcW w:type="dxa" w:w="1260"/>
+            <w:tcMar>
+              <w:top w:w="80" w:type="dxa"/>
+              <w:start w:w="120" w:type="dxa"/>
+              <w:bottom w:w="80" w:type="dxa"/>
+              <w:end w:w="120" w:type="dxa"/>
+            </w:tcMar>
+            <w:vAlign w:val="center"/>
+          </w:tcPr>
+          <w:p>
+            <w:pPr>
+              <w:pStyle w:val="TableText"/>
+              <w:jc w:val="center"/>
+            </w:pPr>
+            <w:r/>
+            <w:r>
+              <w:rPr>
+                <w:rFonts w:ascii="Calibri" w:hAnsi="Calibri"/>
+                <w:b w:val="0"/>
+                <w:color w:val="000000"/>
+                <w:sz w:val="17"/>
+              </w:rPr>
+              <w:t>0.976</w:t>
+            </w:r>
+          </w:p>
+        </w:tc>
+        <w:tc>
+          <w:tcPr>
+            <w:tcW w:type="dxa" w:w="1260"/>
+            <w:tcMar>
+              <w:top w:w="80" w:type="dxa"/>
+              <w:start w:w="120" w:type="dxa"/>
+              <w:bottom w:w="80" w:type="dxa"/>
+              <w:end w:w="120" w:type="dxa"/>
+            </w:tcMar>
+            <w:vAlign w:val="center"/>
+          </w:tcPr>
+          <w:p>
+            <w:pPr>
+              <w:pStyle w:val="TableText"/>
+              <w:jc w:val="center"/>
+            </w:pPr>
+            <w:r/>
+            <w:r>
+              <w:rPr>
+                <w:rFonts w:ascii="Calibri" w:hAnsi="Calibri"/>
+                <w:b w:val="0"/>
+                <w:color w:val="000000"/>
+                <w:sz w:val="17"/>
+              </w:rPr>
+              <w:t>0.0033</w:t>
+            </w:r>
+          </w:p>
+        </w:tc>
+      </w:tr>
+    </w:tbl>
+    <w:p>
+      <w:pPr>
+        <w:spacing w:after="40"/>
+        <w:jc w:val="left"/>
+      </w:pPr>
+    </w:p>
+    <w:p>
+      <w:pPr>
+        <w:jc w:val="left"/>
+      </w:pPr>
+      <w:r>
+        <w:rPr>
+          <w:rFonts w:ascii="Calibri" w:hAnsi="Calibri"/>
+          <w:color w:val="000000"/>
+        </w:rPr>
+        <w:t>Development OOF Brier score selected LightGBM as champion (0.091391 versus 0.091395 for XGBoost and CatBoost). On the development test, XGBoost had the numerically lowest Brier score (0.091497; 95% interval 0.090817-0.092218), but the top-three pairwise Brier, log-loss, AUROC, and average-precision differences were not Holm-significant. The champion was not reselected using test outcomes.</w:t>
+      </w:r>
+    </w:p>
+    <w:p>
+      <w:pPr>
+        <w:jc w:val="left"/>
+      </w:pPr>
+      <w:r>
+        <w:rPr>
+          <w:rFonts w:ascii="Calibri" w:hAnsi="Calibri"/>
+          <w:color w:val="000000"/>
+        </w:rPr>
+        <w:t>The descriptive 0.5 threshold had high specificity (0.980-0.987) but low sensitivity (0.113-0.179). Development sensitivity-constrained thresholds near 0.14 achieved 0.802-0.814 sensitivity with 0.704-0.726 specificity. This large operating-point change reinforces that 0.5 is not an implied clinical cutoff.</w:t>
+      </w:r>
+    </w:p>
+    <w:p>
+      <w:pPr>
+        <w:jc w:val="left"/>
+      </w:pPr>
+      <w:r>
+        <w:rPr>
+          <w:rFonts w:ascii="Calibri" w:hAnsi="Calibri"/>
+          <w:color w:val="000000"/>
+        </w:rPr>
+        <w:t>The availability router selected LightGBM for the full 21-feature panel and XGBoost for each reduced panel using development cross-fitted Brier score. Test Brier score increased from 0.0915 for the full panel to 0.0924 for 12 routine survey features, 0.0927 for nine cardiometabolic/health features, 0.0945 for six health-status features, 0.1016 for five demographic/health features, and 0.1020 for general health plus age. These are development degradation estimates, not optimized deployment rules. All 80 same-participant, same-family reduced-panel contrasts had degradation intervals excluding zero, but none survived the metric-wise Holm family (minimum adjusted p=0.080); this resolution limit must not be rewritten as equivalence or as a corrected significance claim.</w:t>
+      </w:r>
+    </w:p>
+    <w:p>
+      <w:pPr>
+        <w:jc w:val="left"/>
+      </w:pPr>
+      <w:r>
+        <w:rPr>
+          <w:rFonts w:ascii="Calibri" w:hAnsi="Calibri"/>
+          <w:color w:val="000000"/>
+        </w:rPr>
+        <w:t>Certainty-based selective prediction was particularly unfavorable to positive cases. At 70% coverage, full-panel Brier score fell from 0.0915 to 0.0430, but only 2,859 of 11,451 positive events remained (25.0% event coverage), accepted prevalence fell to 4.8%, AUROC fell to 0.784, and average precision fell to 0.128. The improved retained-case loss primarily reflects rejection of higher- risk cases and does not support an unqualified abstention benefit.</w:t>
+      </w:r>
+    </w:p>
+    <w:p>
+      <w:pPr>
+        <w:jc w:val="left"/>
+      </w:pPr>
+      <w:r>
+        <w:rPr>
+          <w:rFonts w:ascii="Calibri" w:hAnsi="Calibri"/>
+          <w:color w:val="000000"/>
+        </w:rPr>
+        <w:t>All 30 prespecified age- and sex-stratified coverage cells met the minimum size and event counts. At the 70% target, observed acceptance ranged from 69.7% to 70.3% across the four age groups and two sex groups. Within-group positive-event retention nevertheless fell sharply, with accepted prevalences of 4.6%-4.8% and average precision of 0.125-0.133. The subgroup results therefore reinforce the case-mix warning; they do not establish population fairness.</w:t>
+      </w:r>
+    </w:p>
+    <w:p>
+      <w:pPr>
+        <w:jc w:val="left"/>
+      </w:pPr>
+      <w:r>
+        <w:rPr>
+          <w:rFonts w:ascii="Calibri" w:hAnsi="Calibri"/>
+          <w:color w:val="000000"/>
+        </w:rPr>
+        <w:t>The model-family ablation found that every tree family improved on Logistic Regression for AUROC, average precision, Brier score, and log loss after Holm correction (adjusted p=0.016 for the reported 500-replicate family). This is a development contrast, not a final superiority result. Selector-metric variants did not produce corrected differences, and the router-versus-robust-single-model family did not support a routing advantage. Calibration materially improved CatBoost probability loss because its raw scores required correction; LightGBM selected identity calibration and therefore showed no calibration change.</w:t>
+      </w:r>
+    </w:p>
+    <w:p>
+      <w:pPr>
+        <w:jc w:val="left"/>
+      </w:pPr>
+      <w:r>
+        <w:rPr>
+          <w:rFonts w:ascii="Calibri" w:hAnsi="Calibri"/>
+          <w:color w:val="000000"/>
+        </w:rPr>
+        <w:t>Held-out SHAP analysis explained 1,000 development-test respondents per model using a 100-row development background. General health, high blood pressure, age, BMI, and high cholesterol occupied the top five original-feature positions for four model families; CatBoost used the same set with a different order. Additive reconstruction error was at most 5.6e-6. These explanations describe model behavior and must not be interpreted as causal effects.</w:t>
+      </w:r>
+    </w:p>
+    <w:p>
+      <w:pPr>
+        <w:keepNext/>
+        <w:jc w:val="center"/>
+      </w:pPr>
+      <w:r>
+        <w:drawing>
+          <wp:inline xmlns:a="http://schemas.openxmlformats.org/drawingml/2006/main" xmlns:pic="http://schemas.openxmlformats.org/drawingml/2006/picture">
+            <wp:extent cx="5669280" cy="2464791"/>
+            <wp:docPr id="5" name="Picture 5" descr="BRFSS five-model discrimination and availability-router probability loss across prespecified feature panels in the full-sample development study." title="Brfss Performance And Panels"/>
+            <wp:cNvGraphicFramePr>
+              <a:graphicFrameLocks noChangeAspect="1"/>
+            </wp:cNvGraphicFramePr>
+            <a:graphic>
+              <a:graphicData uri="http://schemas.openxmlformats.org/drawingml/2006/picture">
+                <pic:pic>
+                  <pic:nvPicPr>
+                    <pic:cNvPr id="0" name="brfss_performance_and_panels.png"/>
+                    <pic:cNvPicPr/>
+                  </pic:nvPicPr>
+                  <pic:blipFill>
+                    <a:blip r:embed="rId15"/>
+                    <a:stretch>
+                      <a:fillRect/>
+                    </a:stretch>
+                  </pic:blipFill>
+                  <pic:spPr>
+                    <a:xfrm>
+                      <a:off x="0" y="0"/>
+                      <a:ext cx="5669280" cy="2464791"/>
+                    </a:xfrm>
+                    <a:prstGeom prst="rect"/>
+                  </pic:spPr>
+                </pic:pic>
+              </a:graphicData>
+            </a:graphic>
+          </wp:inline>
+        </w:drawing>
+      </w:r>
+    </w:p>
+    <w:p>
+      <w:pPr>
+        <w:jc w:val="left"/>
+      </w:pPr>
+      <w:r>
+        <w:rPr>
+          <w:rFonts w:ascii="Calibri" w:hAnsi="Calibri"/>
+          <w:b/>
+          <w:color w:val="000000"/>
+        </w:rPr>
+        <w:t>Figure 5.</w:t>
+      </w:r>
+      <w:r>
+        <w:rPr>
+          <w:rFonts w:ascii="Calibri" w:hAnsi="Calibri"/>
+          <w:color w:val="000000"/>
+        </w:rPr>
+        <w:t xml:space="preserve"> BRFSS model discrimination and router probability loss under the full-sample development protocol. AUROC intervals use 500 participant-bootstrap replicates.</w:t>
+      </w:r>
+    </w:p>
+    <w:p>
+      <w:pPr>
+        <w:jc w:val="left"/>
+      </w:pPr>
+      <w:r>
+        <w:rPr>
+          <w:rFonts w:ascii="Calibri" w:hAnsi="Calibri"/>
+          <w:color w:val="000000"/>
+        </w:rPr>
+        <w:t>Survey-weighted sensitivity analysis represented 53 reporting areas and 1,292 strata; the Kish effective sample size was 21,165.5. Weighted prevalence was 10.9% rather than 13.3%. Weighted XGBoost AUROC was 0.871 (95% PSU-bootstrap interval 0.864-0.877) and Brier score was 0.0752 (0.0730-0.0778). These estimates are secondary sensitivity analyses because the random respondent holdout was not designed as an official survey-analysis partition.</w:t>
+      </w:r>
+    </w:p>
+    <w:p>
+      <w:pPr>
+        <w:jc w:val="left"/>
+      </w:pPr>
+      <w:r>
+        <w:rPr>
+          <w:rFonts w:ascii="Calibri" w:hAnsi="Calibri"/>
+          <w:color w:val="000000"/>
+        </w:rPr>
+        <w:t>Historical 10,000-row BRFSS smoke studies remain engineering evidence. A future final estimate still requires a different prespecified concealed manifest and one authorized execution after protocol freeze. Hospital130 remains outside the diabetes-screening result family because its endpoint is 30-day readmission.</w:t>
       </w:r>
     </w:p>
     <w:p>
@@ -3632,6 +5079,18 @@
           <w:rFonts w:ascii="Calibri" w:hAnsi="Calibri"/>
           <w:color w:val="000000"/>
         </w:rPr>
+        <w:t>The full BRFSS study adds precision but does not change the negative algorithm- superiority narrative: the three boosted-tree models were practically indistinguishable at reported precision, and the development-selected champion was not the numerical test leader on every metric. Survey weighting materially changed prevalence and performance, so population-weighted sensitivity results must remain separate from sample-conditional estimates.</w:t>
+      </w:r>
+    </w:p>
+    <w:p>
+      <w:pPr>
+        <w:jc w:val="left"/>
+      </w:pPr>
+      <w:r>
+        <w:rPr>
+          <w:rFonts w:ascii="Calibri" w:hAnsi="Calibri"/>
+          <w:color w:val="000000"/>
+        </w:rPr>
         <w:t>The study has important limitations. All primary datasets are public and mostly cross-sectional; they do not measure future incidence or age of onset. PIDD and Sylhet are small, and public benchmark reuse limits transportability. BRFSS uses self-reported status and requires careful survey-design interpretation. The current selective score is a baseline rather than an optimized clinical deferral policy. No matched cohort contains all PIDD, Sylhet, and BRFSS attributes for the same individuals, so mixed-input routing is not efficacy-validated fusion. External or temporal validation remains necessary for clinical-generalization claims.</w:t>
       </w:r>
     </w:p>
@@ -3658,7 +5117,7 @@
           <w:rFonts w:ascii="Calibri" w:hAnsi="Calibri"/>
           <w:color w:val="000000"/>
         </w:rPr>
-        <w:t>An availability-aware, calibrated diabetes-screening pipeline can provide traceable within-environment probabilities from prespecified feature panels and abstain when no evaluated route is supported. In PIDD development evidence, the router did not materially outperform a robust fixed model, while reduced panels, selective acceptance, and simulated missingness changed both probability quality and population coverage. The conference contribution should therefore be framed around reliability under incomplete inputs, endpoint safety, and transparent negative findings. Locked multi-environment evaluation and independent review are required before submission.</w:t>
+        <w:t>An availability-aware, calibrated diabetes-screening pipeline can provide traceable within-environment probabilities from prespecified feature panels and abstain when no evaluated route is supported. In PIDD development evidence, the router did not materially outperform a robust fixed model, while reduced panels, selective acceptance, and simulated missingness changed both probability quality and population coverage. The conference contribution should therefore be framed around reliability under incomplete inputs, endpoint safety, survey-estimand transparency, and negative findings. The full BRFSS study remains development evidence because its seed-42 test role was already inspected. Locked evaluation on a genuinely new concealed manifest and independent review are required before submission.</w:t>
       </w:r>
     </w:p>
     <w:p>

</xml_diff>

<commit_message>
Complete Hospital130 development and release hardening
</commit_message>
<xml_diff>
--- a/conference_package/generated/Conference_Manuscript_Development_Draft.docx
+++ b/conference_package/generated/Conference_Manuscript_Development_Draft.docx
@@ -79,7 +79,7 @@
           <w:color w:val="667085"/>
           <w:sz w:val="20"/>
         </w:rPr>
-        <w:t>Evidence cutoff: 29 August 2026</w:t>
+        <w:t>Evidence cutoff: 30 August 2026</w:t>
       </w:r>
     </w:p>
     <w:p>
@@ -171,7 +171,7 @@
           <w:rFonts w:ascii="Calibri" w:hAnsi="Calibri"/>
           <w:color w:val="000000"/>
         </w:rPr>
-        <w:t xml:space="preserve"> PIDD, the Sylhet early-stage symptom cohort, and BRFSS 2015 are treated as separate prediction environments. Logistic Regression, Random Forest, XGBoost, LightGBM, and CatBoost are compared using leakage-controlled nested cross-validation or a development holdout appropriate to each dataset. Model selection occurs inside development data. Evaluation includes AUROC, average precision, Brier score, log loss, calibration, threshold metrics, decision-curve net benefit, paired uncertainty, reduced-panel degradation, selective prediction, subgroups, missingness stress, and held-out SHAP explanations. The router chooses only among models evaluated for a supported within-dataset panel and otherwise abstains.</w:t>
+        <w:t xml:space="preserve"> PIDD, the Sylhet early-stage symptom cohort, and BRFSS 2015 are treated as separate diabetes-status environments; Hospital130 is a distinct 30-day-readmission analysis. Logistic Regression, Random Forest, XGBoost, LightGBM, and CatBoost are compared using leakage-controlled nested cross-validation or a development holdout appropriate to each dataset. Model selection occurs inside development data. Evaluation includes AUROC, average precision, Brier score, log loss, calibration, threshold metrics, decision-curve net benefit, paired uncertainty, reduced-panel degradation, selective prediction, subgroups, missingness stress, and held-out SHAP explanations. The router chooses only among models evaluated for a supported within-dataset panel and otherwise abstains.</w:t>
       </w:r>
     </w:p>
     <w:p>
@@ -191,7 +191,7 @@
           <w:rFonts w:ascii="Calibri" w:hAnsi="Calibri"/>
           <w:color w:val="000000"/>
         </w:rPr>
-        <w:t xml:space="preserve"> In the completed full-budget PIDD development study (768 participants; 5 repeats x 5 outer folds), calibrated fixed-threshold AUROC ranged from 0.835 to 0.841 and Brier score from 0.154 to 0.157 across the five model families. CatBoost had the lowest mean Brier score (0.154), but model differences were small. For the full panel, the availability router achieved participant-level AUROC 0.843 and Brier score 0.152; the robust fixed-model baseline achieved AUROC 0.843 and Brier score 0.152. No reduced-panel comparison survived metric-wise Holm correction in the matched contrast family. At 70% coverage, probability-certainty selection reduced full-panel router Brier score from 0.152 to 0.110 but retained only 55.6% of positive events, demonstrating a clinically important coverage trade-off. With 75% simulated feature dropout, supported-panel coverage fell to approximately 4.8%-6.6%, while Brier score rose to approximately 0.208-0.211 for Random Forest and XGBoost. In the grouped Sylhet development study (520 participants; 5 x 5 outer folds), CatBoost achieved AUROC 0.968, average precision 0.982, and Brier score 0.066, but a calibration slope of 12.65 indicated instability. The full-panel router achieved AUROC 0.965 and Brier 0.068 versus 0.960 and 0.077 for the robust fixed baseline, without a corrected significance claim. Across 32 Sylhet panel-specific-training contrasts, no comparison survived Holm correction (minimum adjusted p=0.064). The full BRFSS development study used 343,488 development and 85,872 development-test respondents. XGBoost, CatBoost, and LightGBM had nearly identical calibrated AUROC (0.843) and Brier score (0.0915); none of their pairwise differences was Holm-significant. The development-selected LightGBM champion was retained even though XGBoost had the numerically lowest test Brier score. Survey weighting changed prevalence from 13.3% to 10.9% and increased XGBoost AUROC from 0.843 to 0.871, showing that sample-conditional and population-weighted estimands are not interchangeable.</w:t>
+        <w:t xml:space="preserve"> In the completed full-budget PIDD development study (768 participants; 5 repeats x 5 outer folds), participant-aggregated calibrated AUROC ranged from 0.838 to 0.844 and Brier score from 0.152 to 0.156 across the five model families. CatBoost had the lowest participant-level Brier score (0.152), but model differences were small. For the full panel, the availability router achieved participant-level AUROC 0.843 and Brier score 0.152; the robust fixed-model baseline achieved AUROC 0.843 and Brier score 0.152. No reduced-panel comparison survived metric-wise Holm correction in the matched contrast family. At 70% coverage, probability-certainty selection reduced full-panel router Brier score from 0.152 to 0.110 but retained only 55.6% of positive events, demonstrating a clinically important coverage trade-off. With 75% simulated feature dropout, supported-panel coverage fell to approximately 4.8%-6.6%, while Brier score rose to approximately 0.208-0.211 for Random Forest and XGBoost. In the grouped Sylhet development study (520 participants; 5 x 5 outer folds), CatBoost achieved participant-level AUROC 0.970, average precision 0.984, Brier score 0.061, and calibration slope 1.01. The full-panel router achieved AUROC 0.965 and Brier 0.068 versus 0.960 and 0.077 for the robust fixed baseline, without a corrected significance claim. Across 32 Sylhet panel-specific-training contrasts, no comparison survived Holm correction (minimum adjusted p=0.064). The full BRFSS development study used 343,488 development and 85,872 development-test respondents. XGBoost, CatBoost, and LightGBM had nearly identical calibrated AUROC (0.843) and Brier score (0.0915); none of their pairwise differences was Holm-significant. The development-selected LightGBM champion was retained even though XGBoost had the numerically lowest test Brier score. Survey weighting changed prevalence from 13.3% to 10.9% and increased XGBoost AUROC from 0.843 to 0.871, showing that sample-conditional and population-weighted estimands are not interchangeable. In the separate Hospital130 development study, 99,343 retained encounters from 69,990 patients yielded a 19,868-encounter patient-grouped test partition. LightGBM was selected on development data and achieved calibrated AUROC 0.679, average precision 0.229, Brier 0.0958, and calibration slope 1.02.</w:t>
       </w:r>
     </w:p>
     <w:p>
@@ -281,7 +281,7 @@
           <w:rFonts w:ascii="Calibri" w:hAnsi="Calibri"/>
           <w:color w:val="000000"/>
         </w:rPr>
-        <w:t>This study evaluates that question across three separately analysed diabetes-status environments. Its contributions are: (1) endpoint-safe feature and routing contracts; (2) matched evaluation of full and reduced panels on the same held-out participants; (3) calibration, paired uncertainty, clinical utility, selective prediction, subgroup coverage, and missingness stress beyond headline accuracy; and (4) reloadable prediction bundles with explicit provenance and fail-closed abstention. It does not claim future diabetes onset, age of onset, causal risk factors, cross-cohort probability fusion, or clinical deployment readiness.</w:t>
+        <w:t>This study evaluates that question across three separately analysed diabetes-status environments, with Hospital130 retained as a separate secondary readmission analysis. Its contributions are: (1) endpoint-safe feature and routing contracts; (2) matched evaluation of full and reduced panels on the same held-out participants; (3) calibration, paired uncertainty, clinical utility, selective prediction, subgroup coverage, and missingness stress beyond headline accuracy; and (4) reloadable prediction bundles with explicit provenance and fail-closed abstention. It does not claim future diabetes onset, age of onset, causal risk factors, cross-cohort probability fusion, or clinical deployment readiness.</w:t>
       </w:r>
     </w:p>
     <w:p>
@@ -589,7 +589,7 @@
           <w:rFonts w:ascii="Calibri" w:hAnsi="Calibri"/>
           <w:color w:val="000000"/>
         </w:rPr>
-        <w:t>The full-budget PIDD development run contained 25 outer evaluations for each of five models and complete participant aggregation for all 768 individuals. Table 1 reports calibrated probabilities with the fixed 0.5 descriptive threshold. Differences were modest: the absolute Brier range was 0.0026 and the AUROC range was 0.0059.</w:t>
+        <w:t>The full-budget PIDD development run contained 25 outer evaluations for each of five models and complete participant aggregation for all 768 individuals. Table 1 reports calibrated probabilities with the fixed 0.5 descriptive threshold. Differences were modest: the participant-level absolute Brier range was 0.0039 and the AUROC range was 0.0067.</w:t>
       </w:r>
     </w:p>
     <w:p>
@@ -602,7 +602,7 @@
           <w:b/>
           <w:color w:val="000000"/>
         </w:rPr>
-        <w:t>Table 1. PIDD calibrated development performance, mean across 25 outer evaluations</w:t>
+        <w:t>Table 1. PIDD calibrated participant-level development performance after averaging each participant across five repeats</w:t>
       </w:r>
     </w:p>
     <w:tbl>
@@ -888,7 +888,7 @@
                 <w:color w:val="000000"/>
                 <w:sz w:val="17"/>
               </w:rPr>
-              <w:t>0.841</w:t>
+              <w:t>0.844</w:t>
             </w:r>
           </w:p>
         </w:tc>
@@ -916,7 +916,208 @@
                 <w:color w:val="000000"/>
                 <w:sz w:val="17"/>
               </w:rPr>
-              <w:t>0.719</w:t>
+              <w:t>0.709</w:t>
+            </w:r>
+          </w:p>
+        </w:tc>
+        <w:tc>
+          <w:tcPr>
+            <w:tcW w:type="dxa" w:w="1260"/>
+            <w:tcMar>
+              <w:top w:w="80" w:type="dxa"/>
+              <w:start w:w="120" w:type="dxa"/>
+              <w:bottom w:w="80" w:type="dxa"/>
+              <w:end w:w="120" w:type="dxa"/>
+            </w:tcMar>
+            <w:vAlign w:val="center"/>
+          </w:tcPr>
+          <w:p>
+            <w:pPr>
+              <w:pStyle w:val="TableText"/>
+              <w:jc w:val="center"/>
+            </w:pPr>
+            <w:r/>
+            <w:r>
+              <w:rPr>
+                <w:rFonts w:ascii="Calibri" w:hAnsi="Calibri"/>
+                <w:b w:val="0"/>
+                <w:color w:val="000000"/>
+                <w:sz w:val="17"/>
+              </w:rPr>
+              <w:t>0.152</w:t>
+            </w:r>
+          </w:p>
+        </w:tc>
+        <w:tc>
+          <w:tcPr>
+            <w:tcW w:type="dxa" w:w="1260"/>
+            <w:tcMar>
+              <w:top w:w="80" w:type="dxa"/>
+              <w:start w:w="120" w:type="dxa"/>
+              <w:bottom w:w="80" w:type="dxa"/>
+              <w:end w:w="120" w:type="dxa"/>
+            </w:tcMar>
+            <w:vAlign w:val="center"/>
+          </w:tcPr>
+          <w:p>
+            <w:pPr>
+              <w:pStyle w:val="TableText"/>
+              <w:jc w:val="center"/>
+            </w:pPr>
+            <w:r/>
+            <w:r>
+              <w:rPr>
+                <w:rFonts w:ascii="Calibri" w:hAnsi="Calibri"/>
+                <w:b w:val="0"/>
+                <w:color w:val="000000"/>
+                <w:sz w:val="17"/>
+              </w:rPr>
+              <w:t>0.462</w:t>
+            </w:r>
+          </w:p>
+        </w:tc>
+        <w:tc>
+          <w:tcPr>
+            <w:tcW w:type="dxa" w:w="1260"/>
+            <w:tcMar>
+              <w:top w:w="80" w:type="dxa"/>
+              <w:start w:w="120" w:type="dxa"/>
+              <w:bottom w:w="80" w:type="dxa"/>
+              <w:end w:w="120" w:type="dxa"/>
+            </w:tcMar>
+            <w:vAlign w:val="center"/>
+          </w:tcPr>
+          <w:p>
+            <w:pPr>
+              <w:pStyle w:val="TableText"/>
+              <w:jc w:val="center"/>
+            </w:pPr>
+            <w:r/>
+            <w:r>
+              <w:rPr>
+                <w:rFonts w:ascii="Calibri" w:hAnsi="Calibri"/>
+                <w:b w:val="0"/>
+                <w:color w:val="000000"/>
+                <w:sz w:val="17"/>
+              </w:rPr>
+              <w:t>1.050</w:t>
+            </w:r>
+          </w:p>
+        </w:tc>
+        <w:tc>
+          <w:tcPr>
+            <w:tcW w:type="dxa" w:w="1260"/>
+            <w:tcMar>
+              <w:top w:w="80" w:type="dxa"/>
+              <w:start w:w="120" w:type="dxa"/>
+              <w:bottom w:w="80" w:type="dxa"/>
+              <w:end w:w="120" w:type="dxa"/>
+            </w:tcMar>
+            <w:vAlign w:val="center"/>
+          </w:tcPr>
+          <w:p>
+            <w:pPr>
+              <w:pStyle w:val="TableText"/>
+              <w:jc w:val="center"/>
+            </w:pPr>
+            <w:r/>
+            <w:r>
+              <w:rPr>
+                <w:rFonts w:ascii="Calibri" w:hAnsi="Calibri"/>
+                <w:b w:val="0"/>
+                <w:color w:val="000000"/>
+                <w:sz w:val="17"/>
+              </w:rPr>
+              <w:t>0.038</w:t>
+            </w:r>
+          </w:p>
+        </w:tc>
+      </w:tr>
+      <w:tr>
+        <w:trPr>
+          <w:cantSplit w:val="true"/>
+        </w:trPr>
+        <w:tc>
+          <w:tcPr>
+            <w:tcW w:type="dxa" w:w="1800"/>
+            <w:tcMar>
+              <w:top w:w="80" w:type="dxa"/>
+              <w:start w:w="120" w:type="dxa"/>
+              <w:bottom w:w="80" w:type="dxa"/>
+              <w:end w:w="120" w:type="dxa"/>
+            </w:tcMar>
+            <w:vAlign w:val="center"/>
+          </w:tcPr>
+          <w:p>
+            <w:pPr>
+              <w:pStyle w:val="TableText"/>
+              <w:jc w:val="left"/>
+            </w:pPr>
+            <w:r/>
+            <w:r>
+              <w:rPr>
+                <w:rFonts w:ascii="Calibri" w:hAnsi="Calibri"/>
+                <w:b w:val="0"/>
+                <w:color w:val="000000"/>
+                <w:sz w:val="17"/>
+              </w:rPr>
+              <w:t>Random Forest</w:t>
+            </w:r>
+          </w:p>
+        </w:tc>
+        <w:tc>
+          <w:tcPr>
+            <w:tcW w:type="dxa" w:w="1260"/>
+            <w:tcMar>
+              <w:top w:w="80" w:type="dxa"/>
+              <w:start w:w="120" w:type="dxa"/>
+              <w:bottom w:w="80" w:type="dxa"/>
+              <w:end w:w="120" w:type="dxa"/>
+            </w:tcMar>
+            <w:vAlign w:val="center"/>
+          </w:tcPr>
+          <w:p>
+            <w:pPr>
+              <w:pStyle w:val="TableText"/>
+              <w:jc w:val="center"/>
+            </w:pPr>
+            <w:r/>
+            <w:r>
+              <w:rPr>
+                <w:rFonts w:ascii="Calibri" w:hAnsi="Calibri"/>
+                <w:b w:val="0"/>
+                <w:color w:val="000000"/>
+                <w:sz w:val="17"/>
+              </w:rPr>
+              <w:t>0.840</w:t>
+            </w:r>
+          </w:p>
+        </w:tc>
+        <w:tc>
+          <w:tcPr>
+            <w:tcW w:type="dxa" w:w="1260"/>
+            <w:tcMar>
+              <w:top w:w="80" w:type="dxa"/>
+              <w:start w:w="120" w:type="dxa"/>
+              <w:bottom w:w="80" w:type="dxa"/>
+              <w:end w:w="120" w:type="dxa"/>
+            </w:tcMar>
+            <w:vAlign w:val="center"/>
+          </w:tcPr>
+          <w:p>
+            <w:pPr>
+              <w:pStyle w:val="TableText"/>
+              <w:jc w:val="center"/>
+            </w:pPr>
+            <w:r/>
+            <w:r>
+              <w:rPr>
+                <w:rFonts w:ascii="Calibri" w:hAnsi="Calibri"/>
+                <w:b w:val="0"/>
+                <w:color w:val="000000"/>
+                <w:sz w:val="17"/>
+              </w:rPr>
+              <w:t>0.710</w:t>
             </w:r>
           </w:p>
         </w:tc>
@@ -1000,207 +1201,6 @@
                 <w:color w:val="000000"/>
                 <w:sz w:val="17"/>
               </w:rPr>
-              <w:t>1.028</w:t>
-            </w:r>
-          </w:p>
-        </w:tc>
-        <w:tc>
-          <w:tcPr>
-            <w:tcW w:type="dxa" w:w="1260"/>
-            <w:tcMar>
-              <w:top w:w="80" w:type="dxa"/>
-              <w:start w:w="120" w:type="dxa"/>
-              <w:bottom w:w="80" w:type="dxa"/>
-              <w:end w:w="120" w:type="dxa"/>
-            </w:tcMar>
-            <w:vAlign w:val="center"/>
-          </w:tcPr>
-          <w:p>
-            <w:pPr>
-              <w:pStyle w:val="TableText"/>
-              <w:jc w:val="center"/>
-            </w:pPr>
-            <w:r/>
-            <w:r>
-              <w:rPr>
-                <w:rFonts w:ascii="Calibri" w:hAnsi="Calibri"/>
-                <w:b w:val="0"/>
-                <w:color w:val="000000"/>
-                <w:sz w:val="17"/>
-              </w:rPr>
-              <w:t>0.078</w:t>
-            </w:r>
-          </w:p>
-        </w:tc>
-      </w:tr>
-      <w:tr>
-        <w:trPr>
-          <w:cantSplit w:val="true"/>
-        </w:trPr>
-        <w:tc>
-          <w:tcPr>
-            <w:tcW w:type="dxa" w:w="1800"/>
-            <w:tcMar>
-              <w:top w:w="80" w:type="dxa"/>
-              <w:start w:w="120" w:type="dxa"/>
-              <w:bottom w:w="80" w:type="dxa"/>
-              <w:end w:w="120" w:type="dxa"/>
-            </w:tcMar>
-            <w:vAlign w:val="center"/>
-          </w:tcPr>
-          <w:p>
-            <w:pPr>
-              <w:pStyle w:val="TableText"/>
-              <w:jc w:val="left"/>
-            </w:pPr>
-            <w:r/>
-            <w:r>
-              <w:rPr>
-                <w:rFonts w:ascii="Calibri" w:hAnsi="Calibri"/>
-                <w:b w:val="0"/>
-                <w:color w:val="000000"/>
-                <w:sz w:val="17"/>
-              </w:rPr>
-              <w:t>Random Forest</w:t>
-            </w:r>
-          </w:p>
-        </w:tc>
-        <w:tc>
-          <w:tcPr>
-            <w:tcW w:type="dxa" w:w="1260"/>
-            <w:tcMar>
-              <w:top w:w="80" w:type="dxa"/>
-              <w:start w:w="120" w:type="dxa"/>
-              <w:bottom w:w="80" w:type="dxa"/>
-              <w:end w:w="120" w:type="dxa"/>
-            </w:tcMar>
-            <w:vAlign w:val="center"/>
-          </w:tcPr>
-          <w:p>
-            <w:pPr>
-              <w:pStyle w:val="TableText"/>
-              <w:jc w:val="center"/>
-            </w:pPr>
-            <w:r/>
-            <w:r>
-              <w:rPr>
-                <w:rFonts w:ascii="Calibri" w:hAnsi="Calibri"/>
-                <w:b w:val="0"/>
-                <w:color w:val="000000"/>
-                <w:sz w:val="17"/>
-              </w:rPr>
-              <w:t>0.838</w:t>
-            </w:r>
-          </w:p>
-        </w:tc>
-        <w:tc>
-          <w:tcPr>
-            <w:tcW w:type="dxa" w:w="1260"/>
-            <w:tcMar>
-              <w:top w:w="80" w:type="dxa"/>
-              <w:start w:w="120" w:type="dxa"/>
-              <w:bottom w:w="80" w:type="dxa"/>
-              <w:end w:w="120" w:type="dxa"/>
-            </w:tcMar>
-            <w:vAlign w:val="center"/>
-          </w:tcPr>
-          <w:p>
-            <w:pPr>
-              <w:pStyle w:val="TableText"/>
-              <w:jc w:val="center"/>
-            </w:pPr>
-            <w:r/>
-            <w:r>
-              <w:rPr>
-                <w:rFonts w:ascii="Calibri" w:hAnsi="Calibri"/>
-                <w:b w:val="0"/>
-                <w:color w:val="000000"/>
-                <w:sz w:val="17"/>
-              </w:rPr>
-              <w:t>0.721</w:t>
-            </w:r>
-          </w:p>
-        </w:tc>
-        <w:tc>
-          <w:tcPr>
-            <w:tcW w:type="dxa" w:w="1260"/>
-            <w:tcMar>
-              <w:top w:w="80" w:type="dxa"/>
-              <w:start w:w="120" w:type="dxa"/>
-              <w:bottom w:w="80" w:type="dxa"/>
-              <w:end w:w="120" w:type="dxa"/>
-            </w:tcMar>
-            <w:vAlign w:val="center"/>
-          </w:tcPr>
-          <w:p>
-            <w:pPr>
-              <w:pStyle w:val="TableText"/>
-              <w:jc w:val="center"/>
-            </w:pPr>
-            <w:r/>
-            <w:r>
-              <w:rPr>
-                <w:rFonts w:ascii="Calibri" w:hAnsi="Calibri"/>
-                <w:b w:val="0"/>
-                <w:color w:val="000000"/>
-                <w:sz w:val="17"/>
-              </w:rPr>
-              <w:t>0.156</w:t>
-            </w:r>
-          </w:p>
-        </w:tc>
-        <w:tc>
-          <w:tcPr>
-            <w:tcW w:type="dxa" w:w="1260"/>
-            <w:tcMar>
-              <w:top w:w="80" w:type="dxa"/>
-              <w:start w:w="120" w:type="dxa"/>
-              <w:bottom w:w="80" w:type="dxa"/>
-              <w:end w:w="120" w:type="dxa"/>
-            </w:tcMar>
-            <w:vAlign w:val="center"/>
-          </w:tcPr>
-          <w:p>
-            <w:pPr>
-              <w:pStyle w:val="TableText"/>
-              <w:jc w:val="center"/>
-            </w:pPr>
-            <w:r/>
-            <w:r>
-              <w:rPr>
-                <w:rFonts w:ascii="Calibri" w:hAnsi="Calibri"/>
-                <w:b w:val="0"/>
-                <w:color w:val="000000"/>
-                <w:sz w:val="17"/>
-              </w:rPr>
-              <w:t>0.473</w:t>
-            </w:r>
-          </w:p>
-        </w:tc>
-        <w:tc>
-          <w:tcPr>
-            <w:tcW w:type="dxa" w:w="1260"/>
-            <w:tcMar>
-              <w:top w:w="80" w:type="dxa"/>
-              <w:start w:w="120" w:type="dxa"/>
-              <w:bottom w:w="80" w:type="dxa"/>
-              <w:end w:w="120" w:type="dxa"/>
-            </w:tcMar>
-            <w:vAlign w:val="center"/>
-          </w:tcPr>
-          <w:p>
-            <w:pPr>
-              <w:pStyle w:val="TableText"/>
-              <w:jc w:val="center"/>
-            </w:pPr>
-            <w:r/>
-            <w:r>
-              <w:rPr>
-                <w:rFonts w:ascii="Calibri" w:hAnsi="Calibri"/>
-                <w:b w:val="0"/>
-                <w:color w:val="000000"/>
-                <w:sz w:val="17"/>
-              </w:rPr>
               <w:t>1.046</w:t>
             </w:r>
           </w:p>
@@ -1229,7 +1229,7 @@
                 <w:color w:val="000000"/>
                 <w:sz w:val="17"/>
               </w:rPr>
-              <w:t>0.076</w:t>
+              <w:t>0.032</w:t>
             </w:r>
           </w:p>
         </w:tc>
@@ -1290,7 +1290,7 @@
                 <w:color w:val="000000"/>
                 <w:sz w:val="17"/>
               </w:rPr>
-              <w:t>0.836</w:t>
+              <w:t>0.839</w:t>
             </w:r>
           </w:p>
         </w:tc>
@@ -1318,7 +1318,7 @@
                 <w:color w:val="000000"/>
                 <w:sz w:val="17"/>
               </w:rPr>
-              <w:t>0.717</w:t>
+              <w:t>0.713</w:t>
             </w:r>
           </w:p>
         </w:tc>
@@ -1346,7 +1346,7 @@
                 <w:color w:val="000000"/>
                 <w:sz w:val="17"/>
               </w:rPr>
-              <w:t>0.156</w:t>
+              <w:t>0.154</w:t>
             </w:r>
           </w:p>
         </w:tc>
@@ -1374,7 +1374,7 @@
                 <w:color w:val="000000"/>
                 <w:sz w:val="17"/>
               </w:rPr>
-              <w:t>0.473</w:t>
+              <w:t>0.468</w:t>
             </w:r>
           </w:p>
         </w:tc>
@@ -1402,7 +1402,7 @@
                 <w:color w:val="000000"/>
                 <w:sz w:val="17"/>
               </w:rPr>
-              <w:t>1.007</w:t>
+              <w:t>1.033</w:t>
             </w:r>
           </w:p>
         </w:tc>
@@ -1430,7 +1430,7 @@
                 <w:color w:val="000000"/>
                 <w:sz w:val="17"/>
               </w:rPr>
-              <w:t>0.075</w:t>
+              <w:t>0.038</w:t>
             </w:r>
           </w:p>
         </w:tc>
@@ -1491,7 +1491,7 @@
                 <w:color w:val="000000"/>
                 <w:sz w:val="17"/>
               </w:rPr>
-              <w:t>0.836</w:t>
+              <w:t>0.838</w:t>
             </w:r>
           </w:p>
         </w:tc>
@@ -1519,7 +1519,7 @@
                 <w:color w:val="000000"/>
                 <w:sz w:val="17"/>
               </w:rPr>
-              <w:t>0.723</w:t>
+              <w:t>0.712</w:t>
             </w:r>
           </w:p>
         </w:tc>
@@ -1575,7 +1575,7 @@
                 <w:color w:val="000000"/>
                 <w:sz w:val="17"/>
               </w:rPr>
-              <w:t>0.477</w:t>
+              <w:t>0.475</w:t>
             </w:r>
           </w:p>
         </w:tc>
@@ -1603,7 +1603,7 @@
                 <w:color w:val="000000"/>
                 <w:sz w:val="17"/>
               </w:rPr>
-              <w:t>1.055</w:t>
+              <w:t>1.036</w:t>
             </w:r>
           </w:p>
         </w:tc>
@@ -1631,7 +1631,7 @@
                 <w:color w:val="000000"/>
                 <w:sz w:val="17"/>
               </w:rPr>
-              <w:t>0.074</w:t>
+              <w:t>0.043</w:t>
             </w:r>
           </w:p>
         </w:tc>
@@ -1692,7 +1692,7 @@
                 <w:color w:val="000000"/>
                 <w:sz w:val="17"/>
               </w:rPr>
-              <w:t>0.835</w:t>
+              <w:t>0.838</w:t>
             </w:r>
           </w:p>
         </w:tc>
@@ -1720,7 +1720,7 @@
                 <w:color w:val="000000"/>
                 <w:sz w:val="17"/>
               </w:rPr>
-              <w:t>0.715</w:t>
+              <w:t>0.706</w:t>
             </w:r>
           </w:p>
         </w:tc>
@@ -1748,7 +1748,7 @@
                 <w:color w:val="000000"/>
                 <w:sz w:val="17"/>
               </w:rPr>
-              <w:t>0.157</w:t>
+              <w:t>0.154</w:t>
             </w:r>
           </w:p>
         </w:tc>
@@ -1776,7 +1776,7 @@
                 <w:color w:val="000000"/>
                 <w:sz w:val="17"/>
               </w:rPr>
-              <w:t>0.476</w:t>
+              <w:t>0.469</w:t>
             </w:r>
           </w:p>
         </w:tc>
@@ -1804,7 +1804,7 @@
                 <w:color w:val="000000"/>
                 <w:sz w:val="17"/>
               </w:rPr>
-              <w:t>1.017</w:t>
+              <w:t>1.041</w:t>
             </w:r>
           </w:p>
         </w:tc>
@@ -1832,7 +1832,7 @@
                 <w:color w:val="000000"/>
                 <w:sz w:val="17"/>
               </w:rPr>
-              <w:t>0.078</w:t>
+              <w:t>0.026</w:t>
             </w:r>
           </w:p>
         </w:tc>
@@ -2197,7 +2197,7 @@
           <w:rFonts w:ascii="Calibri" w:hAnsi="Calibri"/>
           <w:color w:val="000000"/>
         </w:rPr>
-        <w:t>The full-budget Sylhet study contained 25 outer evaluations for each model and cluster-bootstrap uncertainty over identical symptom profiles. CatBoost had the lowest fold-mean Brier score (0.066) and highest AUROC (0.968), followed by Random Forest (Brier 0.072; AUROC 0.966). However, calibrated slopes were unstable, including 12.65 for CatBoost and 2.20 for Random Forest, so the high discrimination does not justify an unqualified claim that individual probabilities are well calibrated.</w:t>
+        <w:t>The full-budget Sylhet study contained 25 outer evaluations for each model. Each participant's five held-out probabilities was averaged before primary metrics, and uncertainty resampled complete identical-profile clusters. CatBoost had the lowest participant-level Brier score (0.061) and highest AUROC (0.970), followed by Random Forest (Brier 0.067; AUROC 0.968). Participant-level calibration slopes were 1.01 and 1.13, respectively. High internal discrimination still does not establish transportability beyond this small symptom-enriched cohort.</w:t>
       </w:r>
     </w:p>
     <w:p>
@@ -2210,7 +2210,7 @@
           <w:b/>
           <w:color w:val="000000"/>
         </w:rPr>
-        <w:t>Table 2. Sylhet calibrated grouped-development performance, mean across 25 outer evaluations</w:t>
+        <w:t>Table 2. Sylhet calibrated participant-level development performance with identical-profile cluster inference</w:t>
       </w:r>
     </w:p>
     <w:tbl>
@@ -2496,7 +2496,7 @@
                 <w:color w:val="000000"/>
                 <w:sz w:val="17"/>
               </w:rPr>
-              <w:t>0.968</w:t>
+              <w:t>0.970</w:t>
             </w:r>
           </w:p>
         </w:tc>
@@ -2524,7 +2524,7 @@
                 <w:color w:val="000000"/>
                 <w:sz w:val="17"/>
               </w:rPr>
-              <w:t>0.982</w:t>
+              <w:t>0.984</w:t>
             </w:r>
           </w:p>
         </w:tc>
@@ -2552,7 +2552,7 @@
                 <w:color w:val="000000"/>
                 <w:sz w:val="17"/>
               </w:rPr>
-              <w:t>0.066</w:t>
+              <w:t>0.061</w:t>
             </w:r>
           </w:p>
         </w:tc>
@@ -2580,7 +2580,7 @@
                 <w:color w:val="000000"/>
                 <w:sz w:val="17"/>
               </w:rPr>
-              <w:t>0.235</w:t>
+              <w:t>0.213</w:t>
             </w:r>
           </w:p>
         </w:tc>
@@ -2608,7 +2608,7 @@
                 <w:color w:val="000000"/>
                 <w:sz w:val="17"/>
               </w:rPr>
-              <w:t>12.652</w:t>
+              <w:t>1.010</w:t>
             </w:r>
           </w:p>
         </w:tc>
@@ -2636,7 +2636,7 @@
                 <w:color w:val="000000"/>
                 <w:sz w:val="17"/>
               </w:rPr>
-              <w:t>0.074</w:t>
+              <w:t>0.038</w:t>
             </w:r>
           </w:p>
         </w:tc>
@@ -2697,7 +2697,7 @@
                 <w:color w:val="000000"/>
                 <w:sz w:val="17"/>
               </w:rPr>
-              <w:t>0.966</w:t>
+              <w:t>0.968</w:t>
             </w:r>
           </w:p>
         </w:tc>
@@ -2753,7 +2753,7 @@
                 <w:color w:val="000000"/>
                 <w:sz w:val="17"/>
               </w:rPr>
-              <w:t>0.072</w:t>
+              <w:t>0.067</w:t>
             </w:r>
           </w:p>
         </w:tc>
@@ -2781,7 +2781,7 @@
                 <w:color w:val="000000"/>
                 <w:sz w:val="17"/>
               </w:rPr>
-              <w:t>0.246</w:t>
+              <w:t>0.226</w:t>
             </w:r>
           </w:p>
         </w:tc>
@@ -2809,7 +2809,7 @@
                 <w:color w:val="000000"/>
                 <w:sz w:val="17"/>
               </w:rPr>
-              <w:t>2.200</w:t>
+              <w:t>1.126</w:t>
             </w:r>
           </w:p>
         </w:tc>
@@ -2837,7 +2837,208 @@
                 <w:color w:val="000000"/>
                 <w:sz w:val="17"/>
               </w:rPr>
-              <w:t>0.087</w:t>
+              <w:t>0.034</w:t>
+            </w:r>
+          </w:p>
+        </w:tc>
+      </w:tr>
+      <w:tr>
+        <w:trPr>
+          <w:cantSplit w:val="true"/>
+        </w:trPr>
+        <w:tc>
+          <w:tcPr>
+            <w:tcW w:type="dxa" w:w="1800"/>
+            <w:tcMar>
+              <w:top w:w="80" w:type="dxa"/>
+              <w:start w:w="120" w:type="dxa"/>
+              <w:bottom w:w="80" w:type="dxa"/>
+              <w:end w:w="120" w:type="dxa"/>
+            </w:tcMar>
+            <w:vAlign w:val="center"/>
+          </w:tcPr>
+          <w:p>
+            <w:pPr>
+              <w:pStyle w:val="TableText"/>
+              <w:jc w:val="left"/>
+            </w:pPr>
+            <w:r/>
+            <w:r>
+              <w:rPr>
+                <w:rFonts w:ascii="Calibri" w:hAnsi="Calibri"/>
+                <w:b w:val="0"/>
+                <w:color w:val="000000"/>
+                <w:sz w:val="17"/>
+              </w:rPr>
+              <w:t>XGBoost</w:t>
+            </w:r>
+          </w:p>
+        </w:tc>
+        <w:tc>
+          <w:tcPr>
+            <w:tcW w:type="dxa" w:w="1260"/>
+            <w:tcMar>
+              <w:top w:w="80" w:type="dxa"/>
+              <w:start w:w="120" w:type="dxa"/>
+              <w:bottom w:w="80" w:type="dxa"/>
+              <w:end w:w="120" w:type="dxa"/>
+            </w:tcMar>
+            <w:vAlign w:val="center"/>
+          </w:tcPr>
+          <w:p>
+            <w:pPr>
+              <w:pStyle w:val="TableText"/>
+              <w:jc w:val="center"/>
+            </w:pPr>
+            <w:r/>
+            <w:r>
+              <w:rPr>
+                <w:rFonts w:ascii="Calibri" w:hAnsi="Calibri"/>
+                <w:b w:val="0"/>
+                <w:color w:val="000000"/>
+                <w:sz w:val="17"/>
+              </w:rPr>
+              <w:t>0.961</w:t>
+            </w:r>
+          </w:p>
+        </w:tc>
+        <w:tc>
+          <w:tcPr>
+            <w:tcW w:type="dxa" w:w="1260"/>
+            <w:tcMar>
+              <w:top w:w="80" w:type="dxa"/>
+              <w:start w:w="120" w:type="dxa"/>
+              <w:bottom w:w="80" w:type="dxa"/>
+              <w:end w:w="120" w:type="dxa"/>
+            </w:tcMar>
+            <w:vAlign w:val="center"/>
+          </w:tcPr>
+          <w:p>
+            <w:pPr>
+              <w:pStyle w:val="TableText"/>
+              <w:jc w:val="center"/>
+            </w:pPr>
+            <w:r/>
+            <w:r>
+              <w:rPr>
+                <w:rFonts w:ascii="Calibri" w:hAnsi="Calibri"/>
+                <w:b w:val="0"/>
+                <w:color w:val="000000"/>
+                <w:sz w:val="17"/>
+              </w:rPr>
+              <w:t>0.977</w:t>
+            </w:r>
+          </w:p>
+        </w:tc>
+        <w:tc>
+          <w:tcPr>
+            <w:tcW w:type="dxa" w:w="1260"/>
+            <w:tcMar>
+              <w:top w:w="80" w:type="dxa"/>
+              <w:start w:w="120" w:type="dxa"/>
+              <w:bottom w:w="80" w:type="dxa"/>
+              <w:end w:w="120" w:type="dxa"/>
+            </w:tcMar>
+            <w:vAlign w:val="center"/>
+          </w:tcPr>
+          <w:p>
+            <w:pPr>
+              <w:pStyle w:val="TableText"/>
+              <w:jc w:val="center"/>
+            </w:pPr>
+            <w:r/>
+            <w:r>
+              <w:rPr>
+                <w:rFonts w:ascii="Calibri" w:hAnsi="Calibri"/>
+                <w:b w:val="0"/>
+                <w:color w:val="000000"/>
+                <w:sz w:val="17"/>
+              </w:rPr>
+              <w:t>0.075</w:t>
+            </w:r>
+          </w:p>
+        </w:tc>
+        <w:tc>
+          <w:tcPr>
+            <w:tcW w:type="dxa" w:w="1260"/>
+            <w:tcMar>
+              <w:top w:w="80" w:type="dxa"/>
+              <w:start w:w="120" w:type="dxa"/>
+              <w:bottom w:w="80" w:type="dxa"/>
+              <w:end w:w="120" w:type="dxa"/>
+            </w:tcMar>
+            <w:vAlign w:val="center"/>
+          </w:tcPr>
+          <w:p>
+            <w:pPr>
+              <w:pStyle w:val="TableText"/>
+              <w:jc w:val="center"/>
+            </w:pPr>
+            <w:r/>
+            <w:r>
+              <w:rPr>
+                <w:rFonts w:ascii="Calibri" w:hAnsi="Calibri"/>
+                <w:b w:val="0"/>
+                <w:color w:val="000000"/>
+                <w:sz w:val="17"/>
+              </w:rPr>
+              <w:t>0.245</w:t>
+            </w:r>
+          </w:p>
+        </w:tc>
+        <w:tc>
+          <w:tcPr>
+            <w:tcW w:type="dxa" w:w="1260"/>
+            <w:tcMar>
+              <w:top w:w="80" w:type="dxa"/>
+              <w:start w:w="120" w:type="dxa"/>
+              <w:bottom w:w="80" w:type="dxa"/>
+              <w:end w:w="120" w:type="dxa"/>
+            </w:tcMar>
+            <w:vAlign w:val="center"/>
+          </w:tcPr>
+          <w:p>
+            <w:pPr>
+              <w:pStyle w:val="TableText"/>
+              <w:jc w:val="center"/>
+            </w:pPr>
+            <w:r/>
+            <w:r>
+              <w:rPr>
+                <w:rFonts w:ascii="Calibri" w:hAnsi="Calibri"/>
+                <w:b w:val="0"/>
+                <w:color w:val="000000"/>
+                <w:sz w:val="17"/>
+              </w:rPr>
+              <w:t>1.057</w:t>
+            </w:r>
+          </w:p>
+        </w:tc>
+        <w:tc>
+          <w:tcPr>
+            <w:tcW w:type="dxa" w:w="1260"/>
+            <w:tcMar>
+              <w:top w:w="80" w:type="dxa"/>
+              <w:start w:w="120" w:type="dxa"/>
+              <w:bottom w:w="80" w:type="dxa"/>
+              <w:end w:w="120" w:type="dxa"/>
+            </w:tcMar>
+            <w:vAlign w:val="center"/>
+          </w:tcPr>
+          <w:p>
+            <w:pPr>
+              <w:pStyle w:val="TableText"/>
+              <w:jc w:val="center"/>
+            </w:pPr>
+            <w:r/>
+            <w:r>
+              <w:rPr>
+                <w:rFonts w:ascii="Calibri" w:hAnsi="Calibri"/>
+                <w:b w:val="0"/>
+                <w:color w:val="000000"/>
+                <w:sz w:val="17"/>
+              </w:rPr>
+              <w:t>0.021</w:t>
             </w:r>
           </w:p>
         </w:tc>
@@ -2898,7 +3099,7 @@
                 <w:color w:val="000000"/>
                 <w:sz w:val="17"/>
               </w:rPr>
-              <w:t>0.953</w:t>
+              <w:t>0.961</w:t>
             </w:r>
           </w:p>
         </w:tc>
@@ -2926,7 +3127,7 @@
                 <w:color w:val="000000"/>
                 <w:sz w:val="17"/>
               </w:rPr>
-              <w:t>0.973</w:t>
+              <w:t>0.978</w:t>
             </w:r>
           </w:p>
         </w:tc>
@@ -2954,7 +3155,7 @@
                 <w:color w:val="000000"/>
                 <w:sz w:val="17"/>
               </w:rPr>
-              <w:t>0.080</w:t>
+              <w:t>0.072</w:t>
             </w:r>
           </w:p>
         </w:tc>
@@ -2982,7 +3183,7 @@
                 <w:color w:val="000000"/>
                 <w:sz w:val="17"/>
               </w:rPr>
-              <w:t>0.290</w:t>
+              <w:t>0.245</w:t>
             </w:r>
           </w:p>
         </w:tc>
@@ -3010,7 +3211,7 @@
                 <w:color w:val="000000"/>
                 <w:sz w:val="17"/>
               </w:rPr>
-              <w:t>1.354</w:t>
+              <w:t>0.931</w:t>
             </w:r>
           </w:p>
         </w:tc>
@@ -3038,208 +3239,7 @@
                 <w:color w:val="000000"/>
                 <w:sz w:val="17"/>
               </w:rPr>
-              <w:t>0.085</w:t>
-            </w:r>
-          </w:p>
-        </w:tc>
-      </w:tr>
-      <w:tr>
-        <w:trPr>
-          <w:cantSplit w:val="true"/>
-        </w:trPr>
-        <w:tc>
-          <w:tcPr>
-            <w:tcW w:type="dxa" w:w="1800"/>
-            <w:tcMar>
-              <w:top w:w="80" w:type="dxa"/>
-              <w:start w:w="120" w:type="dxa"/>
-              <w:bottom w:w="80" w:type="dxa"/>
-              <w:end w:w="120" w:type="dxa"/>
-            </w:tcMar>
-            <w:vAlign w:val="center"/>
-          </w:tcPr>
-          <w:p>
-            <w:pPr>
-              <w:pStyle w:val="TableText"/>
-              <w:jc w:val="left"/>
-            </w:pPr>
-            <w:r/>
-            <w:r>
-              <w:rPr>
-                <w:rFonts w:ascii="Calibri" w:hAnsi="Calibri"/>
-                <w:b w:val="0"/>
-                <w:color w:val="000000"/>
-                <w:sz w:val="17"/>
-              </w:rPr>
-              <w:t>XGBoost</w:t>
-            </w:r>
-          </w:p>
-        </w:tc>
-        <w:tc>
-          <w:tcPr>
-            <w:tcW w:type="dxa" w:w="1260"/>
-            <w:tcMar>
-              <w:top w:w="80" w:type="dxa"/>
-              <w:start w:w="120" w:type="dxa"/>
-              <w:bottom w:w="80" w:type="dxa"/>
-              <w:end w:w="120" w:type="dxa"/>
-            </w:tcMar>
-            <w:vAlign w:val="center"/>
-          </w:tcPr>
-          <w:p>
-            <w:pPr>
-              <w:pStyle w:val="TableText"/>
-              <w:jc w:val="center"/>
-            </w:pPr>
-            <w:r/>
-            <w:r>
-              <w:rPr>
-                <w:rFonts w:ascii="Calibri" w:hAnsi="Calibri"/>
-                <w:b w:val="0"/>
-                <w:color w:val="000000"/>
-                <w:sz w:val="17"/>
-              </w:rPr>
-              <w:t>0.957</w:t>
-            </w:r>
-          </w:p>
-        </w:tc>
-        <w:tc>
-          <w:tcPr>
-            <w:tcW w:type="dxa" w:w="1260"/>
-            <w:tcMar>
-              <w:top w:w="80" w:type="dxa"/>
-              <w:start w:w="120" w:type="dxa"/>
-              <w:bottom w:w="80" w:type="dxa"/>
-              <w:end w:w="120" w:type="dxa"/>
-            </w:tcMar>
-            <w:vAlign w:val="center"/>
-          </w:tcPr>
-          <w:p>
-            <w:pPr>
-              <w:pStyle w:val="TableText"/>
-              <w:jc w:val="center"/>
-            </w:pPr>
-            <w:r/>
-            <w:r>
-              <w:rPr>
-                <w:rFonts w:ascii="Calibri" w:hAnsi="Calibri"/>
-                <w:b w:val="0"/>
-                <w:color w:val="000000"/>
-                <w:sz w:val="17"/>
-              </w:rPr>
-              <w:t>0.976</w:t>
-            </w:r>
-          </w:p>
-        </w:tc>
-        <w:tc>
-          <w:tcPr>
-            <w:tcW w:type="dxa" w:w="1260"/>
-            <w:tcMar>
-              <w:top w:w="80" w:type="dxa"/>
-              <w:start w:w="120" w:type="dxa"/>
-              <w:bottom w:w="80" w:type="dxa"/>
-              <w:end w:w="120" w:type="dxa"/>
-            </w:tcMar>
-            <w:vAlign w:val="center"/>
-          </w:tcPr>
-          <w:p>
-            <w:pPr>
-              <w:pStyle w:val="TableText"/>
-              <w:jc w:val="center"/>
-            </w:pPr>
-            <w:r/>
-            <w:r>
-              <w:rPr>
-                <w:rFonts w:ascii="Calibri" w:hAnsi="Calibri"/>
-                <w:b w:val="0"/>
-                <w:color w:val="000000"/>
-                <w:sz w:val="17"/>
-              </w:rPr>
-              <w:t>0.080</w:t>
-            </w:r>
-          </w:p>
-        </w:tc>
-        <w:tc>
-          <w:tcPr>
-            <w:tcW w:type="dxa" w:w="1260"/>
-            <w:tcMar>
-              <w:top w:w="80" w:type="dxa"/>
-              <w:start w:w="120" w:type="dxa"/>
-              <w:bottom w:w="80" w:type="dxa"/>
-              <w:end w:w="120" w:type="dxa"/>
-            </w:tcMar>
-            <w:vAlign w:val="center"/>
-          </w:tcPr>
-          <w:p>
-            <w:pPr>
-              <w:pStyle w:val="TableText"/>
-              <w:jc w:val="center"/>
-            </w:pPr>
-            <w:r/>
-            <w:r>
-              <w:rPr>
-                <w:rFonts w:ascii="Calibri" w:hAnsi="Calibri"/>
-                <w:b w:val="0"/>
-                <w:color w:val="000000"/>
-                <w:sz w:val="17"/>
-              </w:rPr>
-              <w:t>0.266</w:t>
-            </w:r>
-          </w:p>
-        </w:tc>
-        <w:tc>
-          <w:tcPr>
-            <w:tcW w:type="dxa" w:w="1260"/>
-            <w:tcMar>
-              <w:top w:w="80" w:type="dxa"/>
-              <w:start w:w="120" w:type="dxa"/>
-              <w:bottom w:w="80" w:type="dxa"/>
-              <w:end w:w="120" w:type="dxa"/>
-            </w:tcMar>
-            <w:vAlign w:val="center"/>
-          </w:tcPr>
-          <w:p>
-            <w:pPr>
-              <w:pStyle w:val="TableText"/>
-              <w:jc w:val="center"/>
-            </w:pPr>
-            <w:r/>
-            <w:r>
-              <w:rPr>
-                <w:rFonts w:ascii="Calibri" w:hAnsi="Calibri"/>
-                <w:b w:val="0"/>
-                <w:color w:val="000000"/>
-                <w:sz w:val="17"/>
-              </w:rPr>
-              <w:t>2.244</w:t>
-            </w:r>
-          </w:p>
-        </w:tc>
-        <w:tc>
-          <w:tcPr>
-            <w:tcW w:type="dxa" w:w="1260"/>
-            <w:tcMar>
-              <w:top w:w="80" w:type="dxa"/>
-              <w:start w:w="120" w:type="dxa"/>
-              <w:bottom w:w="80" w:type="dxa"/>
-              <w:end w:w="120" w:type="dxa"/>
-            </w:tcMar>
-            <w:vAlign w:val="center"/>
-          </w:tcPr>
-          <w:p>
-            <w:pPr>
-              <w:pStyle w:val="TableText"/>
-              <w:jc w:val="center"/>
-            </w:pPr>
-            <w:r/>
-            <w:r>
-              <w:rPr>
-                <w:rFonts w:ascii="Calibri" w:hAnsi="Calibri"/>
-                <w:b w:val="0"/>
-                <w:color w:val="000000"/>
-                <w:sz w:val="17"/>
-              </w:rPr>
-              <w:t>0.085</w:t>
+              <w:t>0.029</w:t>
             </w:r>
           </w:p>
         </w:tc>
@@ -3300,7 +3300,7 @@
                 <w:color w:val="000000"/>
                 <w:sz w:val="17"/>
               </w:rPr>
-              <w:t>0.957</w:t>
+              <w:t>0.955</w:t>
             </w:r>
           </w:p>
         </w:tc>
@@ -3328,7 +3328,7 @@
                 <w:color w:val="000000"/>
                 <w:sz w:val="17"/>
               </w:rPr>
-              <w:t>0.976</w:t>
+              <w:t>0.974</w:t>
             </w:r>
           </w:p>
         </w:tc>
@@ -3356,7 +3356,7 @@
                 <w:color w:val="000000"/>
                 <w:sz w:val="17"/>
               </w:rPr>
-              <w:t>0.086</w:t>
+              <w:t>0.081</w:t>
             </w:r>
           </w:p>
         </w:tc>
@@ -3384,7 +3384,7 @@
                 <w:color w:val="000000"/>
                 <w:sz w:val="17"/>
               </w:rPr>
-              <w:t>0.285</w:t>
+              <w:t>0.262</w:t>
             </w:r>
           </w:p>
         </w:tc>
@@ -3412,7 +3412,7 @@
                 <w:color w:val="000000"/>
                 <w:sz w:val="17"/>
               </w:rPr>
-              <w:t>1.431</w:t>
+              <w:t>0.989</w:t>
             </w:r>
           </w:p>
         </w:tc>
@@ -3440,7 +3440,7 @@
                 <w:color w:val="000000"/>
                 <w:sz w:val="17"/>
               </w:rPr>
-              <w:t>0.091</w:t>
+              <w:t>0.024</w:t>
             </w:r>
           </w:p>
         </w:tc>
@@ -5017,7 +5017,1309 @@
           <w:rFonts w:ascii="Calibri" w:hAnsi="Calibri"/>
           <w:color w:val="000000"/>
         </w:rPr>
-        <w:t>Historical 10,000-row BRFSS smoke studies remain engineering evidence. A future final estimate still requires a different prespecified concealed manifest and one authorized execution after protocol freeze. Hospital130 remains outside the diabetes-screening result family because its endpoint is 30-day readmission.</w:t>
+        <w:t>Historical 10,000-row BRFSS smoke studies remain engineering evidence. A future final estimate still requires a different prespecified concealed manifest and one authorized execution after protocol freeze.</w:t>
+      </w:r>
+    </w:p>
+    <w:p>
+      <w:pPr>
+        <w:pStyle w:val="Heading2"/>
+        <w:keepNext w:val="0"/>
+        <w:jc w:val="left"/>
+      </w:pPr>
+      <w:r>
+        <w:rPr>
+          <w:rFonts w:ascii="Calibri" w:hAnsi="Calibri"/>
+          <w:color w:val="000000"/>
+        </w:rPr>
+        <w:t>3.7 Separate Hospital130 readmission development analysis</w:t>
+      </w:r>
+    </w:p>
+    <w:p>
+      <w:pPr>
+        <w:jc w:val="left"/>
+      </w:pPr>
+      <w:r>
+        <w:rPr>
+          <w:rFonts w:ascii="Calibri" w:hAnsi="Calibri"/>
+          <w:color w:val="000000"/>
+        </w:rPr>
+        <w:t>Hospital130 remains outside the diabetes-screening result family because its endpoint is readmission within 30 days. After excluding death and hospice dispositions, 99,343 encounters from 69,990 patients remained (11,314 positive; 11.39% prevalence). Patient-grouped splitting assigned 79,475 encounters to five development folds and 19,868 encounters from 14,003 patients to the development test role, with no patient crossing the partitions or development folds.</w:t>
+      </w:r>
+    </w:p>
+    <w:p>
+      <w:pPr>
+        <w:jc w:val="left"/>
+      </w:pPr>
+      <w:r>
+        <w:rPr>
+          <w:rFonts w:ascii="Calibri" w:hAnsi="Calibri"/>
+          <w:b/>
+          <w:color w:val="000000"/>
+        </w:rPr>
+        <w:t>Table 4. Hospital130 calibrated full-development performance on the patient-grouped development test partition</w:t>
+      </w:r>
+    </w:p>
+    <w:tbl>
+      <w:tblPr>
+        <w:tblStyle w:val="TableGrid"/>
+        <w:tblW w:type="dxa" w:w="9360"/>
+        <w:jc w:val="left"/>
+        <w:tblLayout w:type="fixed"/>
+        <w:tblLook w:firstColumn="1" w:firstRow="1" w:lastColumn="0" w:lastRow="0" w:noHBand="0" w:noVBand="1" w:val="04A0"/>
+        <w:tblInd w:w="120" w:type="dxa"/>
+      </w:tblPr>
+      <w:tblGrid>
+        <w:gridCol w:w="1800"/>
+        <w:gridCol w:w="1260"/>
+        <w:gridCol w:w="1260"/>
+        <w:gridCol w:w="1260"/>
+        <w:gridCol w:w="1260"/>
+        <w:gridCol w:w="1260"/>
+        <w:gridCol w:w="1260"/>
+      </w:tblGrid>
+      <w:tr>
+        <w:trPr>
+          <w:tblHeader w:val="true"/>
+          <w:cantSplit w:val="true"/>
+        </w:trPr>
+        <w:tc>
+          <w:tcPr>
+            <w:tcW w:type="dxa" w:w="1800"/>
+            <w:tcMar>
+              <w:top w:w="80" w:type="dxa"/>
+              <w:start w:w="120" w:type="dxa"/>
+              <w:bottom w:w="80" w:type="dxa"/>
+              <w:end w:w="120" w:type="dxa"/>
+            </w:tcMar>
+            <w:vAlign w:val="center"/>
+            <w:shd w:fill="1F4D78"/>
+          </w:tcPr>
+          <w:p>
+            <w:pPr>
+              <w:pStyle w:val="TableText"/>
+              <w:jc w:val="center"/>
+            </w:pPr>
+            <w:r/>
+            <w:r>
+              <w:rPr>
+                <w:rFonts w:ascii="Calibri" w:hAnsi="Calibri"/>
+                <w:b/>
+                <w:color w:val="FFFFFF"/>
+                <w:sz w:val="17"/>
+              </w:rPr>
+              <w:t>Model</w:t>
+            </w:r>
+          </w:p>
+        </w:tc>
+        <w:tc>
+          <w:tcPr>
+            <w:tcW w:type="dxa" w:w="1260"/>
+            <w:tcMar>
+              <w:top w:w="80" w:type="dxa"/>
+              <w:start w:w="120" w:type="dxa"/>
+              <w:bottom w:w="80" w:type="dxa"/>
+              <w:end w:w="120" w:type="dxa"/>
+            </w:tcMar>
+            <w:vAlign w:val="center"/>
+            <w:shd w:fill="1F4D78"/>
+          </w:tcPr>
+          <w:p>
+            <w:pPr>
+              <w:pStyle w:val="TableText"/>
+              <w:jc w:val="center"/>
+            </w:pPr>
+            <w:r/>
+            <w:r>
+              <w:rPr>
+                <w:rFonts w:ascii="Calibri" w:hAnsi="Calibri"/>
+                <w:b/>
+                <w:color w:val="FFFFFF"/>
+                <w:sz w:val="17"/>
+              </w:rPr>
+              <w:t>AUROC</w:t>
+            </w:r>
+          </w:p>
+        </w:tc>
+        <w:tc>
+          <w:tcPr>
+            <w:tcW w:type="dxa" w:w="1260"/>
+            <w:tcMar>
+              <w:top w:w="80" w:type="dxa"/>
+              <w:start w:w="120" w:type="dxa"/>
+              <w:bottom w:w="80" w:type="dxa"/>
+              <w:end w:w="120" w:type="dxa"/>
+            </w:tcMar>
+            <w:vAlign w:val="center"/>
+            <w:shd w:fill="1F4D78"/>
+          </w:tcPr>
+          <w:p>
+            <w:pPr>
+              <w:pStyle w:val="TableText"/>
+              <w:jc w:val="center"/>
+            </w:pPr>
+            <w:r/>
+            <w:r>
+              <w:rPr>
+                <w:rFonts w:ascii="Calibri" w:hAnsi="Calibri"/>
+                <w:b/>
+                <w:color w:val="FFFFFF"/>
+                <w:sz w:val="17"/>
+              </w:rPr>
+              <w:t>Average precision</w:t>
+            </w:r>
+          </w:p>
+        </w:tc>
+        <w:tc>
+          <w:tcPr>
+            <w:tcW w:type="dxa" w:w="1260"/>
+            <w:tcMar>
+              <w:top w:w="80" w:type="dxa"/>
+              <w:start w:w="120" w:type="dxa"/>
+              <w:bottom w:w="80" w:type="dxa"/>
+              <w:end w:w="120" w:type="dxa"/>
+            </w:tcMar>
+            <w:vAlign w:val="center"/>
+            <w:shd w:fill="1F4D78"/>
+          </w:tcPr>
+          <w:p>
+            <w:pPr>
+              <w:pStyle w:val="TableText"/>
+              <w:jc w:val="center"/>
+            </w:pPr>
+            <w:r/>
+            <w:r>
+              <w:rPr>
+                <w:rFonts w:ascii="Calibri" w:hAnsi="Calibri"/>
+                <w:b/>
+                <w:color w:val="FFFFFF"/>
+                <w:sz w:val="17"/>
+              </w:rPr>
+              <w:t>Brier</w:t>
+            </w:r>
+          </w:p>
+        </w:tc>
+        <w:tc>
+          <w:tcPr>
+            <w:tcW w:type="dxa" w:w="1260"/>
+            <w:tcMar>
+              <w:top w:w="80" w:type="dxa"/>
+              <w:start w:w="120" w:type="dxa"/>
+              <w:bottom w:w="80" w:type="dxa"/>
+              <w:end w:w="120" w:type="dxa"/>
+            </w:tcMar>
+            <w:vAlign w:val="center"/>
+            <w:shd w:fill="1F4D78"/>
+          </w:tcPr>
+          <w:p>
+            <w:pPr>
+              <w:pStyle w:val="TableText"/>
+              <w:jc w:val="center"/>
+            </w:pPr>
+            <w:r/>
+            <w:r>
+              <w:rPr>
+                <w:rFonts w:ascii="Calibri" w:hAnsi="Calibri"/>
+                <w:b/>
+                <w:color w:val="FFFFFF"/>
+                <w:sz w:val="17"/>
+              </w:rPr>
+              <w:t>Log loss</w:t>
+            </w:r>
+          </w:p>
+        </w:tc>
+        <w:tc>
+          <w:tcPr>
+            <w:tcW w:type="dxa" w:w="1260"/>
+            <w:tcMar>
+              <w:top w:w="80" w:type="dxa"/>
+              <w:start w:w="120" w:type="dxa"/>
+              <w:bottom w:w="80" w:type="dxa"/>
+              <w:end w:w="120" w:type="dxa"/>
+            </w:tcMar>
+            <w:vAlign w:val="center"/>
+            <w:shd w:fill="1F4D78"/>
+          </w:tcPr>
+          <w:p>
+            <w:pPr>
+              <w:pStyle w:val="TableText"/>
+              <w:jc w:val="center"/>
+            </w:pPr>
+            <w:r/>
+            <w:r>
+              <w:rPr>
+                <w:rFonts w:ascii="Calibri" w:hAnsi="Calibri"/>
+                <w:b/>
+                <w:color w:val="FFFFFF"/>
+                <w:sz w:val="17"/>
+              </w:rPr>
+              <w:t>Calibration slope</w:t>
+            </w:r>
+          </w:p>
+        </w:tc>
+        <w:tc>
+          <w:tcPr>
+            <w:tcW w:type="dxa" w:w="1260"/>
+            <w:tcMar>
+              <w:top w:w="80" w:type="dxa"/>
+              <w:start w:w="120" w:type="dxa"/>
+              <w:bottom w:w="80" w:type="dxa"/>
+              <w:end w:w="120" w:type="dxa"/>
+            </w:tcMar>
+            <w:vAlign w:val="center"/>
+            <w:shd w:fill="1F4D78"/>
+          </w:tcPr>
+          <w:p>
+            <w:pPr>
+              <w:pStyle w:val="TableText"/>
+              <w:jc w:val="center"/>
+            </w:pPr>
+            <w:r/>
+            <w:r>
+              <w:rPr>
+                <w:rFonts w:ascii="Calibri" w:hAnsi="Calibri"/>
+                <w:b/>
+                <w:color w:val="FFFFFF"/>
+                <w:sz w:val="17"/>
+              </w:rPr>
+              <w:t>ECE</w:t>
+            </w:r>
+          </w:p>
+        </w:tc>
+      </w:tr>
+      <w:tr>
+        <w:trPr>
+          <w:cantSplit w:val="true"/>
+        </w:trPr>
+        <w:tc>
+          <w:tcPr>
+            <w:tcW w:type="dxa" w:w="1800"/>
+            <w:tcMar>
+              <w:top w:w="80" w:type="dxa"/>
+              <w:start w:w="120" w:type="dxa"/>
+              <w:bottom w:w="80" w:type="dxa"/>
+              <w:end w:w="120" w:type="dxa"/>
+            </w:tcMar>
+            <w:vAlign w:val="center"/>
+          </w:tcPr>
+          <w:p>
+            <w:pPr>
+              <w:pStyle w:val="TableText"/>
+              <w:jc w:val="left"/>
+            </w:pPr>
+            <w:r/>
+            <w:r>
+              <w:rPr>
+                <w:rFonts w:ascii="Calibri" w:hAnsi="Calibri"/>
+                <w:b w:val="0"/>
+                <w:color w:val="000000"/>
+                <w:sz w:val="17"/>
+              </w:rPr>
+              <w:t>LightGBM</w:t>
+            </w:r>
+          </w:p>
+        </w:tc>
+        <w:tc>
+          <w:tcPr>
+            <w:tcW w:type="dxa" w:w="1260"/>
+            <w:tcMar>
+              <w:top w:w="80" w:type="dxa"/>
+              <w:start w:w="120" w:type="dxa"/>
+              <w:bottom w:w="80" w:type="dxa"/>
+              <w:end w:w="120" w:type="dxa"/>
+            </w:tcMar>
+            <w:vAlign w:val="center"/>
+          </w:tcPr>
+          <w:p>
+            <w:pPr>
+              <w:pStyle w:val="TableText"/>
+              <w:jc w:val="center"/>
+            </w:pPr>
+            <w:r/>
+            <w:r>
+              <w:rPr>
+                <w:rFonts w:ascii="Calibri" w:hAnsi="Calibri"/>
+                <w:b w:val="0"/>
+                <w:color w:val="000000"/>
+                <w:sz w:val="17"/>
+              </w:rPr>
+              <w:t>0.679</w:t>
+            </w:r>
+          </w:p>
+        </w:tc>
+        <w:tc>
+          <w:tcPr>
+            <w:tcW w:type="dxa" w:w="1260"/>
+            <w:tcMar>
+              <w:top w:w="80" w:type="dxa"/>
+              <w:start w:w="120" w:type="dxa"/>
+              <w:bottom w:w="80" w:type="dxa"/>
+              <w:end w:w="120" w:type="dxa"/>
+            </w:tcMar>
+            <w:vAlign w:val="center"/>
+          </w:tcPr>
+          <w:p>
+            <w:pPr>
+              <w:pStyle w:val="TableText"/>
+              <w:jc w:val="center"/>
+            </w:pPr>
+            <w:r/>
+            <w:r>
+              <w:rPr>
+                <w:rFonts w:ascii="Calibri" w:hAnsi="Calibri"/>
+                <w:b w:val="0"/>
+                <w:color w:val="000000"/>
+                <w:sz w:val="17"/>
+              </w:rPr>
+              <w:t>0.229</w:t>
+            </w:r>
+          </w:p>
+        </w:tc>
+        <w:tc>
+          <w:tcPr>
+            <w:tcW w:type="dxa" w:w="1260"/>
+            <w:tcMar>
+              <w:top w:w="80" w:type="dxa"/>
+              <w:start w:w="120" w:type="dxa"/>
+              <w:bottom w:w="80" w:type="dxa"/>
+              <w:end w:w="120" w:type="dxa"/>
+            </w:tcMar>
+            <w:vAlign w:val="center"/>
+          </w:tcPr>
+          <w:p>
+            <w:pPr>
+              <w:pStyle w:val="TableText"/>
+              <w:jc w:val="center"/>
+            </w:pPr>
+            <w:r/>
+            <w:r>
+              <w:rPr>
+                <w:rFonts w:ascii="Calibri" w:hAnsi="Calibri"/>
+                <w:b w:val="0"/>
+                <w:color w:val="000000"/>
+                <w:sz w:val="17"/>
+              </w:rPr>
+              <w:t>0.0958</w:t>
+            </w:r>
+          </w:p>
+        </w:tc>
+        <w:tc>
+          <w:tcPr>
+            <w:tcW w:type="dxa" w:w="1260"/>
+            <w:tcMar>
+              <w:top w:w="80" w:type="dxa"/>
+              <w:start w:w="120" w:type="dxa"/>
+              <w:bottom w:w="80" w:type="dxa"/>
+              <w:end w:w="120" w:type="dxa"/>
+            </w:tcMar>
+            <w:vAlign w:val="center"/>
+          </w:tcPr>
+          <w:p>
+            <w:pPr>
+              <w:pStyle w:val="TableText"/>
+              <w:jc w:val="center"/>
+            </w:pPr>
+            <w:r/>
+            <w:r>
+              <w:rPr>
+                <w:rFonts w:ascii="Calibri" w:hAnsi="Calibri"/>
+                <w:b w:val="0"/>
+                <w:color w:val="000000"/>
+                <w:sz w:val="17"/>
+              </w:rPr>
+              <w:t>0.3327</w:t>
+            </w:r>
+          </w:p>
+        </w:tc>
+        <w:tc>
+          <w:tcPr>
+            <w:tcW w:type="dxa" w:w="1260"/>
+            <w:tcMar>
+              <w:top w:w="80" w:type="dxa"/>
+              <w:start w:w="120" w:type="dxa"/>
+              <w:bottom w:w="80" w:type="dxa"/>
+              <w:end w:w="120" w:type="dxa"/>
+            </w:tcMar>
+            <w:vAlign w:val="center"/>
+          </w:tcPr>
+          <w:p>
+            <w:pPr>
+              <w:pStyle w:val="TableText"/>
+              <w:jc w:val="center"/>
+            </w:pPr>
+            <w:r/>
+            <w:r>
+              <w:rPr>
+                <w:rFonts w:ascii="Calibri" w:hAnsi="Calibri"/>
+                <w:b w:val="0"/>
+                <w:color w:val="000000"/>
+                <w:sz w:val="17"/>
+              </w:rPr>
+              <w:t>1.019</w:t>
+            </w:r>
+          </w:p>
+        </w:tc>
+        <w:tc>
+          <w:tcPr>
+            <w:tcW w:type="dxa" w:w="1260"/>
+            <w:tcMar>
+              <w:top w:w="80" w:type="dxa"/>
+              <w:start w:w="120" w:type="dxa"/>
+              <w:bottom w:w="80" w:type="dxa"/>
+              <w:end w:w="120" w:type="dxa"/>
+            </w:tcMar>
+            <w:vAlign w:val="center"/>
+          </w:tcPr>
+          <w:p>
+            <w:pPr>
+              <w:pStyle w:val="TableText"/>
+              <w:jc w:val="center"/>
+            </w:pPr>
+            <w:r/>
+            <w:r>
+              <w:rPr>
+                <w:rFonts w:ascii="Calibri" w:hAnsi="Calibri"/>
+                <w:b w:val="0"/>
+                <w:color w:val="000000"/>
+                <w:sz w:val="17"/>
+              </w:rPr>
+              <w:t>0.0066</w:t>
+            </w:r>
+          </w:p>
+        </w:tc>
+      </w:tr>
+      <w:tr>
+        <w:trPr>
+          <w:cantSplit w:val="true"/>
+        </w:trPr>
+        <w:tc>
+          <w:tcPr>
+            <w:tcW w:type="dxa" w:w="1800"/>
+            <w:tcMar>
+              <w:top w:w="80" w:type="dxa"/>
+              <w:start w:w="120" w:type="dxa"/>
+              <w:bottom w:w="80" w:type="dxa"/>
+              <w:end w:w="120" w:type="dxa"/>
+            </w:tcMar>
+            <w:vAlign w:val="center"/>
+          </w:tcPr>
+          <w:p>
+            <w:pPr>
+              <w:pStyle w:val="TableText"/>
+              <w:jc w:val="left"/>
+            </w:pPr>
+            <w:r/>
+            <w:r>
+              <w:rPr>
+                <w:rFonts w:ascii="Calibri" w:hAnsi="Calibri"/>
+                <w:b w:val="0"/>
+                <w:color w:val="000000"/>
+                <w:sz w:val="17"/>
+              </w:rPr>
+              <w:t>XGBoost</w:t>
+            </w:r>
+          </w:p>
+        </w:tc>
+        <w:tc>
+          <w:tcPr>
+            <w:tcW w:type="dxa" w:w="1260"/>
+            <w:tcMar>
+              <w:top w:w="80" w:type="dxa"/>
+              <w:start w:w="120" w:type="dxa"/>
+              <w:bottom w:w="80" w:type="dxa"/>
+              <w:end w:w="120" w:type="dxa"/>
+            </w:tcMar>
+            <w:vAlign w:val="center"/>
+          </w:tcPr>
+          <w:p>
+            <w:pPr>
+              <w:pStyle w:val="TableText"/>
+              <w:jc w:val="center"/>
+            </w:pPr>
+            <w:r/>
+            <w:r>
+              <w:rPr>
+                <w:rFonts w:ascii="Calibri" w:hAnsi="Calibri"/>
+                <w:b w:val="0"/>
+                <w:color w:val="000000"/>
+                <w:sz w:val="17"/>
+              </w:rPr>
+              <w:t>0.678</w:t>
+            </w:r>
+          </w:p>
+        </w:tc>
+        <w:tc>
+          <w:tcPr>
+            <w:tcW w:type="dxa" w:w="1260"/>
+            <w:tcMar>
+              <w:top w:w="80" w:type="dxa"/>
+              <w:start w:w="120" w:type="dxa"/>
+              <w:bottom w:w="80" w:type="dxa"/>
+              <w:end w:w="120" w:type="dxa"/>
+            </w:tcMar>
+            <w:vAlign w:val="center"/>
+          </w:tcPr>
+          <w:p>
+            <w:pPr>
+              <w:pStyle w:val="TableText"/>
+              <w:jc w:val="center"/>
+            </w:pPr>
+            <w:r/>
+            <w:r>
+              <w:rPr>
+                <w:rFonts w:ascii="Calibri" w:hAnsi="Calibri"/>
+                <w:b w:val="0"/>
+                <w:color w:val="000000"/>
+                <w:sz w:val="17"/>
+              </w:rPr>
+              <w:t>0.227</w:t>
+            </w:r>
+          </w:p>
+        </w:tc>
+        <w:tc>
+          <w:tcPr>
+            <w:tcW w:type="dxa" w:w="1260"/>
+            <w:tcMar>
+              <w:top w:w="80" w:type="dxa"/>
+              <w:start w:w="120" w:type="dxa"/>
+              <w:bottom w:w="80" w:type="dxa"/>
+              <w:end w:w="120" w:type="dxa"/>
+            </w:tcMar>
+            <w:vAlign w:val="center"/>
+          </w:tcPr>
+          <w:p>
+            <w:pPr>
+              <w:pStyle w:val="TableText"/>
+              <w:jc w:val="center"/>
+            </w:pPr>
+            <w:r/>
+            <w:r>
+              <w:rPr>
+                <w:rFonts w:ascii="Calibri" w:hAnsi="Calibri"/>
+                <w:b w:val="0"/>
+                <w:color w:val="000000"/>
+                <w:sz w:val="17"/>
+              </w:rPr>
+              <w:t>0.0959</w:t>
+            </w:r>
+          </w:p>
+        </w:tc>
+        <w:tc>
+          <w:tcPr>
+            <w:tcW w:type="dxa" w:w="1260"/>
+            <w:tcMar>
+              <w:top w:w="80" w:type="dxa"/>
+              <w:start w:w="120" w:type="dxa"/>
+              <w:bottom w:w="80" w:type="dxa"/>
+              <w:end w:w="120" w:type="dxa"/>
+            </w:tcMar>
+            <w:vAlign w:val="center"/>
+          </w:tcPr>
+          <w:p>
+            <w:pPr>
+              <w:pStyle w:val="TableText"/>
+              <w:jc w:val="center"/>
+            </w:pPr>
+            <w:r/>
+            <w:r>
+              <w:rPr>
+                <w:rFonts w:ascii="Calibri" w:hAnsi="Calibri"/>
+                <w:b w:val="0"/>
+                <w:color w:val="000000"/>
+                <w:sz w:val="17"/>
+              </w:rPr>
+              <w:t>0.3331</w:t>
+            </w:r>
+          </w:p>
+        </w:tc>
+        <w:tc>
+          <w:tcPr>
+            <w:tcW w:type="dxa" w:w="1260"/>
+            <w:tcMar>
+              <w:top w:w="80" w:type="dxa"/>
+              <w:start w:w="120" w:type="dxa"/>
+              <w:bottom w:w="80" w:type="dxa"/>
+              <w:end w:w="120" w:type="dxa"/>
+            </w:tcMar>
+            <w:vAlign w:val="center"/>
+          </w:tcPr>
+          <w:p>
+            <w:pPr>
+              <w:pStyle w:val="TableText"/>
+              <w:jc w:val="center"/>
+            </w:pPr>
+            <w:r/>
+            <w:r>
+              <w:rPr>
+                <w:rFonts w:ascii="Calibri" w:hAnsi="Calibri"/>
+                <w:b w:val="0"/>
+                <w:color w:val="000000"/>
+                <w:sz w:val="17"/>
+              </w:rPr>
+              <w:t>1.029</w:t>
+            </w:r>
+          </w:p>
+        </w:tc>
+        <w:tc>
+          <w:tcPr>
+            <w:tcW w:type="dxa" w:w="1260"/>
+            <w:tcMar>
+              <w:top w:w="80" w:type="dxa"/>
+              <w:start w:w="120" w:type="dxa"/>
+              <w:bottom w:w="80" w:type="dxa"/>
+              <w:end w:w="120" w:type="dxa"/>
+            </w:tcMar>
+            <w:vAlign w:val="center"/>
+          </w:tcPr>
+          <w:p>
+            <w:pPr>
+              <w:pStyle w:val="TableText"/>
+              <w:jc w:val="center"/>
+            </w:pPr>
+            <w:r/>
+            <w:r>
+              <w:rPr>
+                <w:rFonts w:ascii="Calibri" w:hAnsi="Calibri"/>
+                <w:b w:val="0"/>
+                <w:color w:val="000000"/>
+                <w:sz w:val="17"/>
+              </w:rPr>
+              <w:t>0.0053</w:t>
+            </w:r>
+          </w:p>
+        </w:tc>
+      </w:tr>
+      <w:tr>
+        <w:trPr>
+          <w:cantSplit w:val="true"/>
+        </w:trPr>
+        <w:tc>
+          <w:tcPr>
+            <w:tcW w:type="dxa" w:w="1800"/>
+            <w:tcMar>
+              <w:top w:w="80" w:type="dxa"/>
+              <w:start w:w="120" w:type="dxa"/>
+              <w:bottom w:w="80" w:type="dxa"/>
+              <w:end w:w="120" w:type="dxa"/>
+            </w:tcMar>
+            <w:vAlign w:val="center"/>
+          </w:tcPr>
+          <w:p>
+            <w:pPr>
+              <w:pStyle w:val="TableText"/>
+              <w:jc w:val="left"/>
+            </w:pPr>
+            <w:r/>
+            <w:r>
+              <w:rPr>
+                <w:rFonts w:ascii="Calibri" w:hAnsi="Calibri"/>
+                <w:b w:val="0"/>
+                <w:color w:val="000000"/>
+                <w:sz w:val="17"/>
+              </w:rPr>
+              <w:t>CatBoost</w:t>
+            </w:r>
+          </w:p>
+        </w:tc>
+        <w:tc>
+          <w:tcPr>
+            <w:tcW w:type="dxa" w:w="1260"/>
+            <w:tcMar>
+              <w:top w:w="80" w:type="dxa"/>
+              <w:start w:w="120" w:type="dxa"/>
+              <w:bottom w:w="80" w:type="dxa"/>
+              <w:end w:w="120" w:type="dxa"/>
+            </w:tcMar>
+            <w:vAlign w:val="center"/>
+          </w:tcPr>
+          <w:p>
+            <w:pPr>
+              <w:pStyle w:val="TableText"/>
+              <w:jc w:val="center"/>
+            </w:pPr>
+            <w:r/>
+            <w:r>
+              <w:rPr>
+                <w:rFonts w:ascii="Calibri" w:hAnsi="Calibri"/>
+                <w:b w:val="0"/>
+                <w:color w:val="000000"/>
+                <w:sz w:val="17"/>
+              </w:rPr>
+              <w:t>0.678</w:t>
+            </w:r>
+          </w:p>
+        </w:tc>
+        <w:tc>
+          <w:tcPr>
+            <w:tcW w:type="dxa" w:w="1260"/>
+            <w:tcMar>
+              <w:top w:w="80" w:type="dxa"/>
+              <w:start w:w="120" w:type="dxa"/>
+              <w:bottom w:w="80" w:type="dxa"/>
+              <w:end w:w="120" w:type="dxa"/>
+            </w:tcMar>
+            <w:vAlign w:val="center"/>
+          </w:tcPr>
+          <w:p>
+            <w:pPr>
+              <w:pStyle w:val="TableText"/>
+              <w:jc w:val="center"/>
+            </w:pPr>
+            <w:r/>
+            <w:r>
+              <w:rPr>
+                <w:rFonts w:ascii="Calibri" w:hAnsi="Calibri"/>
+                <w:b w:val="0"/>
+                <w:color w:val="000000"/>
+                <w:sz w:val="17"/>
+              </w:rPr>
+              <w:t>0.229</w:t>
+            </w:r>
+          </w:p>
+        </w:tc>
+        <w:tc>
+          <w:tcPr>
+            <w:tcW w:type="dxa" w:w="1260"/>
+            <w:tcMar>
+              <w:top w:w="80" w:type="dxa"/>
+              <w:start w:w="120" w:type="dxa"/>
+              <w:bottom w:w="80" w:type="dxa"/>
+              <w:end w:w="120" w:type="dxa"/>
+            </w:tcMar>
+            <w:vAlign w:val="center"/>
+          </w:tcPr>
+          <w:p>
+            <w:pPr>
+              <w:pStyle w:val="TableText"/>
+              <w:jc w:val="center"/>
+            </w:pPr>
+            <w:r/>
+            <w:r>
+              <w:rPr>
+                <w:rFonts w:ascii="Calibri" w:hAnsi="Calibri"/>
+                <w:b w:val="0"/>
+                <w:color w:val="000000"/>
+                <w:sz w:val="17"/>
+              </w:rPr>
+              <w:t>0.0959</w:t>
+            </w:r>
+          </w:p>
+        </w:tc>
+        <w:tc>
+          <w:tcPr>
+            <w:tcW w:type="dxa" w:w="1260"/>
+            <w:tcMar>
+              <w:top w:w="80" w:type="dxa"/>
+              <w:start w:w="120" w:type="dxa"/>
+              <w:bottom w:w="80" w:type="dxa"/>
+              <w:end w:w="120" w:type="dxa"/>
+            </w:tcMar>
+            <w:vAlign w:val="center"/>
+          </w:tcPr>
+          <w:p>
+            <w:pPr>
+              <w:pStyle w:val="TableText"/>
+              <w:jc w:val="center"/>
+            </w:pPr>
+            <w:r/>
+            <w:r>
+              <w:rPr>
+                <w:rFonts w:ascii="Calibri" w:hAnsi="Calibri"/>
+                <w:b w:val="0"/>
+                <w:color w:val="000000"/>
+                <w:sz w:val="17"/>
+              </w:rPr>
+              <w:t>0.3330</w:t>
+            </w:r>
+          </w:p>
+        </w:tc>
+        <w:tc>
+          <w:tcPr>
+            <w:tcW w:type="dxa" w:w="1260"/>
+            <w:tcMar>
+              <w:top w:w="80" w:type="dxa"/>
+              <w:start w:w="120" w:type="dxa"/>
+              <w:bottom w:w="80" w:type="dxa"/>
+              <w:end w:w="120" w:type="dxa"/>
+            </w:tcMar>
+            <w:vAlign w:val="center"/>
+          </w:tcPr>
+          <w:p>
+            <w:pPr>
+              <w:pStyle w:val="TableText"/>
+              <w:jc w:val="center"/>
+            </w:pPr>
+            <w:r/>
+            <w:r>
+              <w:rPr>
+                <w:rFonts w:ascii="Calibri" w:hAnsi="Calibri"/>
+                <w:b w:val="0"/>
+                <w:color w:val="000000"/>
+                <w:sz w:val="17"/>
+              </w:rPr>
+              <w:t>1.028</w:t>
+            </w:r>
+          </w:p>
+        </w:tc>
+        <w:tc>
+          <w:tcPr>
+            <w:tcW w:type="dxa" w:w="1260"/>
+            <w:tcMar>
+              <w:top w:w="80" w:type="dxa"/>
+              <w:start w:w="120" w:type="dxa"/>
+              <w:bottom w:w="80" w:type="dxa"/>
+              <w:end w:w="120" w:type="dxa"/>
+            </w:tcMar>
+            <w:vAlign w:val="center"/>
+          </w:tcPr>
+          <w:p>
+            <w:pPr>
+              <w:pStyle w:val="TableText"/>
+              <w:jc w:val="center"/>
+            </w:pPr>
+            <w:r/>
+            <w:r>
+              <w:rPr>
+                <w:rFonts w:ascii="Calibri" w:hAnsi="Calibri"/>
+                <w:b w:val="0"/>
+                <w:color w:val="000000"/>
+                <w:sz w:val="17"/>
+              </w:rPr>
+              <w:t>0.0070</w:t>
+            </w:r>
+          </w:p>
+        </w:tc>
+      </w:tr>
+      <w:tr>
+        <w:trPr>
+          <w:cantSplit w:val="true"/>
+        </w:trPr>
+        <w:tc>
+          <w:tcPr>
+            <w:tcW w:type="dxa" w:w="1800"/>
+            <w:tcMar>
+              <w:top w:w="80" w:type="dxa"/>
+              <w:start w:w="120" w:type="dxa"/>
+              <w:bottom w:w="80" w:type="dxa"/>
+              <w:end w:w="120" w:type="dxa"/>
+            </w:tcMar>
+            <w:vAlign w:val="center"/>
+          </w:tcPr>
+          <w:p>
+            <w:pPr>
+              <w:pStyle w:val="TableText"/>
+              <w:jc w:val="left"/>
+            </w:pPr>
+            <w:r/>
+            <w:r>
+              <w:rPr>
+                <w:rFonts w:ascii="Calibri" w:hAnsi="Calibri"/>
+                <w:b w:val="0"/>
+                <w:color w:val="000000"/>
+                <w:sz w:val="17"/>
+              </w:rPr>
+              <w:t>Random Forest</w:t>
+            </w:r>
+          </w:p>
+        </w:tc>
+        <w:tc>
+          <w:tcPr>
+            <w:tcW w:type="dxa" w:w="1260"/>
+            <w:tcMar>
+              <w:top w:w="80" w:type="dxa"/>
+              <w:start w:w="120" w:type="dxa"/>
+              <w:bottom w:w="80" w:type="dxa"/>
+              <w:end w:w="120" w:type="dxa"/>
+            </w:tcMar>
+            <w:vAlign w:val="center"/>
+          </w:tcPr>
+          <w:p>
+            <w:pPr>
+              <w:pStyle w:val="TableText"/>
+              <w:jc w:val="center"/>
+            </w:pPr>
+            <w:r/>
+            <w:r>
+              <w:rPr>
+                <w:rFonts w:ascii="Calibri" w:hAnsi="Calibri"/>
+                <w:b w:val="0"/>
+                <w:color w:val="000000"/>
+                <w:sz w:val="17"/>
+              </w:rPr>
+              <w:t>0.673</w:t>
+            </w:r>
+          </w:p>
+        </w:tc>
+        <w:tc>
+          <w:tcPr>
+            <w:tcW w:type="dxa" w:w="1260"/>
+            <w:tcMar>
+              <w:top w:w="80" w:type="dxa"/>
+              <w:start w:w="120" w:type="dxa"/>
+              <w:bottom w:w="80" w:type="dxa"/>
+              <w:end w:w="120" w:type="dxa"/>
+            </w:tcMar>
+            <w:vAlign w:val="center"/>
+          </w:tcPr>
+          <w:p>
+            <w:pPr>
+              <w:pStyle w:val="TableText"/>
+              <w:jc w:val="center"/>
+            </w:pPr>
+            <w:r/>
+            <w:r>
+              <w:rPr>
+                <w:rFonts w:ascii="Calibri" w:hAnsi="Calibri"/>
+                <w:b w:val="0"/>
+                <w:color w:val="000000"/>
+                <w:sz w:val="17"/>
+              </w:rPr>
+              <w:t>0.228</w:t>
+            </w:r>
+          </w:p>
+        </w:tc>
+        <w:tc>
+          <w:tcPr>
+            <w:tcW w:type="dxa" w:w="1260"/>
+            <w:tcMar>
+              <w:top w:w="80" w:type="dxa"/>
+              <w:start w:w="120" w:type="dxa"/>
+              <w:bottom w:w="80" w:type="dxa"/>
+              <w:end w:w="120" w:type="dxa"/>
+            </w:tcMar>
+            <w:vAlign w:val="center"/>
+          </w:tcPr>
+          <w:p>
+            <w:pPr>
+              <w:pStyle w:val="TableText"/>
+              <w:jc w:val="center"/>
+            </w:pPr>
+            <w:r/>
+            <w:r>
+              <w:rPr>
+                <w:rFonts w:ascii="Calibri" w:hAnsi="Calibri"/>
+                <w:b w:val="0"/>
+                <w:color w:val="000000"/>
+                <w:sz w:val="17"/>
+              </w:rPr>
+              <w:t>0.0960</w:t>
+            </w:r>
+          </w:p>
+        </w:tc>
+        <w:tc>
+          <w:tcPr>
+            <w:tcW w:type="dxa" w:w="1260"/>
+            <w:tcMar>
+              <w:top w:w="80" w:type="dxa"/>
+              <w:start w:w="120" w:type="dxa"/>
+              <w:bottom w:w="80" w:type="dxa"/>
+              <w:end w:w="120" w:type="dxa"/>
+            </w:tcMar>
+            <w:vAlign w:val="center"/>
+          </w:tcPr>
+          <w:p>
+            <w:pPr>
+              <w:pStyle w:val="TableText"/>
+              <w:jc w:val="center"/>
+            </w:pPr>
+            <w:r/>
+            <w:r>
+              <w:rPr>
+                <w:rFonts w:ascii="Calibri" w:hAnsi="Calibri"/>
+                <w:b w:val="0"/>
+                <w:color w:val="000000"/>
+                <w:sz w:val="17"/>
+              </w:rPr>
+              <w:t>0.3339</w:t>
+            </w:r>
+          </w:p>
+        </w:tc>
+        <w:tc>
+          <w:tcPr>
+            <w:tcW w:type="dxa" w:w="1260"/>
+            <w:tcMar>
+              <w:top w:w="80" w:type="dxa"/>
+              <w:start w:w="120" w:type="dxa"/>
+              <w:bottom w:w="80" w:type="dxa"/>
+              <w:end w:w="120" w:type="dxa"/>
+            </w:tcMar>
+            <w:vAlign w:val="center"/>
+          </w:tcPr>
+          <w:p>
+            <w:pPr>
+              <w:pStyle w:val="TableText"/>
+              <w:jc w:val="center"/>
+            </w:pPr>
+            <w:r/>
+            <w:r>
+              <w:rPr>
+                <w:rFonts w:ascii="Calibri" w:hAnsi="Calibri"/>
+                <w:b w:val="0"/>
+                <w:color w:val="000000"/>
+                <w:sz w:val="17"/>
+              </w:rPr>
+              <w:t>1.020</w:t>
+            </w:r>
+          </w:p>
+        </w:tc>
+        <w:tc>
+          <w:tcPr>
+            <w:tcW w:type="dxa" w:w="1260"/>
+            <w:tcMar>
+              <w:top w:w="80" w:type="dxa"/>
+              <w:start w:w="120" w:type="dxa"/>
+              <w:bottom w:w="80" w:type="dxa"/>
+              <w:end w:w="120" w:type="dxa"/>
+            </w:tcMar>
+            <w:vAlign w:val="center"/>
+          </w:tcPr>
+          <w:p>
+            <w:pPr>
+              <w:pStyle w:val="TableText"/>
+              <w:jc w:val="center"/>
+            </w:pPr>
+            <w:r/>
+            <w:r>
+              <w:rPr>
+                <w:rFonts w:ascii="Calibri" w:hAnsi="Calibri"/>
+                <w:b w:val="0"/>
+                <w:color w:val="000000"/>
+                <w:sz w:val="17"/>
+              </w:rPr>
+              <w:t>0.0047</w:t>
+            </w:r>
+          </w:p>
+        </w:tc>
+      </w:tr>
+      <w:tr>
+        <w:trPr>
+          <w:cantSplit w:val="true"/>
+        </w:trPr>
+        <w:tc>
+          <w:tcPr>
+            <w:tcW w:type="dxa" w:w="1800"/>
+            <w:tcMar>
+              <w:top w:w="80" w:type="dxa"/>
+              <w:start w:w="120" w:type="dxa"/>
+              <w:bottom w:w="80" w:type="dxa"/>
+              <w:end w:w="120" w:type="dxa"/>
+            </w:tcMar>
+            <w:vAlign w:val="center"/>
+          </w:tcPr>
+          <w:p>
+            <w:pPr>
+              <w:pStyle w:val="TableText"/>
+              <w:jc w:val="left"/>
+            </w:pPr>
+            <w:r/>
+            <w:r>
+              <w:rPr>
+                <w:rFonts w:ascii="Calibri" w:hAnsi="Calibri"/>
+                <w:b w:val="0"/>
+                <w:color w:val="000000"/>
+                <w:sz w:val="17"/>
+              </w:rPr>
+              <w:t>Logistic Regression</w:t>
+            </w:r>
+          </w:p>
+        </w:tc>
+        <w:tc>
+          <w:tcPr>
+            <w:tcW w:type="dxa" w:w="1260"/>
+            <w:tcMar>
+              <w:top w:w="80" w:type="dxa"/>
+              <w:start w:w="120" w:type="dxa"/>
+              <w:bottom w:w="80" w:type="dxa"/>
+              <w:end w:w="120" w:type="dxa"/>
+            </w:tcMar>
+            <w:vAlign w:val="center"/>
+          </w:tcPr>
+          <w:p>
+            <w:pPr>
+              <w:pStyle w:val="TableText"/>
+              <w:jc w:val="center"/>
+            </w:pPr>
+            <w:r/>
+            <w:r>
+              <w:rPr>
+                <w:rFonts w:ascii="Calibri" w:hAnsi="Calibri"/>
+                <w:b w:val="0"/>
+                <w:color w:val="000000"/>
+                <w:sz w:val="17"/>
+              </w:rPr>
+              <w:t>0.661</w:t>
+            </w:r>
+          </w:p>
+        </w:tc>
+        <w:tc>
+          <w:tcPr>
+            <w:tcW w:type="dxa" w:w="1260"/>
+            <w:tcMar>
+              <w:top w:w="80" w:type="dxa"/>
+              <w:start w:w="120" w:type="dxa"/>
+              <w:bottom w:w="80" w:type="dxa"/>
+              <w:end w:w="120" w:type="dxa"/>
+            </w:tcMar>
+            <w:vAlign w:val="center"/>
+          </w:tcPr>
+          <w:p>
+            <w:pPr>
+              <w:pStyle w:val="TableText"/>
+              <w:jc w:val="center"/>
+            </w:pPr>
+            <w:r/>
+            <w:r>
+              <w:rPr>
+                <w:rFonts w:ascii="Calibri" w:hAnsi="Calibri"/>
+                <w:b w:val="0"/>
+                <w:color w:val="000000"/>
+                <w:sz w:val="17"/>
+              </w:rPr>
+              <w:t>0.201</w:t>
+            </w:r>
+          </w:p>
+        </w:tc>
+        <w:tc>
+          <w:tcPr>
+            <w:tcW w:type="dxa" w:w="1260"/>
+            <w:tcMar>
+              <w:top w:w="80" w:type="dxa"/>
+              <w:start w:w="120" w:type="dxa"/>
+              <w:bottom w:w="80" w:type="dxa"/>
+              <w:end w:w="120" w:type="dxa"/>
+            </w:tcMar>
+            <w:vAlign w:val="center"/>
+          </w:tcPr>
+          <w:p>
+            <w:pPr>
+              <w:pStyle w:val="TableText"/>
+              <w:jc w:val="center"/>
+            </w:pPr>
+            <w:r/>
+            <w:r>
+              <w:rPr>
+                <w:rFonts w:ascii="Calibri" w:hAnsi="Calibri"/>
+                <w:b w:val="0"/>
+                <w:color w:val="000000"/>
+                <w:sz w:val="17"/>
+              </w:rPr>
+              <w:t>0.0971</w:t>
+            </w:r>
+          </w:p>
+        </w:tc>
+        <w:tc>
+          <w:tcPr>
+            <w:tcW w:type="dxa" w:w="1260"/>
+            <w:tcMar>
+              <w:top w:w="80" w:type="dxa"/>
+              <w:start w:w="120" w:type="dxa"/>
+              <w:bottom w:w="80" w:type="dxa"/>
+              <w:end w:w="120" w:type="dxa"/>
+            </w:tcMar>
+            <w:vAlign w:val="center"/>
+          </w:tcPr>
+          <w:p>
+            <w:pPr>
+              <w:pStyle w:val="TableText"/>
+              <w:jc w:val="center"/>
+            </w:pPr>
+            <w:r/>
+            <w:r>
+              <w:rPr>
+                <w:rFonts w:ascii="Calibri" w:hAnsi="Calibri"/>
+                <w:b w:val="0"/>
+                <w:color w:val="000000"/>
+                <w:sz w:val="17"/>
+              </w:rPr>
+              <w:t>0.3377</w:t>
+            </w:r>
+          </w:p>
+        </w:tc>
+        <w:tc>
+          <w:tcPr>
+            <w:tcW w:type="dxa" w:w="1260"/>
+            <w:tcMar>
+              <w:top w:w="80" w:type="dxa"/>
+              <w:start w:w="120" w:type="dxa"/>
+              <w:bottom w:w="80" w:type="dxa"/>
+              <w:end w:w="120" w:type="dxa"/>
+            </w:tcMar>
+            <w:vAlign w:val="center"/>
+          </w:tcPr>
+          <w:p>
+            <w:pPr>
+              <w:pStyle w:val="TableText"/>
+              <w:jc w:val="center"/>
+            </w:pPr>
+            <w:r/>
+            <w:r>
+              <w:rPr>
+                <w:rFonts w:ascii="Calibri" w:hAnsi="Calibri"/>
+                <w:b w:val="0"/>
+                <w:color w:val="000000"/>
+                <w:sz w:val="17"/>
+              </w:rPr>
+              <w:t>0.979</w:t>
+            </w:r>
+          </w:p>
+        </w:tc>
+        <w:tc>
+          <w:tcPr>
+            <w:tcW w:type="dxa" w:w="1260"/>
+            <w:tcMar>
+              <w:top w:w="80" w:type="dxa"/>
+              <w:start w:w="120" w:type="dxa"/>
+              <w:bottom w:w="80" w:type="dxa"/>
+              <w:end w:w="120" w:type="dxa"/>
+            </w:tcMar>
+            <w:vAlign w:val="center"/>
+          </w:tcPr>
+          <w:p>
+            <w:pPr>
+              <w:pStyle w:val="TableText"/>
+              <w:jc w:val="center"/>
+            </w:pPr>
+            <w:r/>
+            <w:r>
+              <w:rPr>
+                <w:rFonts w:ascii="Calibri" w:hAnsi="Calibri"/>
+                <w:b w:val="0"/>
+                <w:color w:val="000000"/>
+                <w:sz w:val="17"/>
+              </w:rPr>
+              <w:t>0.0070</w:t>
+            </w:r>
+          </w:p>
+        </w:tc>
+      </w:tr>
+    </w:tbl>
+    <w:p>
+      <w:pPr>
+        <w:spacing w:after="40"/>
+        <w:jc w:val="left"/>
+      </w:pPr>
+    </w:p>
+    <w:p>
+      <w:pPr>
+        <w:jc w:val="left"/>
+      </w:pPr>
+      <w:r>
+        <w:rPr>
+          <w:rFonts w:ascii="Calibri" w:hAnsi="Calibri"/>
+          <w:color w:val="000000"/>
+        </w:rPr>
+        <w:t>Development OOF Brier score selected sigmoid-calibrated LightGBM. Its 95% patient-cluster intervals were 0.667-0.691 for AUROC, 0.213-0.245 for average precision, and 0.0918-0.0992 for Brier score. None of the four tree families differed from another after metric-wise Holm correction. Each tree family did improve over Logistic Regression across the four artifact-ablation metrics after correction; these are development comparisons, not final superiority claims.</w:t>
+      </w:r>
+    </w:p>
+    <w:p>
+      <w:pPr>
+        <w:jc w:val="left"/>
+      </w:pPr>
+      <w:r>
+        <w:rPr>
+          <w:rFonts w:ascii="Calibri" w:hAnsi="Calibri"/>
+          <w:color w:val="000000"/>
+        </w:rPr>
+        <w:t>The router retained LightGBM for the full 46-feature and nine-feature admission-clinical panels, and selected Random Forest for the nine-feature encounter-utilization, five-feature prior-utilization, and two-feature minimal-history panels. Full-panel Brier was 0.0958; reduced-panel Brier ranged from 0.0982 to 0.0994. At 80% full-panel selective coverage, accepted prevalence fell to 7.62% while rejected prevalence rose to 26.45%, demonstrating substantial case-mix shift. Prespecified age, sex, and race estimates were generated, with small cells suppressed. Held-out SHAP for the selected LightGBM model ranked prior inpatient encounters and discharge disposition highest; maximum additive reconstruction error was 1.2e-14. These findings describe internal development behavior and do not establish clinical utility or external validity.</w:t>
       </w:r>
     </w:p>
     <w:p>
@@ -5091,7 +6393,19 @@
           <w:rFonts w:ascii="Calibri" w:hAnsi="Calibri"/>
           <w:color w:val="000000"/>
         </w:rPr>
-        <w:t>The study has important limitations. All primary datasets are public and mostly cross-sectional; they do not measure future incidence or age of onset. PIDD and Sylhet are small, and public benchmark reuse limits transportability. BRFSS uses self-reported status and requires careful survey-design interpretation. The current selective score is a baseline rather than an optimized clinical deferral policy. No matched cohort contains all PIDD, Sylhet, and BRFSS attributes for the same individuals, so mixed-input routing is not efficacy-validated fusion. External or temporal validation remains necessary for clinical-generalization claims.</w:t>
+        <w:t>The separate Hospital130 analysis reached a similar methodological conclusion: tree-family performance was close, reduced panels degraded probability quality, and certainty-based deferral preferentially rejected higher-risk encounters. It supports the pipeline's endpoint and applicability safeguards, not a diabetes- status claim and not a clinically validated readmission tool.</w:t>
+      </w:r>
+    </w:p>
+    <w:p>
+      <w:pPr>
+        <w:jc w:val="left"/>
+      </w:pPr>
+      <w:r>
+        <w:rPr>
+          <w:rFonts w:ascii="Calibri" w:hAnsi="Calibri"/>
+          <w:color w:val="000000"/>
+        </w:rPr>
+        <w:t>The study has important limitations. All primary datasets are public and mostly cross-sectional; they do not measure future incidence or age of onset. PIDD and Sylhet are small, and public benchmark reuse limits transportability. BRFSS uses self-reported status and requires careful survey-design interpretation. The current selective score is a baseline rather than an optimized clinical deferral policy. Hospital130 is retrospective, lacks external or temporal validation, and its development-test outcomes have been inspected. No matched cohort contains all PIDD, Sylhet, and BRFSS attributes for the same individuals, so mixed-input routing is not efficacy-validated fusion. External or temporal validation remains necessary for clinical-generalization claims.</w:t>
       </w:r>
     </w:p>
     <w:p>
@@ -5230,7 +6544,7 @@
     </w:p>
     <w:p>
       <w:pPr>
-        <w:spacing w:after="80" w:line="264" w:lineRule="auto"/>
+        <w:spacing w:after="20" w:line="240" w:lineRule="auto"/>
         <w:ind w:left="720" w:hanging="360"/>
         <w:jc w:val="left"/>
         <w:numPr>
@@ -5242,13 +6556,14 @@
         <w:rPr>
           <w:rFonts w:ascii="Calibri" w:hAnsi="Calibri"/>
           <w:color w:val="000000"/>
+          <w:sz w:val="20"/>
         </w:rPr>
         <w:t>TRIPOD+AI statement. BMJ. 2024;385:e078378.</w:t>
       </w:r>
     </w:p>
     <w:p>
       <w:pPr>
-        <w:spacing w:after="80" w:line="264" w:lineRule="auto"/>
+        <w:spacing w:after="20" w:line="240" w:lineRule="auto"/>
         <w:ind w:left="720" w:hanging="360"/>
         <w:jc w:val="left"/>
         <w:numPr>
@@ -5260,13 +6575,14 @@
         <w:rPr>
           <w:rFonts w:ascii="Calibri" w:hAnsi="Calibri"/>
           <w:color w:val="000000"/>
+          <w:sz w:val="20"/>
         </w:rPr>
         <w:t>PROBAST+AI. BMJ. 2025;388:e082505.</w:t>
       </w:r>
     </w:p>
     <w:p>
       <w:pPr>
-        <w:spacing w:after="80" w:line="264" w:lineRule="auto"/>
+        <w:spacing w:after="20" w:line="240" w:lineRule="auto"/>
         <w:ind w:left="720" w:hanging="360"/>
         <w:jc w:val="left"/>
         <w:numPr>
@@ -5278,13 +6594,14 @@
         <w:rPr>
           <w:rFonts w:ascii="Calibri" w:hAnsi="Calibri"/>
           <w:color w:val="000000"/>
+          <w:sz w:val="20"/>
         </w:rPr>
         <w:t>Evaluation of clinical prediction models, part 2. BMJ. 2024;384:e074820.</w:t>
       </w:r>
     </w:p>
     <w:p>
       <w:pPr>
-        <w:spacing w:after="80" w:line="264" w:lineRule="auto"/>
+        <w:spacing w:after="20" w:line="240" w:lineRule="auto"/>
         <w:ind w:left="720" w:hanging="360"/>
         <w:jc w:val="left"/>
         <w:numPr>
@@ -5296,13 +6613,14 @@
         <w:rPr>
           <w:rFonts w:ascii="Calibri" w:hAnsi="Calibri"/>
           <w:color w:val="000000"/>
+          <w:sz w:val="20"/>
         </w:rPr>
         <w:t>Vickers AJ, Elkin EB. Decision curve analysis. Med Decis Making. 2006.</w:t>
       </w:r>
     </w:p>
     <w:p>
       <w:pPr>
-        <w:spacing w:after="80" w:line="264" w:lineRule="auto"/>
+        <w:spacing w:after="20" w:line="240" w:lineRule="auto"/>
         <w:ind w:left="720" w:hanging="360"/>
         <w:jc w:val="left"/>
         <w:numPr>
@@ -5314,13 +6632,14 @@
         <w:rPr>
           <w:rFonts w:ascii="Calibri" w:hAnsi="Calibri"/>
           <w:color w:val="000000"/>
+          <w:sz w:val="20"/>
         </w:rPr>
         <w:t>UCI Machine Learning Repository. Early Stage Diabetes Risk Prediction dataset.</w:t>
       </w:r>
     </w:p>
     <w:p>
       <w:pPr>
-        <w:spacing w:after="80" w:line="264" w:lineRule="auto"/>
+        <w:spacing w:after="20" w:line="240" w:lineRule="auto"/>
         <w:ind w:left="720" w:hanging="360"/>
         <w:jc w:val="left"/>
         <w:numPr>
@@ -5332,13 +6651,14 @@
         <w:rPr>
           <w:rFonts w:ascii="Calibri" w:hAnsi="Calibri"/>
           <w:color w:val="000000"/>
+          <w:sz w:val="20"/>
         </w:rPr>
         <w:t>Handling missing predictor values when validating and applying a prediction model. BMC Med Res Methodol. 2020.</w:t>
       </w:r>
     </w:p>
     <w:p>
       <w:pPr>
-        <w:spacing w:after="80" w:line="264" w:lineRule="auto"/>
+        <w:spacing w:after="20" w:line="240" w:lineRule="auto"/>
         <w:ind w:left="720" w:hanging="360"/>
         <w:jc w:val="left"/>
         <w:numPr>
@@ -5350,13 +6670,14 @@
         <w:rPr>
           <w:rFonts w:ascii="Calibri" w:hAnsi="Calibri"/>
           <w:color w:val="000000"/>
+          <w:sz w:val="20"/>
         </w:rPr>
         <w:t>Missing data and prediction: the pattern submodel. Biostat Epidemiol. 2021.</w:t>
       </w:r>
     </w:p>
     <w:p>
       <w:pPr>
-        <w:spacing w:after="80" w:line="264" w:lineRule="auto"/>
+        <w:spacing w:after="20" w:line="240" w:lineRule="auto"/>
         <w:ind w:left="720" w:hanging="360"/>
         <w:jc w:val="left"/>
         <w:numPr>
@@ -5368,13 +6689,14 @@
         <w:rPr>
           <w:rFonts w:ascii="Calibri" w:hAnsi="Calibri"/>
           <w:color w:val="000000"/>
+          <w:sz w:val="20"/>
         </w:rPr>
         <w:t>Real-time imputation of missing predictor values in clinical practice. J Clin Epidemiol. 2022.</w:t>
       </w:r>
     </w:p>
     <w:p>
       <w:pPr>
-        <w:spacing w:after="80" w:line="264" w:lineRule="auto"/>
+        <w:spacing w:after="20" w:line="240" w:lineRule="auto"/>
         <w:ind w:left="720" w:hanging="360"/>
         <w:jc w:val="left"/>
         <w:numPr>
@@ -5386,13 +6708,14 @@
         <w:rPr>
           <w:rFonts w:ascii="Calibri" w:hAnsi="Calibri"/>
           <w:color w:val="000000"/>
+          <w:sz w:val="20"/>
         </w:rPr>
         <w:t>Building type 2 diabetes prediction models using the 2014 BRFSS. Prev Chronic Dis. 2019.</w:t>
       </w:r>
     </w:p>
     <w:p>
       <w:pPr>
-        <w:spacing w:after="80" w:line="264" w:lineRule="auto"/>
+        <w:spacing w:after="20" w:line="240" w:lineRule="auto"/>
         <w:ind w:left="720" w:hanging="360"/>
         <w:jc w:val="left"/>
         <w:numPr>
@@ -5404,6 +6727,7 @@
         <w:rPr>
           <w:rFonts w:ascii="Calibri" w:hAnsi="Calibri"/>
           <w:color w:val="000000"/>
+          <w:sz w:val="20"/>
         </w:rPr>
         <w:t>Original PIDD/ADAP study and dataset provenance record.</w:t>
       </w:r>

</xml_diff>